<commit_message>
revise the paper according to comments
</commit_message>
<xml_diff>
--- a/code/Bilingualism_and_Dementia_Meta-analysis.docx
+++ b/code/Bilingualism_and_Dementia_Meta-analysis.docx
@@ -7,7 +7,55 @@
         <w:pStyle w:val="Title"/>
       </w:pPr>
       <w:r>
-        <w:t xml:space="preserve">Bilingualism Effect for Delaying Dementia Onset: A Bayesian Meta-Analysis</w:t>
+        <w:t xml:space="preserve">Bilingualism</w:t>
+      </w:r>
+      <w:r>
+        <w:t xml:space="preserve"> </w:t>
+      </w:r>
+      <w:r>
+        <w:t xml:space="preserve">Effect</w:t>
+      </w:r>
+      <w:r>
+        <w:t xml:space="preserve"> </w:t>
+      </w:r>
+      <w:r>
+        <w:t xml:space="preserve">for</w:t>
+      </w:r>
+      <w:r>
+        <w:t xml:space="preserve"> </w:t>
+      </w:r>
+      <w:r>
+        <w:t xml:space="preserve">Delaying</w:t>
+      </w:r>
+      <w:r>
+        <w:t xml:space="preserve"> </w:t>
+      </w:r>
+      <w:r>
+        <w:t xml:space="preserve">Dementia</w:t>
+      </w:r>
+      <w:r>
+        <w:t xml:space="preserve"> </w:t>
+      </w:r>
+      <w:r>
+        <w:t xml:space="preserve">Onset:</w:t>
+      </w:r>
+      <w:r>
+        <w:t xml:space="preserve"> </w:t>
+      </w:r>
+      <w:r>
+        <w:t xml:space="preserve">A</w:t>
+      </w:r>
+      <w:r>
+        <w:t xml:space="preserve"> </w:t>
+      </w:r>
+      <w:r>
+        <w:t xml:space="preserve">Bayesian</w:t>
+      </w:r>
+      <w:r>
+        <w:t xml:space="preserve"> </w:t>
+      </w:r>
+      <w:r>
+        <w:t xml:space="preserve">Meta-Analysis</w:t>
       </w:r>
     </w:p>
     <w:p>
@@ -15,7 +63,13 @@
         <w:pStyle w:val="Author"/>
       </w:pPr>
       <w:r>
-        <w:t xml:space="preserve">Ziyuan Li</w:t>
+        <w:t xml:space="preserve">Ziyuan</w:t>
+      </w:r>
+      <w:r>
+        <w:t xml:space="preserve"> </w:t>
+      </w:r>
+      <w:r>
+        <w:t xml:space="preserve">Li</w:t>
       </w:r>
     </w:p>
     <w:p>
@@ -23,7 +77,13 @@
         <w:pStyle w:val="Author"/>
       </w:pPr>
       <w:r>
-        <w:t xml:space="preserve">Stefano Coretta</w:t>
+        <w:t xml:space="preserve">Stefano</w:t>
+      </w:r>
+      <w:r>
+        <w:t xml:space="preserve"> </w:t>
+      </w:r>
+      <w:r>
+        <w:t xml:space="preserve">Coretta</w:t>
       </w:r>
     </w:p>
     <w:p>
@@ -47,7 +107,1135 @@
         <w:pStyle w:val="Abstract"/>
       </w:pPr>
       <w:r>
-        <w:t xml:space="preserve">Evidence suggests that lifelong practice of two or more languages may contribute to cognitive reserve and protect against dementia. Most retrospective studies that compared bilinguals’ and monolinguals’ age at dementia onset revealed a delay for bilinguals. However, other retrospective studies point out that such protective effects of bilingualism are specific to some types of dementia but not others. Some prospective studies which investigated whether bilingualism reduces the incidence rate of dementia produced null results. Therefore, we conducted the first Bayesian meta-analysis to examine the relationship between bilingualism and age at onset of dementia and bilingualism and the incidence rate of dementia respectively. The results from 18 age at onset studies revealed that bilinguals were 3.45 years older than monolinguals when having the first symptom onset (95% credible interval (Crl): [2.8, 4.1]). Moreover, the result was only slightly influenced by years of education, although it is relatively uncertain about the effect of education on dementia. The results from 6 incidence rate studies did not provide robust evidence for bilingualism’s preventive effect. Therefore, this meta-analysis demonstrated that bilingualism has potential effects in delaying the onset of dementia but not preventing it.</w:t>
+        <w:t xml:space="preserve">Evidence</w:t>
+      </w:r>
+      <w:r>
+        <w:t xml:space="preserve"> </w:t>
+      </w:r>
+      <w:r>
+        <w:t xml:space="preserve">suggests</w:t>
+      </w:r>
+      <w:r>
+        <w:t xml:space="preserve"> </w:t>
+      </w:r>
+      <w:r>
+        <w:t xml:space="preserve">that</w:t>
+      </w:r>
+      <w:r>
+        <w:t xml:space="preserve"> </w:t>
+      </w:r>
+      <w:r>
+        <w:t xml:space="preserve">lifelong</w:t>
+      </w:r>
+      <w:r>
+        <w:t xml:space="preserve"> </w:t>
+      </w:r>
+      <w:r>
+        <w:t xml:space="preserve">practice</w:t>
+      </w:r>
+      <w:r>
+        <w:t xml:space="preserve"> </w:t>
+      </w:r>
+      <w:r>
+        <w:t xml:space="preserve">of</w:t>
+      </w:r>
+      <w:r>
+        <w:t xml:space="preserve"> </w:t>
+      </w:r>
+      <w:r>
+        <w:t xml:space="preserve">two</w:t>
+      </w:r>
+      <w:r>
+        <w:t xml:space="preserve"> </w:t>
+      </w:r>
+      <w:r>
+        <w:t xml:space="preserve">or</w:t>
+      </w:r>
+      <w:r>
+        <w:t xml:space="preserve"> </w:t>
+      </w:r>
+      <w:r>
+        <w:t xml:space="preserve">more</w:t>
+      </w:r>
+      <w:r>
+        <w:t xml:space="preserve"> </w:t>
+      </w:r>
+      <w:r>
+        <w:t xml:space="preserve">languages</w:t>
+      </w:r>
+      <w:r>
+        <w:t xml:space="preserve"> </w:t>
+      </w:r>
+      <w:r>
+        <w:t xml:space="preserve">may</w:t>
+      </w:r>
+      <w:r>
+        <w:t xml:space="preserve"> </w:t>
+      </w:r>
+      <w:r>
+        <w:t xml:space="preserve">contribute</w:t>
+      </w:r>
+      <w:r>
+        <w:t xml:space="preserve"> </w:t>
+      </w:r>
+      <w:r>
+        <w:t xml:space="preserve">to</w:t>
+      </w:r>
+      <w:r>
+        <w:t xml:space="preserve"> </w:t>
+      </w:r>
+      <w:r>
+        <w:t xml:space="preserve">cognitive</w:t>
+      </w:r>
+      <w:r>
+        <w:t xml:space="preserve"> </w:t>
+      </w:r>
+      <w:r>
+        <w:t xml:space="preserve">reserve</w:t>
+      </w:r>
+      <w:r>
+        <w:t xml:space="preserve"> </w:t>
+      </w:r>
+      <w:r>
+        <w:t xml:space="preserve">and</w:t>
+      </w:r>
+      <w:r>
+        <w:t xml:space="preserve"> </w:t>
+      </w:r>
+      <w:r>
+        <w:t xml:space="preserve">protect</w:t>
+      </w:r>
+      <w:r>
+        <w:t xml:space="preserve"> </w:t>
+      </w:r>
+      <w:r>
+        <w:t xml:space="preserve">against</w:t>
+      </w:r>
+      <w:r>
+        <w:t xml:space="preserve"> </w:t>
+      </w:r>
+      <w:r>
+        <w:t xml:space="preserve">dementia.</w:t>
+      </w:r>
+      <w:r>
+        <w:t xml:space="preserve"> </w:t>
+      </w:r>
+      <w:r>
+        <w:t xml:space="preserve">Most</w:t>
+      </w:r>
+      <w:r>
+        <w:t xml:space="preserve"> </w:t>
+      </w:r>
+      <w:r>
+        <w:t xml:space="preserve">retrospective</w:t>
+      </w:r>
+      <w:r>
+        <w:t xml:space="preserve"> </w:t>
+      </w:r>
+      <w:r>
+        <w:t xml:space="preserve">studies</w:t>
+      </w:r>
+      <w:r>
+        <w:t xml:space="preserve"> </w:t>
+      </w:r>
+      <w:r>
+        <w:t xml:space="preserve">that</w:t>
+      </w:r>
+      <w:r>
+        <w:t xml:space="preserve"> </w:t>
+      </w:r>
+      <w:r>
+        <w:t xml:space="preserve">compared</w:t>
+      </w:r>
+      <w:r>
+        <w:t xml:space="preserve"> </w:t>
+      </w:r>
+      <w:r>
+        <w:t xml:space="preserve">bilinguals’</w:t>
+      </w:r>
+      <w:r>
+        <w:t xml:space="preserve"> </w:t>
+      </w:r>
+      <w:r>
+        <w:t xml:space="preserve">and</w:t>
+      </w:r>
+      <w:r>
+        <w:t xml:space="preserve"> </w:t>
+      </w:r>
+      <w:r>
+        <w:t xml:space="preserve">monolinguals’</w:t>
+      </w:r>
+      <w:r>
+        <w:t xml:space="preserve"> </w:t>
+      </w:r>
+      <w:r>
+        <w:t xml:space="preserve">age</w:t>
+      </w:r>
+      <w:r>
+        <w:t xml:space="preserve"> </w:t>
+      </w:r>
+      <w:r>
+        <w:t xml:space="preserve">at</w:t>
+      </w:r>
+      <w:r>
+        <w:t xml:space="preserve"> </w:t>
+      </w:r>
+      <w:r>
+        <w:t xml:space="preserve">dementia</w:t>
+      </w:r>
+      <w:r>
+        <w:t xml:space="preserve"> </w:t>
+      </w:r>
+      <w:r>
+        <w:t xml:space="preserve">onset</w:t>
+      </w:r>
+      <w:r>
+        <w:t xml:space="preserve"> </w:t>
+      </w:r>
+      <w:r>
+        <w:t xml:space="preserve">revealed</w:t>
+      </w:r>
+      <w:r>
+        <w:t xml:space="preserve"> </w:t>
+      </w:r>
+      <w:r>
+        <w:t xml:space="preserve">a</w:t>
+      </w:r>
+      <w:r>
+        <w:t xml:space="preserve"> </w:t>
+      </w:r>
+      <w:r>
+        <w:t xml:space="preserve">delay</w:t>
+      </w:r>
+      <w:r>
+        <w:t xml:space="preserve"> </w:t>
+      </w:r>
+      <w:r>
+        <w:t xml:space="preserve">for</w:t>
+      </w:r>
+      <w:r>
+        <w:t xml:space="preserve"> </w:t>
+      </w:r>
+      <w:r>
+        <w:t xml:space="preserve">bilinguals.</w:t>
+      </w:r>
+      <w:r>
+        <w:t xml:space="preserve"> </w:t>
+      </w:r>
+      <w:r>
+        <w:t xml:space="preserve">However,</w:t>
+      </w:r>
+      <w:r>
+        <w:t xml:space="preserve"> </w:t>
+      </w:r>
+      <w:r>
+        <w:t xml:space="preserve">other</w:t>
+      </w:r>
+      <w:r>
+        <w:t xml:space="preserve"> </w:t>
+      </w:r>
+      <w:r>
+        <w:t xml:space="preserve">retrospective</w:t>
+      </w:r>
+      <w:r>
+        <w:t xml:space="preserve"> </w:t>
+      </w:r>
+      <w:r>
+        <w:t xml:space="preserve">studies</w:t>
+      </w:r>
+      <w:r>
+        <w:t xml:space="preserve"> </w:t>
+      </w:r>
+      <w:r>
+        <w:t xml:space="preserve">point</w:t>
+      </w:r>
+      <w:r>
+        <w:t xml:space="preserve"> </w:t>
+      </w:r>
+      <w:r>
+        <w:t xml:space="preserve">out</w:t>
+      </w:r>
+      <w:r>
+        <w:t xml:space="preserve"> </w:t>
+      </w:r>
+      <w:r>
+        <w:t xml:space="preserve">that</w:t>
+      </w:r>
+      <w:r>
+        <w:t xml:space="preserve"> </w:t>
+      </w:r>
+      <w:r>
+        <w:t xml:space="preserve">such</w:t>
+      </w:r>
+      <w:r>
+        <w:t xml:space="preserve"> </w:t>
+      </w:r>
+      <w:r>
+        <w:t xml:space="preserve">protective</w:t>
+      </w:r>
+      <w:r>
+        <w:t xml:space="preserve"> </w:t>
+      </w:r>
+      <w:r>
+        <w:t xml:space="preserve">effects</w:t>
+      </w:r>
+      <w:r>
+        <w:t xml:space="preserve"> </w:t>
+      </w:r>
+      <w:r>
+        <w:t xml:space="preserve">of</w:t>
+      </w:r>
+      <w:r>
+        <w:t xml:space="preserve"> </w:t>
+      </w:r>
+      <w:r>
+        <w:t xml:space="preserve">bilingualism</w:t>
+      </w:r>
+      <w:r>
+        <w:t xml:space="preserve"> </w:t>
+      </w:r>
+      <w:r>
+        <w:t xml:space="preserve">are</w:t>
+      </w:r>
+      <w:r>
+        <w:t xml:space="preserve"> </w:t>
+      </w:r>
+      <w:r>
+        <w:t xml:space="preserve">specific</w:t>
+      </w:r>
+      <w:r>
+        <w:t xml:space="preserve"> </w:t>
+      </w:r>
+      <w:r>
+        <w:t xml:space="preserve">to</w:t>
+      </w:r>
+      <w:r>
+        <w:t xml:space="preserve"> </w:t>
+      </w:r>
+      <w:r>
+        <w:t xml:space="preserve">some</w:t>
+      </w:r>
+      <w:r>
+        <w:t xml:space="preserve"> </w:t>
+      </w:r>
+      <w:r>
+        <w:t xml:space="preserve">types</w:t>
+      </w:r>
+      <w:r>
+        <w:t xml:space="preserve"> </w:t>
+      </w:r>
+      <w:r>
+        <w:t xml:space="preserve">of</w:t>
+      </w:r>
+      <w:r>
+        <w:t xml:space="preserve"> </w:t>
+      </w:r>
+      <w:r>
+        <w:t xml:space="preserve">dementia</w:t>
+      </w:r>
+      <w:r>
+        <w:t xml:space="preserve"> </w:t>
+      </w:r>
+      <w:r>
+        <w:t xml:space="preserve">but</w:t>
+      </w:r>
+      <w:r>
+        <w:t xml:space="preserve"> </w:t>
+      </w:r>
+      <w:r>
+        <w:t xml:space="preserve">not</w:t>
+      </w:r>
+      <w:r>
+        <w:t xml:space="preserve"> </w:t>
+      </w:r>
+      <w:r>
+        <w:t xml:space="preserve">others.</w:t>
+      </w:r>
+      <w:r>
+        <w:t xml:space="preserve"> </w:t>
+      </w:r>
+      <w:r>
+        <w:t xml:space="preserve">Some</w:t>
+      </w:r>
+      <w:r>
+        <w:t xml:space="preserve"> </w:t>
+      </w:r>
+      <w:r>
+        <w:t xml:space="preserve">prospective</w:t>
+      </w:r>
+      <w:r>
+        <w:t xml:space="preserve"> </w:t>
+      </w:r>
+      <w:r>
+        <w:t xml:space="preserve">studies</w:t>
+      </w:r>
+      <w:r>
+        <w:t xml:space="preserve"> </w:t>
+      </w:r>
+      <w:r>
+        <w:t xml:space="preserve">which</w:t>
+      </w:r>
+      <w:r>
+        <w:t xml:space="preserve"> </w:t>
+      </w:r>
+      <w:r>
+        <w:t xml:space="preserve">investigated</w:t>
+      </w:r>
+      <w:r>
+        <w:t xml:space="preserve"> </w:t>
+      </w:r>
+      <w:r>
+        <w:t xml:space="preserve">whether</w:t>
+      </w:r>
+      <w:r>
+        <w:t xml:space="preserve"> </w:t>
+      </w:r>
+      <w:r>
+        <w:t xml:space="preserve">bilingualism</w:t>
+      </w:r>
+      <w:r>
+        <w:t xml:space="preserve"> </w:t>
+      </w:r>
+      <w:r>
+        <w:t xml:space="preserve">reduces</w:t>
+      </w:r>
+      <w:r>
+        <w:t xml:space="preserve"> </w:t>
+      </w:r>
+      <w:r>
+        <w:t xml:space="preserve">the</w:t>
+      </w:r>
+      <w:r>
+        <w:t xml:space="preserve"> </w:t>
+      </w:r>
+      <w:r>
+        <w:t xml:space="preserve">incidence</w:t>
+      </w:r>
+      <w:r>
+        <w:t xml:space="preserve"> </w:t>
+      </w:r>
+      <w:r>
+        <w:t xml:space="preserve">rate</w:t>
+      </w:r>
+      <w:r>
+        <w:t xml:space="preserve"> </w:t>
+      </w:r>
+      <w:r>
+        <w:t xml:space="preserve">of</w:t>
+      </w:r>
+      <w:r>
+        <w:t xml:space="preserve"> </w:t>
+      </w:r>
+      <w:r>
+        <w:t xml:space="preserve">dementia</w:t>
+      </w:r>
+      <w:r>
+        <w:t xml:space="preserve"> </w:t>
+      </w:r>
+      <w:r>
+        <w:t xml:space="preserve">produced</w:t>
+      </w:r>
+      <w:r>
+        <w:t xml:space="preserve"> </w:t>
+      </w:r>
+      <w:r>
+        <w:t xml:space="preserve">null</w:t>
+      </w:r>
+      <w:r>
+        <w:t xml:space="preserve"> </w:t>
+      </w:r>
+      <w:r>
+        <w:t xml:space="preserve">results.</w:t>
+      </w:r>
+      <w:r>
+        <w:t xml:space="preserve"> </w:t>
+      </w:r>
+      <w:r>
+        <w:t xml:space="preserve">Therefore,</w:t>
+      </w:r>
+      <w:r>
+        <w:t xml:space="preserve"> </w:t>
+      </w:r>
+      <w:r>
+        <w:t xml:space="preserve">we</w:t>
+      </w:r>
+      <w:r>
+        <w:t xml:space="preserve"> </w:t>
+      </w:r>
+      <w:r>
+        <w:t xml:space="preserve">conducted</w:t>
+      </w:r>
+      <w:r>
+        <w:t xml:space="preserve"> </w:t>
+      </w:r>
+      <w:r>
+        <w:t xml:space="preserve">the</w:t>
+      </w:r>
+      <w:r>
+        <w:t xml:space="preserve"> </w:t>
+      </w:r>
+      <w:r>
+        <w:t xml:space="preserve">first</w:t>
+      </w:r>
+      <w:r>
+        <w:t xml:space="preserve"> </w:t>
+      </w:r>
+      <w:r>
+        <w:t xml:space="preserve">Bayesian</w:t>
+      </w:r>
+      <w:r>
+        <w:t xml:space="preserve"> </w:t>
+      </w:r>
+      <w:r>
+        <w:t xml:space="preserve">meta-analysis</w:t>
+      </w:r>
+      <w:r>
+        <w:t xml:space="preserve"> </w:t>
+      </w:r>
+      <w:r>
+        <w:t xml:space="preserve">to</w:t>
+      </w:r>
+      <w:r>
+        <w:t xml:space="preserve"> </w:t>
+      </w:r>
+      <w:r>
+        <w:t xml:space="preserve">examine</w:t>
+      </w:r>
+      <w:r>
+        <w:t xml:space="preserve"> </w:t>
+      </w:r>
+      <w:r>
+        <w:t xml:space="preserve">the</w:t>
+      </w:r>
+      <w:r>
+        <w:t xml:space="preserve"> </w:t>
+      </w:r>
+      <w:r>
+        <w:t xml:space="preserve">relationship</w:t>
+      </w:r>
+      <w:r>
+        <w:t xml:space="preserve"> </w:t>
+      </w:r>
+      <w:r>
+        <w:t xml:space="preserve">between</w:t>
+      </w:r>
+      <w:r>
+        <w:t xml:space="preserve"> </w:t>
+      </w:r>
+      <w:r>
+        <w:t xml:space="preserve">bilingualism</w:t>
+      </w:r>
+      <w:r>
+        <w:t xml:space="preserve"> </w:t>
+      </w:r>
+      <w:r>
+        <w:t xml:space="preserve">and</w:t>
+      </w:r>
+      <w:r>
+        <w:t xml:space="preserve"> </w:t>
+      </w:r>
+      <w:r>
+        <w:t xml:space="preserve">age</w:t>
+      </w:r>
+      <w:r>
+        <w:t xml:space="preserve"> </w:t>
+      </w:r>
+      <w:r>
+        <w:t xml:space="preserve">at</w:t>
+      </w:r>
+      <w:r>
+        <w:t xml:space="preserve"> </w:t>
+      </w:r>
+      <w:r>
+        <w:t xml:space="preserve">onset</w:t>
+      </w:r>
+      <w:r>
+        <w:t xml:space="preserve"> </w:t>
+      </w:r>
+      <w:r>
+        <w:t xml:space="preserve">of</w:t>
+      </w:r>
+      <w:r>
+        <w:t xml:space="preserve"> </w:t>
+      </w:r>
+      <w:r>
+        <w:t xml:space="preserve">dementia</w:t>
+      </w:r>
+      <w:r>
+        <w:t xml:space="preserve"> </w:t>
+      </w:r>
+      <w:r>
+        <w:t xml:space="preserve">and</w:t>
+      </w:r>
+      <w:r>
+        <w:t xml:space="preserve"> </w:t>
+      </w:r>
+      <w:r>
+        <w:t xml:space="preserve">bilingualism</w:t>
+      </w:r>
+      <w:r>
+        <w:t xml:space="preserve"> </w:t>
+      </w:r>
+      <w:r>
+        <w:t xml:space="preserve">and</w:t>
+      </w:r>
+      <w:r>
+        <w:t xml:space="preserve"> </w:t>
+      </w:r>
+      <w:r>
+        <w:t xml:space="preserve">the</w:t>
+      </w:r>
+      <w:r>
+        <w:t xml:space="preserve"> </w:t>
+      </w:r>
+      <w:r>
+        <w:t xml:space="preserve">incidence</w:t>
+      </w:r>
+      <w:r>
+        <w:t xml:space="preserve"> </w:t>
+      </w:r>
+      <w:r>
+        <w:t xml:space="preserve">rate</w:t>
+      </w:r>
+      <w:r>
+        <w:t xml:space="preserve"> </w:t>
+      </w:r>
+      <w:r>
+        <w:t xml:space="preserve">of</w:t>
+      </w:r>
+      <w:r>
+        <w:t xml:space="preserve"> </w:t>
+      </w:r>
+      <w:r>
+        <w:t xml:space="preserve">dementia</w:t>
+      </w:r>
+      <w:r>
+        <w:t xml:space="preserve"> </w:t>
+      </w:r>
+      <w:r>
+        <w:t xml:space="preserve">respectively.</w:t>
+      </w:r>
+      <w:r>
+        <w:t xml:space="preserve"> </w:t>
+      </w:r>
+      <w:r>
+        <w:t xml:space="preserve">The</w:t>
+      </w:r>
+      <w:r>
+        <w:t xml:space="preserve"> </w:t>
+      </w:r>
+      <w:r>
+        <w:t xml:space="preserve">results</w:t>
+      </w:r>
+      <w:r>
+        <w:t xml:space="preserve"> </w:t>
+      </w:r>
+      <w:r>
+        <w:t xml:space="preserve">from</w:t>
+      </w:r>
+      <w:r>
+        <w:t xml:space="preserve"> </w:t>
+      </w:r>
+      <w:r>
+        <w:t xml:space="preserve">18</w:t>
+      </w:r>
+      <w:r>
+        <w:t xml:space="preserve"> </w:t>
+      </w:r>
+      <w:r>
+        <w:t xml:space="preserve">age</w:t>
+      </w:r>
+      <w:r>
+        <w:t xml:space="preserve"> </w:t>
+      </w:r>
+      <w:r>
+        <w:t xml:space="preserve">at</w:t>
+      </w:r>
+      <w:r>
+        <w:t xml:space="preserve"> </w:t>
+      </w:r>
+      <w:r>
+        <w:t xml:space="preserve">onset</w:t>
+      </w:r>
+      <w:r>
+        <w:t xml:space="preserve"> </w:t>
+      </w:r>
+      <w:r>
+        <w:t xml:space="preserve">studies</w:t>
+      </w:r>
+      <w:r>
+        <w:t xml:space="preserve"> </w:t>
+      </w:r>
+      <w:r>
+        <w:t xml:space="preserve">revealed</w:t>
+      </w:r>
+      <w:r>
+        <w:t xml:space="preserve"> </w:t>
+      </w:r>
+      <w:r>
+        <w:t xml:space="preserve">that</w:t>
+      </w:r>
+      <w:r>
+        <w:t xml:space="preserve"> </w:t>
+      </w:r>
+      <w:r>
+        <w:t xml:space="preserve">bilinguals</w:t>
+      </w:r>
+      <w:r>
+        <w:t xml:space="preserve"> </w:t>
+      </w:r>
+      <w:r>
+        <w:t xml:space="preserve">were</w:t>
+      </w:r>
+      <w:r>
+        <w:t xml:space="preserve"> </w:t>
+      </w:r>
+      <w:r>
+        <w:t xml:space="preserve">3.45</w:t>
+      </w:r>
+      <w:r>
+        <w:t xml:space="preserve"> </w:t>
+      </w:r>
+      <w:r>
+        <w:t xml:space="preserve">years</w:t>
+      </w:r>
+      <w:r>
+        <w:t xml:space="preserve"> </w:t>
+      </w:r>
+      <w:r>
+        <w:t xml:space="preserve">older</w:t>
+      </w:r>
+      <w:r>
+        <w:t xml:space="preserve"> </w:t>
+      </w:r>
+      <w:r>
+        <w:t xml:space="preserve">than</w:t>
+      </w:r>
+      <w:r>
+        <w:t xml:space="preserve"> </w:t>
+      </w:r>
+      <w:r>
+        <w:t xml:space="preserve">monolinguals</w:t>
+      </w:r>
+      <w:r>
+        <w:t xml:space="preserve"> </w:t>
+      </w:r>
+      <w:r>
+        <w:t xml:space="preserve">when</w:t>
+      </w:r>
+      <w:r>
+        <w:t xml:space="preserve"> </w:t>
+      </w:r>
+      <w:r>
+        <w:t xml:space="preserve">having</w:t>
+      </w:r>
+      <w:r>
+        <w:t xml:space="preserve"> </w:t>
+      </w:r>
+      <w:r>
+        <w:t xml:space="preserve">the</w:t>
+      </w:r>
+      <w:r>
+        <w:t xml:space="preserve"> </w:t>
+      </w:r>
+      <w:r>
+        <w:t xml:space="preserve">first</w:t>
+      </w:r>
+      <w:r>
+        <w:t xml:space="preserve"> </w:t>
+      </w:r>
+      <w:r>
+        <w:t xml:space="preserve">symptom</w:t>
+      </w:r>
+      <w:r>
+        <w:t xml:space="preserve"> </w:t>
+      </w:r>
+      <w:r>
+        <w:t xml:space="preserve">onset</w:t>
+      </w:r>
+      <w:r>
+        <w:t xml:space="preserve"> </w:t>
+      </w:r>
+      <w:r>
+        <w:t xml:space="preserve">(95%</w:t>
+      </w:r>
+      <w:r>
+        <w:t xml:space="preserve"> </w:t>
+      </w:r>
+      <w:r>
+        <w:t xml:space="preserve">credible</w:t>
+      </w:r>
+      <w:r>
+        <w:t xml:space="preserve"> </w:t>
+      </w:r>
+      <w:r>
+        <w:t xml:space="preserve">interval</w:t>
+      </w:r>
+      <w:r>
+        <w:t xml:space="preserve"> </w:t>
+      </w:r>
+      <w:r>
+        <w:t xml:space="preserve">(Crl):</w:t>
+      </w:r>
+      <w:r>
+        <w:t xml:space="preserve"> </w:t>
+      </w:r>
+      <w:r>
+        <w:t xml:space="preserve">[2.8,</w:t>
+      </w:r>
+      <w:r>
+        <w:t xml:space="preserve"> </w:t>
+      </w:r>
+      <w:r>
+        <w:t xml:space="preserve">4.1]).</w:t>
+      </w:r>
+      <w:r>
+        <w:t xml:space="preserve"> </w:t>
+      </w:r>
+      <w:r>
+        <w:t xml:space="preserve">Moreover,</w:t>
+      </w:r>
+      <w:r>
+        <w:t xml:space="preserve"> </w:t>
+      </w:r>
+      <w:r>
+        <w:t xml:space="preserve">the</w:t>
+      </w:r>
+      <w:r>
+        <w:t xml:space="preserve"> </w:t>
+      </w:r>
+      <w:r>
+        <w:t xml:space="preserve">result</w:t>
+      </w:r>
+      <w:r>
+        <w:t xml:space="preserve"> </w:t>
+      </w:r>
+      <w:r>
+        <w:t xml:space="preserve">was</w:t>
+      </w:r>
+      <w:r>
+        <w:t xml:space="preserve"> </w:t>
+      </w:r>
+      <w:r>
+        <w:t xml:space="preserve">only</w:t>
+      </w:r>
+      <w:r>
+        <w:t xml:space="preserve"> </w:t>
+      </w:r>
+      <w:r>
+        <w:t xml:space="preserve">slightly</w:t>
+      </w:r>
+      <w:r>
+        <w:t xml:space="preserve"> </w:t>
+      </w:r>
+      <w:r>
+        <w:t xml:space="preserve">influenced</w:t>
+      </w:r>
+      <w:r>
+        <w:t xml:space="preserve"> </w:t>
+      </w:r>
+      <w:r>
+        <w:t xml:space="preserve">by</w:t>
+      </w:r>
+      <w:r>
+        <w:t xml:space="preserve"> </w:t>
+      </w:r>
+      <w:r>
+        <w:t xml:space="preserve">years</w:t>
+      </w:r>
+      <w:r>
+        <w:t xml:space="preserve"> </w:t>
+      </w:r>
+      <w:r>
+        <w:t xml:space="preserve">of</w:t>
+      </w:r>
+      <w:r>
+        <w:t xml:space="preserve"> </w:t>
+      </w:r>
+      <w:r>
+        <w:t xml:space="preserve">education,</w:t>
+      </w:r>
+      <w:r>
+        <w:t xml:space="preserve"> </w:t>
+      </w:r>
+      <w:r>
+        <w:t xml:space="preserve">although</w:t>
+      </w:r>
+      <w:r>
+        <w:t xml:space="preserve"> </w:t>
+      </w:r>
+      <w:r>
+        <w:t xml:space="preserve">it</w:t>
+      </w:r>
+      <w:r>
+        <w:t xml:space="preserve"> </w:t>
+      </w:r>
+      <w:r>
+        <w:t xml:space="preserve">is</w:t>
+      </w:r>
+      <w:r>
+        <w:t xml:space="preserve"> </w:t>
+      </w:r>
+      <w:r>
+        <w:t xml:space="preserve">relatively</w:t>
+      </w:r>
+      <w:r>
+        <w:t xml:space="preserve"> </w:t>
+      </w:r>
+      <w:r>
+        <w:t xml:space="preserve">uncertain</w:t>
+      </w:r>
+      <w:r>
+        <w:t xml:space="preserve"> </w:t>
+      </w:r>
+      <w:r>
+        <w:t xml:space="preserve">about</w:t>
+      </w:r>
+      <w:r>
+        <w:t xml:space="preserve"> </w:t>
+      </w:r>
+      <w:r>
+        <w:t xml:space="preserve">the</w:t>
+      </w:r>
+      <w:r>
+        <w:t xml:space="preserve"> </w:t>
+      </w:r>
+      <w:r>
+        <w:t xml:space="preserve">effect</w:t>
+      </w:r>
+      <w:r>
+        <w:t xml:space="preserve"> </w:t>
+      </w:r>
+      <w:r>
+        <w:t xml:space="preserve">of</w:t>
+      </w:r>
+      <w:r>
+        <w:t xml:space="preserve"> </w:t>
+      </w:r>
+      <w:r>
+        <w:t xml:space="preserve">education</w:t>
+      </w:r>
+      <w:r>
+        <w:t xml:space="preserve"> </w:t>
+      </w:r>
+      <w:r>
+        <w:t xml:space="preserve">on</w:t>
+      </w:r>
+      <w:r>
+        <w:t xml:space="preserve"> </w:t>
+      </w:r>
+      <w:r>
+        <w:t xml:space="preserve">dementia.</w:t>
+      </w:r>
+      <w:r>
+        <w:t xml:space="preserve"> </w:t>
+      </w:r>
+      <w:r>
+        <w:t xml:space="preserve">The</w:t>
+      </w:r>
+      <w:r>
+        <w:t xml:space="preserve"> </w:t>
+      </w:r>
+      <w:r>
+        <w:t xml:space="preserve">results</w:t>
+      </w:r>
+      <w:r>
+        <w:t xml:space="preserve"> </w:t>
+      </w:r>
+      <w:r>
+        <w:t xml:space="preserve">from</w:t>
+      </w:r>
+      <w:r>
+        <w:t xml:space="preserve"> </w:t>
+      </w:r>
+      <w:r>
+        <w:t xml:space="preserve">6</w:t>
+      </w:r>
+      <w:r>
+        <w:t xml:space="preserve"> </w:t>
+      </w:r>
+      <w:r>
+        <w:t xml:space="preserve">incidence</w:t>
+      </w:r>
+      <w:r>
+        <w:t xml:space="preserve"> </w:t>
+      </w:r>
+      <w:r>
+        <w:t xml:space="preserve">rate</w:t>
+      </w:r>
+      <w:r>
+        <w:t xml:space="preserve"> </w:t>
+      </w:r>
+      <w:r>
+        <w:t xml:space="preserve">studies</w:t>
+      </w:r>
+      <w:r>
+        <w:t xml:space="preserve"> </w:t>
+      </w:r>
+      <w:r>
+        <w:t xml:space="preserve">did</w:t>
+      </w:r>
+      <w:r>
+        <w:t xml:space="preserve"> </w:t>
+      </w:r>
+      <w:r>
+        <w:t xml:space="preserve">not</w:t>
+      </w:r>
+      <w:r>
+        <w:t xml:space="preserve"> </w:t>
+      </w:r>
+      <w:r>
+        <w:t xml:space="preserve">provide</w:t>
+      </w:r>
+      <w:r>
+        <w:t xml:space="preserve"> </w:t>
+      </w:r>
+      <w:r>
+        <w:t xml:space="preserve">robust</w:t>
+      </w:r>
+      <w:r>
+        <w:t xml:space="preserve"> </w:t>
+      </w:r>
+      <w:r>
+        <w:t xml:space="preserve">evidence</w:t>
+      </w:r>
+      <w:r>
+        <w:t xml:space="preserve"> </w:t>
+      </w:r>
+      <w:r>
+        <w:t xml:space="preserve">for</w:t>
+      </w:r>
+      <w:r>
+        <w:t xml:space="preserve"> </w:t>
+      </w:r>
+      <w:r>
+        <w:t xml:space="preserve">bilingualism’s</w:t>
+      </w:r>
+      <w:r>
+        <w:t xml:space="preserve"> </w:t>
+      </w:r>
+      <w:r>
+        <w:t xml:space="preserve">preventive</w:t>
+      </w:r>
+      <w:r>
+        <w:t xml:space="preserve"> </w:t>
+      </w:r>
+      <w:r>
+        <w:t xml:space="preserve">effect.</w:t>
+      </w:r>
+      <w:r>
+        <w:t xml:space="preserve"> </w:t>
+      </w:r>
+      <w:r>
+        <w:t xml:space="preserve">Therefore,</w:t>
+      </w:r>
+      <w:r>
+        <w:t xml:space="preserve"> </w:t>
+      </w:r>
+      <w:r>
+        <w:t xml:space="preserve">this</w:t>
+      </w:r>
+      <w:r>
+        <w:t xml:space="preserve"> </w:t>
+      </w:r>
+      <w:r>
+        <w:t xml:space="preserve">meta-analysis</w:t>
+      </w:r>
+      <w:r>
+        <w:t xml:space="preserve"> </w:t>
+      </w:r>
+      <w:r>
+        <w:t xml:space="preserve">demonstrated</w:t>
+      </w:r>
+      <w:r>
+        <w:t xml:space="preserve"> </w:t>
+      </w:r>
+      <w:r>
+        <w:t xml:space="preserve">that</w:t>
+      </w:r>
+      <w:r>
+        <w:t xml:space="preserve"> </w:t>
+      </w:r>
+      <w:r>
+        <w:t xml:space="preserve">bilingualism</w:t>
+      </w:r>
+      <w:r>
+        <w:t xml:space="preserve"> </w:t>
+      </w:r>
+      <w:r>
+        <w:t xml:space="preserve">has</w:t>
+      </w:r>
+      <w:r>
+        <w:t xml:space="preserve"> </w:t>
+      </w:r>
+      <w:r>
+        <w:t xml:space="preserve">potential</w:t>
+      </w:r>
+      <w:r>
+        <w:t xml:space="preserve"> </w:t>
+      </w:r>
+      <w:r>
+        <w:t xml:space="preserve">effects</w:t>
+      </w:r>
+      <w:r>
+        <w:t xml:space="preserve"> </w:t>
+      </w:r>
+      <w:r>
+        <w:t xml:space="preserve">in</w:t>
+      </w:r>
+      <w:r>
+        <w:t xml:space="preserve"> </w:t>
+      </w:r>
+      <w:r>
+        <w:t xml:space="preserve">delaying</w:t>
+      </w:r>
+      <w:r>
+        <w:t xml:space="preserve"> </w:t>
+      </w:r>
+      <w:r>
+        <w:t xml:space="preserve">the</w:t>
+      </w:r>
+      <w:r>
+        <w:t xml:space="preserve"> </w:t>
+      </w:r>
+      <w:r>
+        <w:t xml:space="preserve">onset</w:t>
+      </w:r>
+      <w:r>
+        <w:t xml:space="preserve"> </w:t>
+      </w:r>
+      <w:r>
+        <w:t xml:space="preserve">of</w:t>
+      </w:r>
+      <w:r>
+        <w:t xml:space="preserve"> </w:t>
+      </w:r>
+      <w:r>
+        <w:t xml:space="preserve">dementia</w:t>
+      </w:r>
+      <w:r>
+        <w:t xml:space="preserve"> </w:t>
+      </w:r>
+      <w:r>
+        <w:t xml:space="preserve">but</w:t>
+      </w:r>
+      <w:r>
+        <w:t xml:space="preserve"> </w:t>
+      </w:r>
+      <w:r>
+        <w:t xml:space="preserve">not</w:t>
+      </w:r>
+      <w:r>
+        <w:t xml:space="preserve"> </w:t>
+      </w:r>
+      <w:r>
+        <w:t xml:space="preserve">preventing</w:t>
+      </w:r>
+      <w:r>
+        <w:t xml:space="preserve"> </w:t>
+      </w:r>
+      <w:r>
+        <w:t xml:space="preserve">it.</w:t>
       </w:r>
     </w:p>
     <w:bookmarkStart w:id="20" w:name="introduction"/>
@@ -70,7 +1258,7 @@
         <w:t>You can mark changes in red like so</w:t>
       </w:r>
       <w:r>
-        <w:t xml:space="preserve">. The ageing adults may face an increasing risk of dementia, a range of neurodegenerative diseases, as a result of deterioration of brain tissue</w:t>
+        <w:t xml:space="preserve">. The ageing adults may face an increasing risk of dementia, a syndrome resulting from range of neurodegenerative diseases, as a result of deterioration of brain tissue</w:t>
       </w:r>
       <w:r>
         <w:t xml:space="preserve"> </w:t>
@@ -127,19 +1315,43 @@
         <w:t xml:space="preserve">(Kepp, 2016)</w:t>
       </w:r>
       <w:r>
-        <w:t xml:space="preserve"> </w:t>
-      </w:r>
-      <w:r>
-        <w:t xml:space="preserve">and the pharmaceutical treatments’ effects on slowing down its progression are inadequate</w:t>
-      </w:r>
-      <w:r>
-        <w:t xml:space="preserve"> </w:t>
-      </w:r>
-      <w:r>
-        <w:t xml:space="preserve">(Massoud &amp; Gauthier, 2010)</w:t>
-      </w:r>
-      <w:r>
-        <w:t xml:space="preserve">. However, several socio-behavioural factors may contribute to cognitive reserve, which helps individuals use compensatory mechanisms or functional processes to cope with neurodegeneration and pathology</w:t>
+        <w:t xml:space="preserve">.</w:t>
+      </w:r>
+      <w:r>
+        <w:t xml:space="preserve"> </w:t>
+      </w:r>
+      <w:r>
+        <w:rPr>
+          <w:color w:val="FF0000"/>
+        </w:rPr>
+        <w:t>While recent pharmacological advances, particularly anti-amyloid monoclonal antibody therapies, have shown significant results in double-blind, placebo-controlled phase III clinical trials</w:t>
+      </w:r>
+      <w:r>
+        <w:t xml:space="preserve"> </w:t>
+      </w:r>
+      <w:r>
+        <w:t xml:space="preserve">(Budd Haeberlein et al., 2022; Sims et al., 2023; Van Dyck et al., 2023)</w:t>
+      </w:r>
+      <w:r>
+        <w:t xml:space="preserve">,</w:t>
+      </w:r>
+      <w:r>
+        <w:t xml:space="preserve"> </w:t>
+      </w:r>
+      <w:r>
+        <w:rPr>
+          <w:color w:val="FF0000"/>
+        </w:rPr>
+        <w:t>the clinical meaningfulness, the long-term impact of these treatments and the actual therapeutic efficacy and accessibility for real-world population are still under debate</w:t>
+      </w:r>
+      <w:r>
+        <w:t xml:space="preserve"> </w:t>
+      </w:r>
+      <w:r>
+        <w:t xml:space="preserve">(Angioni et al., 2024)</w:t>
+      </w:r>
+      <w:r>
+        <w:t xml:space="preserve">. Several socio-behavioural factors may contribute to cognitive reserve, which helps individuals use compensatory mechanisms or functional processes to cope with neurodegeneration and pathology</w:t>
       </w:r>
       <w:r>
         <w:t xml:space="preserve"> </w:t>
@@ -458,7 +1670,13 @@
         <w:t xml:space="preserve"> </w:t>
       </w:r>
       <w:r>
-        <w:t xml:space="preserve">“advantage”</w:t>
+        <w:t xml:space="preserve">“</w:t>
+      </w:r>
+      <w:r>
+        <w:t xml:space="preserve">advantage</w:t>
+      </w:r>
+      <w:r>
+        <w:t xml:space="preserve">”</w:t>
       </w:r>
       <w:r>
         <w:t xml:space="preserve"> </w:t>
@@ -730,7 +1948,13 @@
         <w:t xml:space="preserve"> </w:t>
       </w:r>
       <w:r>
-        <w:t xml:space="preserve">“a strategy to delay dementia”</w:t>
+        <w:t xml:space="preserve">“</w:t>
+      </w:r>
+      <w:r>
+        <w:t xml:space="preserve">a strategy to delay dementia</w:t>
+      </w:r>
+      <w:r>
+        <w:t xml:space="preserve">”</w:t>
       </w:r>
       <w:r>
         <w:t xml:space="preserve"> </w:t>
@@ -872,7 +2096,13 @@
         <w:t xml:space="preserve">The datasets used in the present meta-analysis were PsycInfo, PubMed, and Google Scholar. A search of these databases and data extraction were conducted by Z.L. with the following keywords: (</w:t>
       </w:r>
       <w:r>
-        <w:t xml:space="preserve">“bilingualism”</w:t>
+        <w:t xml:space="preserve">“</w:t>
+      </w:r>
+      <w:r>
+        <w:t xml:space="preserve">bilingualism</w:t>
+      </w:r>
+      <w:r>
+        <w:t xml:space="preserve">”</w:t>
       </w:r>
       <w:r>
         <w:t xml:space="preserve"> </w:t>
@@ -884,13 +2114,25 @@
         <w:t xml:space="preserve"> </w:t>
       </w:r>
       <w:r>
-        <w:t xml:space="preserve">“multilingualism”</w:t>
+        <w:t xml:space="preserve">“</w:t>
+      </w:r>
+      <w:r>
+        <w:t xml:space="preserve">multilingualism</w:t>
+      </w:r>
+      <w:r>
+        <w:t xml:space="preserve">”</w:t>
       </w:r>
       <w:r>
         <w:t xml:space="preserve">) AND (</w:t>
       </w:r>
       <w:r>
-        <w:t xml:space="preserve">“Alzheimer’s disease”</w:t>
+        <w:t xml:space="preserve">“</w:t>
+      </w:r>
+      <w:r>
+        <w:t xml:space="preserve">Alzheimer’s disease</w:t>
+      </w:r>
+      <w:r>
+        <w:t xml:space="preserve">”</w:t>
       </w:r>
       <w:r>
         <w:t xml:space="preserve"> </w:t>
@@ -902,7 +2144,13 @@
         <w:t xml:space="preserve"> </w:t>
       </w:r>
       <w:r>
-        <w:t xml:space="preserve">“dementia”</w:t>
+        <w:t xml:space="preserve">“</w:t>
+      </w:r>
+      <w:r>
+        <w:t xml:space="preserve">dementia</w:t>
+      </w:r>
+      <w:r>
+        <w:t xml:space="preserve">”</w:t>
       </w:r>
       <w:r>
         <w:t xml:space="preserve"> </w:t>
@@ -1512,7 +2760,13 @@
         <w:t xml:space="preserve"> </w:t>
       </w:r>
       <w:r>
-        <w:t xml:space="preserve">“avg_comparisons()”</w:t>
+        <w:t xml:space="preserve">“</w:t>
+      </w:r>
+      <w:r>
+        <w:t xml:space="preserve">avg_comparisons()</w:t>
+      </w:r>
+      <w:r>
+        <w:t xml:space="preserve">”</w:t>
       </w:r>
       <w:r>
         <w:t xml:space="preserve"> </w:t>
@@ -1964,7 +3218,13 @@
         <w:t xml:space="preserve"> </w:t>
       </w:r>
       <w:r>
-        <w:t xml:space="preserve">“years of education”</w:t>
+        <w:t xml:space="preserve">“</w:t>
+      </w:r>
+      <w:r>
+        <w:t xml:space="preserve">years of education</w:t>
+      </w:r>
+      <w:r>
+        <w:t xml:space="preserve">”</w:t>
       </w:r>
       <w:r>
         <w:t xml:space="preserve"> </w:t>
@@ -1976,7 +3236,13 @@
         <w:t xml:space="preserve"> </w:t>
       </w:r>
       <w:r>
-        <w:t xml:space="preserve">“years of education”</w:t>
+        <w:t xml:space="preserve">“</w:t>
+      </w:r>
+      <w:r>
+        <w:t xml:space="preserve">years of education</w:t>
+      </w:r>
+      <w:r>
+        <w:t xml:space="preserve">”</w:t>
       </w:r>
       <w:r>
         <w:t xml:space="preserve"> </w:t>
@@ -2034,6 +3300,7 @@
           <w:p>
             <w:pPr>
               <w:pStyle w:val="Compact"/>
+              <w:jc w:val="left"/>
             </w:pPr>
             <w:r>
               <w:t xml:space="preserve">Study</w:t>
@@ -2045,6 +3312,7 @@
           <w:p>
             <w:pPr>
               <w:pStyle w:val="Compact"/>
+              <w:jc w:val="left"/>
             </w:pPr>
             <w:r>
               <w:t xml:space="preserve">Dementia Diagnosis</w:t>
@@ -2056,6 +3324,7 @@
           <w:p>
             <w:pPr>
               <w:pStyle w:val="Compact"/>
+              <w:jc w:val="left"/>
             </w:pPr>
             <w:r>
               <w:t xml:space="preserve">Type of Dementia or MCI</w:t>
@@ -2067,6 +3336,7 @@
           <w:p>
             <w:pPr>
               <w:pStyle w:val="Compact"/>
+              <w:jc w:val="left"/>
             </w:pPr>
             <w:r>
               <w:t xml:space="preserve">Mean Age of Diagnosis &amp; Symptom Onset (SD)</w:t>
@@ -2080,6 +3350,7 @@
           <w:p>
             <w:pPr>
               <w:pStyle w:val="Compact"/>
+              <w:jc w:val="left"/>
             </w:pPr>
             <w:r>
               <w:t xml:space="preserve">Alladi et al. (2013)</w:t>
@@ -2091,6 +3362,7 @@
           <w:p>
             <w:pPr>
               <w:pStyle w:val="Compact"/>
+              <w:jc w:val="left"/>
             </w:pPr>
             <w:r>
               <w:t xml:space="preserve">Cambridge Memory Clinic model</w:t>
@@ -2102,6 +3374,7 @@
           <w:p>
             <w:pPr>
               <w:pStyle w:val="Compact"/>
+              <w:jc w:val="left"/>
             </w:pPr>
             <w:r>
               <w:t xml:space="preserve">AD</w:t>
@@ -2113,6 +3386,7 @@
           <w:p>
             <w:pPr>
               <w:pStyle w:val="Compact"/>
+              <w:jc w:val="left"/>
             </w:pPr>
             <w:r>
               <w:t xml:space="preserve">ML: 65.4 (10.0); BL: 68.6 (9.6)</w:t>
@@ -2126,6 +3400,7 @@
           <w:p>
             <w:pPr>
               <w:pStyle w:val="Compact"/>
+              <w:jc w:val="left"/>
             </w:pPr>
             <w:r>
               <w:t xml:space="preserve">Bialystok et al. (2007)</w:t>
@@ -2137,6 +3412,7 @@
           <w:p>
             <w:pPr>
               <w:pStyle w:val="Compact"/>
+              <w:jc w:val="left"/>
             </w:pPr>
             <w:r>
               <w:t xml:space="preserve">NINCDS-ADRDA</w:t>
@@ -2148,6 +3424,7 @@
           <w:p>
             <w:pPr>
               <w:pStyle w:val="Compact"/>
+              <w:jc w:val="left"/>
             </w:pPr>
             <w:r>
               <w:t xml:space="preserve">AD</w:t>
@@ -2159,6 +3436,7 @@
           <w:p>
             <w:pPr>
               <w:pStyle w:val="Compact"/>
+              <w:jc w:val="left"/>
             </w:pPr>
             <w:r>
               <w:t xml:space="preserve">ML: 71.4 (9.6); BL: 75.5 (8.5)</w:t>
@@ -2172,6 +3450,7 @@
           <w:p>
             <w:pPr>
               <w:pStyle w:val="Compact"/>
+              <w:jc w:val="left"/>
             </w:pPr>
             <w:r>
               <w:t xml:space="preserve">Bialystok et al. (2014)</w:t>
@@ -2183,6 +3462,7 @@
           <w:p>
             <w:pPr>
               <w:pStyle w:val="Compact"/>
+              <w:jc w:val="left"/>
             </w:pPr>
             <w:r>
               <w:t xml:space="preserve">NA</w:t>
@@ -2194,6 +3474,7 @@
           <w:p>
             <w:pPr>
               <w:pStyle w:val="Compact"/>
+              <w:jc w:val="left"/>
             </w:pPr>
             <w:r>
               <w:t xml:space="preserve">AD</w:t>
@@ -2205,6 +3486,7 @@
           <w:p>
             <w:pPr>
               <w:pStyle w:val="Compact"/>
+              <w:jc w:val="left"/>
             </w:pPr>
             <w:r>
               <w:t xml:space="preserve">ML: 70.9 (11.0); BL: 78.2 (8.9)</w:t>
@@ -2218,6 +3500,7 @@
           <w:p>
             <w:pPr>
               <w:pStyle w:val="Compact"/>
+              <w:jc w:val="left"/>
             </w:pPr>
             <w:r>
               <w:t xml:space="preserve">Berkes et al. (2020)</w:t>
@@ -2229,6 +3512,7 @@
           <w:p>
             <w:pPr>
               <w:pStyle w:val="Compact"/>
+              <w:jc w:val="left"/>
             </w:pPr>
             <w:r>
               <w:t xml:space="preserve">MMSE, MoCA</w:t>
@@ -2240,6 +3524,7 @@
           <w:p>
             <w:pPr>
               <w:pStyle w:val="Compact"/>
+              <w:jc w:val="left"/>
             </w:pPr>
             <w:r>
               <w:t xml:space="preserve">AD</w:t>
@@ -2251,6 +3536,7 @@
           <w:p>
             <w:pPr>
               <w:pStyle w:val="Compact"/>
+              <w:jc w:val="left"/>
             </w:pPr>
             <w:r>
               <w:t xml:space="preserve">ML: 78.2 (7.7); BL: 79.8 (8.4)</w:t>
@@ -2264,6 +3550,7 @@
           <w:p>
             <w:pPr>
               <w:pStyle w:val="Compact"/>
+              <w:jc w:val="left"/>
             </w:pPr>
             <w:r>
               <w:t xml:space="preserve">Chertkow et al. (2010)</w:t>
@@ -2275,6 +3562,7 @@
           <w:p>
             <w:pPr>
               <w:pStyle w:val="Compact"/>
+              <w:jc w:val="left"/>
             </w:pPr>
             <w:r>
               <w:t xml:space="preserve">Patient &amp; caregiver interviews</w:t>
@@ -2286,6 +3574,7 @@
           <w:p>
             <w:pPr>
               <w:pStyle w:val="Compact"/>
+              <w:jc w:val="left"/>
             </w:pPr>
             <w:r>
               <w:t xml:space="preserve">AD</w:t>
@@ -2297,6 +3586,7 @@
           <w:p>
             <w:pPr>
               <w:pStyle w:val="Compact"/>
+              <w:jc w:val="left"/>
             </w:pPr>
             <w:r>
               <w:t xml:space="preserve">ML: 76.7 (7.8); BL: 77.6 (7.2)</w:t>
@@ -2310,6 +3600,7 @@
           <w:p>
             <w:pPr>
               <w:pStyle w:val="Compact"/>
+              <w:jc w:val="left"/>
             </w:pPr>
             <w:r>
               <w:t xml:space="preserve">Clare et al. (2016)</w:t>
@@ -2321,6 +3612,7 @@
           <w:p>
             <w:pPr>
               <w:pStyle w:val="Compact"/>
+              <w:jc w:val="left"/>
             </w:pPr>
             <w:r>
               <w:t xml:space="preserve">LQ-SV</w:t>
@@ -2332,6 +3624,7 @@
           <w:p>
             <w:pPr>
               <w:pStyle w:val="Compact"/>
+              <w:jc w:val="left"/>
             </w:pPr>
             <w:r>
               <w:t xml:space="preserve">AD</w:t>
@@ -2343,6 +3636,7 @@
           <w:p>
             <w:pPr>
               <w:pStyle w:val="Compact"/>
+              <w:jc w:val="left"/>
             </w:pPr>
             <w:r>
               <w:t xml:space="preserve">ML: 76.2 (8.75); BL: 79.3 (6.78)</w:t>
@@ -2356,6 +3650,7 @@
           <w:p>
             <w:pPr>
               <w:pStyle w:val="Compact"/>
+              <w:jc w:val="left"/>
             </w:pPr>
             <w:r>
               <w:t xml:space="preserve">Craik et al. (2010)</w:t>
@@ -2367,6 +3662,7 @@
           <w:p>
             <w:pPr>
               <w:pStyle w:val="Compact"/>
+              <w:jc w:val="left"/>
             </w:pPr>
             <w:r>
               <w:t xml:space="preserve">NA</w:t>
@@ -2378,6 +3674,7 @@
           <w:p>
             <w:pPr>
               <w:pStyle w:val="Compact"/>
+              <w:jc w:val="left"/>
             </w:pPr>
             <w:r>
               <w:t xml:space="preserve">AD</w:t>
@@ -2389,6 +3686,7 @@
           <w:p>
             <w:pPr>
               <w:pStyle w:val="Compact"/>
+              <w:jc w:val="left"/>
             </w:pPr>
             <w:r>
               <w:t xml:space="preserve">ML: 72.6 (10); BL: 77.7 (7.9)</w:t>
@@ -2402,6 +3700,7 @@
           <w:p>
             <w:pPr>
               <w:pStyle w:val="Compact"/>
+              <w:jc w:val="left"/>
             </w:pPr>
             <w:r>
               <w:t xml:space="preserve">Leon et al. (2020)</w:t>
@@ -2413,6 +3712,7 @@
           <w:p>
             <w:pPr>
               <w:pStyle w:val="Compact"/>
+              <w:jc w:val="left"/>
             </w:pPr>
             <w:r>
               <w:t xml:space="preserve">NA</w:t>
@@ -2424,6 +3724,7 @@
           <w:p>
             <w:pPr>
               <w:pStyle w:val="Compact"/>
+              <w:jc w:val="left"/>
             </w:pPr>
             <w:r>
               <w:t xml:space="preserve">AD</w:t>
@@ -2435,6 +3736,7 @@
           <w:p>
             <w:pPr>
               <w:pStyle w:val="Compact"/>
+              <w:jc w:val="left"/>
             </w:pPr>
             <w:r>
               <w:t xml:space="preserve">ML: 60.3 (9.8); BL: 61.9 (9.8)</w:t>
@@ -2448,6 +3750,7 @@
           <w:p>
             <w:pPr>
               <w:pStyle w:val="Compact"/>
+              <w:jc w:val="left"/>
             </w:pPr>
             <w:r>
               <w:t xml:space="preserve">Duncan et al. (2018)</w:t>
@@ -2459,6 +3762,7 @@
           <w:p>
             <w:pPr>
               <w:pStyle w:val="Compact"/>
+              <w:jc w:val="left"/>
             </w:pPr>
             <w:r>
               <w:t xml:space="preserve">NINCDS-ADRDA</w:t>
@@ -2470,6 +3774,7 @@
           <w:p>
             <w:pPr>
               <w:pStyle w:val="Compact"/>
+              <w:jc w:val="left"/>
             </w:pPr>
             <w:r>
               <w:t xml:space="preserve">AD</w:t>
@@ -2481,6 +3786,7 @@
           <w:p>
             <w:pPr>
               <w:pStyle w:val="Compact"/>
+              <w:jc w:val="left"/>
             </w:pPr>
             <w:r>
               <w:t xml:space="preserve">ML: 74.3 (1.5); BL: 72.6 (1.6)</w:t>
@@ -2494,6 +3800,7 @@
           <w:p>
             <w:pPr>
               <w:pStyle w:val="Compact"/>
+              <w:jc w:val="left"/>
             </w:pPr>
             <w:r>
               <w:t xml:space="preserve">Kowoll et al. (2016)</w:t>
@@ -2505,6 +3812,7 @@
           <w:p>
             <w:pPr>
               <w:pStyle w:val="Compact"/>
+              <w:jc w:val="left"/>
             </w:pPr>
             <w:r>
               <w:t xml:space="preserve">NINCDS-ADRDA</w:t>
@@ -2516,6 +3824,7 @@
           <w:p>
             <w:pPr>
               <w:pStyle w:val="Compact"/>
+              <w:jc w:val="left"/>
             </w:pPr>
             <w:r>
               <w:t xml:space="preserve">AD</w:t>
@@ -2527,6 +3836,7 @@
           <w:p>
             <w:pPr>
               <w:pStyle w:val="Compact"/>
+              <w:jc w:val="left"/>
             </w:pPr>
             <w:r>
               <w:t xml:space="preserve">ML: 71.6 (7.9); BL: 74.6 (6.8)</w:t>
@@ -2540,6 +3850,7 @@
           <w:p>
             <w:pPr>
               <w:pStyle w:val="Compact"/>
+              <w:jc w:val="left"/>
             </w:pPr>
             <w:r>
               <w:t xml:space="preserve">Perani et al. (2017)</w:t>
@@ -2551,6 +3862,7 @@
           <w:p>
             <w:pPr>
               <w:pStyle w:val="Compact"/>
+              <w:jc w:val="left"/>
             </w:pPr>
             <w:r>
               <w:t xml:space="preserve">NIA-AA</w:t>
@@ -2562,6 +3874,7 @@
           <w:p>
             <w:pPr>
               <w:pStyle w:val="Compact"/>
+              <w:jc w:val="left"/>
             </w:pPr>
             <w:r>
               <w:t xml:space="preserve">AD</w:t>
@@ -2573,6 +3886,7 @@
           <w:p>
             <w:pPr>
               <w:pStyle w:val="Compact"/>
+              <w:jc w:val="left"/>
             </w:pPr>
             <w:r>
               <w:t xml:space="preserve">ML: 71.4 (4.88); BL: 77.1 (4.52)</w:t>
@@ -2586,6 +3900,7 @@
           <w:p>
             <w:pPr>
               <w:pStyle w:val="Compact"/>
+              <w:jc w:val="left"/>
             </w:pPr>
             <w:r>
               <w:t xml:space="preserve">Mendez et al. (2020)</w:t>
@@ -2597,6 +3912,7 @@
           <w:p>
             <w:pPr>
               <w:pStyle w:val="Compact"/>
+              <w:jc w:val="left"/>
             </w:pPr>
             <w:r>
               <w:t xml:space="preserve">NIA-AA</w:t>
@@ -2608,6 +3924,7 @@
           <w:p>
             <w:pPr>
               <w:pStyle w:val="Compact"/>
+              <w:jc w:val="left"/>
             </w:pPr>
             <w:r>
               <w:t xml:space="preserve">AD</w:t>
@@ -2619,6 +3936,7 @@
           <w:p>
             <w:pPr>
               <w:pStyle w:val="Compact"/>
+              <w:jc w:val="left"/>
             </w:pPr>
             <w:r>
               <w:t xml:space="preserve">ML: 58 (10.7); BL: 62.4 (10.5)</w:t>
@@ -2632,6 +3950,7 @@
           <w:p>
             <w:pPr>
               <w:pStyle w:val="Compact"/>
+              <w:jc w:val="left"/>
             </w:pPr>
             <w:r>
               <w:t xml:space="preserve">E. V. Y. Woumans et al. (2015)</w:t>
@@ -2643,6 +3962,7 @@
           <w:p>
             <w:pPr>
               <w:pStyle w:val="Compact"/>
+              <w:jc w:val="left"/>
             </w:pPr>
             <w:r>
               <w:t xml:space="preserve">Neurologist + Neuropsychologist</w:t>
@@ -2654,6 +3974,7 @@
           <w:p>
             <w:pPr>
               <w:pStyle w:val="Compact"/>
+              <w:jc w:val="left"/>
             </w:pPr>
             <w:r>
               <w:t xml:space="preserve">AD</w:t>
@@ -2665,6 +3986,7 @@
           <w:p>
             <w:pPr>
               <w:pStyle w:val="Compact"/>
+              <w:jc w:val="left"/>
             </w:pPr>
             <w:r>
               <w:t xml:space="preserve">ML: 73.8 (8.8); BL: 75.5 (8.2)</w:t>
@@ -2678,6 +4000,7 @@
           <w:p>
             <w:pPr>
               <w:pStyle w:val="Compact"/>
+              <w:jc w:val="left"/>
             </w:pPr>
             <w:r>
               <w:t xml:space="preserve">Zheng et al. (2018)</w:t>
@@ -2689,6 +4012,7 @@
           <w:p>
             <w:pPr>
               <w:pStyle w:val="Compact"/>
+              <w:jc w:val="left"/>
             </w:pPr>
             <w:r>
               <w:t xml:space="preserve">NINCDS-ADRDA</w:t>
@@ -2700,6 +4024,7 @@
           <w:p>
             <w:pPr>
               <w:pStyle w:val="Compact"/>
+              <w:jc w:val="left"/>
             </w:pPr>
             <w:r>
               <w:t xml:space="preserve">AD</w:t>
@@ -2711,6 +4036,7 @@
           <w:p>
             <w:pPr>
               <w:pStyle w:val="Compact"/>
+              <w:jc w:val="left"/>
             </w:pPr>
             <w:r>
               <w:t xml:space="preserve">ML: 63.9 (96.5), 63.4 (8.94); BL: 70.9 (9.37)</w:t>
@@ -2724,6 +4050,7 @@
           <w:p>
             <w:pPr>
               <w:pStyle w:val="Compact"/>
+              <w:jc w:val="left"/>
             </w:pPr>
             <w:r>
               <w:t xml:space="preserve">Alladi et al. (2013)</w:t>
@@ -2735,6 +4062,7 @@
           <w:p>
             <w:pPr>
               <w:pStyle w:val="Compact"/>
+              <w:jc w:val="left"/>
             </w:pPr>
             <w:r>
               <w:t xml:space="preserve">Cambridge Memory Clinic model</w:t>
@@ -2746,6 +4074,7 @@
           <w:p>
             <w:pPr>
               <w:pStyle w:val="Compact"/>
+              <w:jc w:val="left"/>
             </w:pPr>
             <w:r>
               <w:t xml:space="preserve">FTD</w:t>
@@ -2757,6 +4086,7 @@
           <w:p>
             <w:pPr>
               <w:pStyle w:val="Compact"/>
+              <w:jc w:val="left"/>
             </w:pPr>
             <w:r>
               <w:t xml:space="preserve">ML: 55.6 (10.5); BL: 61.6 (9)</w:t>
@@ -2770,6 +4100,7 @@
           <w:p>
             <w:pPr>
               <w:pStyle w:val="Compact"/>
+              <w:jc w:val="left"/>
             </w:pPr>
             <w:r>
               <w:t xml:space="preserve">Alladi et al. (2017)</w:t>
@@ -2781,6 +4112,7 @@
           <w:p>
             <w:pPr>
               <w:pStyle w:val="Compact"/>
+              <w:jc w:val="left"/>
             </w:pPr>
             <w:r>
               <w:t xml:space="preserve">MMSE, ACE-R, CDR, FrSBe</w:t>
@@ -2792,6 +4124,7 @@
           <w:p>
             <w:pPr>
               <w:pStyle w:val="Compact"/>
+              <w:jc w:val="left"/>
             </w:pPr>
             <w:r>
               <w:t xml:space="preserve">FTD</w:t>
@@ -2803,6 +4136,7 @@
           <w:p>
             <w:pPr>
               <w:pStyle w:val="Compact"/>
+              <w:jc w:val="left"/>
             </w:pPr>
             <w:r>
               <w:t xml:space="preserve">ML: 58.4 (9.3); BL: 61.7 (9.1)</w:t>
@@ -2816,6 +4150,7 @@
           <w:p>
             <w:pPr>
               <w:pStyle w:val="Compact"/>
+              <w:jc w:val="left"/>
             </w:pPr>
             <w:r>
               <w:t xml:space="preserve">Leon et al. (2024)</w:t>
@@ -2827,6 +4162,7 @@
           <w:p>
             <w:pPr>
               <w:pStyle w:val="Compact"/>
+              <w:jc w:val="left"/>
             </w:pPr>
             <w:r>
               <w:t xml:space="preserve">NA</w:t>
@@ -2838,6 +4174,7 @@
           <w:p>
             <w:pPr>
               <w:pStyle w:val="Compact"/>
+              <w:jc w:val="left"/>
             </w:pPr>
             <w:r>
               <w:t xml:space="preserve">FTD</w:t>
@@ -2849,6 +4186,7 @@
           <w:p>
             <w:pPr>
               <w:pStyle w:val="Compact"/>
+              <w:jc w:val="left"/>
             </w:pPr>
             <w:r>
               <w:t xml:space="preserve">ML: 59 (9.2); BL: 61.4 (7.9)</w:t>
@@ -2862,6 +4200,7 @@
           <w:p>
             <w:pPr>
               <w:pStyle w:val="Compact"/>
+              <w:jc w:val="left"/>
             </w:pPr>
             <w:r>
               <w:t xml:space="preserve">Berkes et al. (2020)</w:t>
@@ -2873,6 +4212,7 @@
           <w:p>
             <w:pPr>
               <w:pStyle w:val="Compact"/>
+              <w:jc w:val="left"/>
             </w:pPr>
             <w:r>
               <w:t xml:space="preserve">MMSE, MoCA</w:t>
@@ -2884,6 +4224,7 @@
           <w:p>
             <w:pPr>
               <w:pStyle w:val="Compact"/>
+              <w:jc w:val="left"/>
             </w:pPr>
             <w:r>
               <w:t xml:space="preserve">MCI</w:t>
@@ -2895,6 +4236,7 @@
           <w:p>
             <w:pPr>
               <w:pStyle w:val="Compact"/>
+              <w:jc w:val="left"/>
             </w:pPr>
             <w:r>
               <w:t xml:space="preserve">ML: 75.5 (7.6); BL: 77.8 (8.2)</w:t>
@@ -2908,6 +4250,7 @@
           <w:p>
             <w:pPr>
               <w:pStyle w:val="Compact"/>
+              <w:jc w:val="left"/>
             </w:pPr>
             <w:r>
               <w:t xml:space="preserve">Ossher et al. (2013)</w:t>
@@ -2919,6 +4262,7 @@
           <w:p>
             <w:pPr>
               <w:pStyle w:val="Compact"/>
+              <w:jc w:val="left"/>
             </w:pPr>
             <w:r>
               <w:t xml:space="preserve">Neuropsychological interview</w:t>
@@ -2930,6 +4274,7 @@
           <w:p>
             <w:pPr>
               <w:pStyle w:val="Compact"/>
+              <w:jc w:val="left"/>
             </w:pPr>
             <w:r>
               <w:t xml:space="preserve">Single Domain aMCI</w:t>
@@ -2941,6 +4286,7 @@
           <w:p>
             <w:pPr>
               <w:pStyle w:val="Compact"/>
+              <w:jc w:val="left"/>
             </w:pPr>
             <w:r>
               <w:t xml:space="preserve">ML: 74.9 (49); BL: 79.4 (6.3)</w:t>
@@ -2954,6 +4300,7 @@
           <w:p>
             <w:pPr>
               <w:pStyle w:val="Compact"/>
+              <w:jc w:val="left"/>
             </w:pPr>
             <w:r>
               <w:t xml:space="preserve">Ossher et al. (2013)</w:t>
@@ -2965,6 +4312,7 @@
           <w:p>
             <w:pPr>
               <w:pStyle w:val="Compact"/>
+              <w:jc w:val="left"/>
             </w:pPr>
             <w:r>
               <w:t xml:space="preserve">Neuropsychological interview</w:t>
@@ -2976,6 +4324,7 @@
           <w:p>
             <w:pPr>
               <w:pStyle w:val="Compact"/>
+              <w:jc w:val="left"/>
             </w:pPr>
             <w:r>
               <w:t xml:space="preserve">Multiple Domain aMCI</w:t>
@@ -2987,6 +4336,7 @@
           <w:p>
             <w:pPr>
               <w:pStyle w:val="Compact"/>
+              <w:jc w:val="left"/>
             </w:pPr>
             <w:r>
               <w:t xml:space="preserve">ML: 75.2 (8.5); BL: 72.6 (7.2)</w:t>
@@ -3000,6 +4350,7 @@
           <w:p>
             <w:pPr>
               <w:pStyle w:val="Compact"/>
+              <w:jc w:val="left"/>
             </w:pPr>
             <w:r>
               <w:t xml:space="preserve">Ramakrishnan et al. (2017)</w:t>
@@ -3011,6 +4362,7 @@
           <w:p>
             <w:pPr>
               <w:pStyle w:val="Compact"/>
+              <w:jc w:val="left"/>
             </w:pPr>
             <w:r>
               <w:t xml:space="preserve">Petersen’s criteria</w:t>
@@ -3022,6 +4374,7 @@
           <w:p>
             <w:pPr>
               <w:pStyle w:val="Compact"/>
+              <w:jc w:val="left"/>
             </w:pPr>
             <w:r>
               <w:t xml:space="preserve">MCI</w:t>
@@ -3033,6 +4386,7 @@
           <w:p>
             <w:pPr>
               <w:pStyle w:val="Compact"/>
+              <w:jc w:val="left"/>
             </w:pPr>
             <w:r>
               <w:t xml:space="preserve">ML: 55.8 (12.2); BL: 63.2 (10.1)</w:t>
@@ -4046,7 +5400,13 @@
         <w:t xml:space="preserve"> </w:t>
       </w:r>
       <w:r>
-        <w:t xml:space="preserve">“advantage”</w:t>
+        <w:t xml:space="preserve">“</w:t>
+      </w:r>
+      <w:r>
+        <w:t xml:space="preserve">advantage</w:t>
+      </w:r>
+      <w:r>
+        <w:t xml:space="preserve">”</w:t>
       </w:r>
       <w:r>
         <w:t xml:space="preserve"> </w:t>
@@ -4261,7 +5621,7 @@
       </w:r>
     </w:p>
     <w:bookmarkEnd w:id="89"/>
-    <w:bookmarkStart w:id="171" w:name="references"/>
+    <w:bookmarkStart w:id="174" w:name="references"/>
     <w:p>
       <w:pPr>
         <w:pStyle w:val="Heading1"/>
@@ -4270,7 +5630,7 @@
         <w:t xml:space="preserve">References</w:t>
       </w:r>
     </w:p>
-    <w:bookmarkStart w:id="170" w:name="refs"/>
+    <w:bookmarkStart w:id="173" w:name="refs"/>
     <w:bookmarkStart w:id="90" w:name="ref-abutalebi2015"/>
     <w:p>
       <w:pPr>
@@ -4415,12 +5775,48 @@
       </w:r>
     </w:p>
     <w:bookmarkEnd w:id="93"/>
-    <w:bookmarkStart w:id="94" w:name="ref-arel2024"/>
+    <w:bookmarkStart w:id="94" w:name="ref-angioni2024"/>
     <w:p>
       <w:pPr>
         <w:pStyle w:val="Bibliography"/>
       </w:pPr>
       <w:r>
+        <w:t xml:space="preserve">Angioni, D., Cummings, J., Lansdall, C., Middleton, L., Sampaio, C., Gauthier, S., Cohen, S., Petersen, R., Rentz, D., Wessels, A., et al. (2024). Clinical meaningfulness in alzheimer’s disease clinical trials. A report from the EU-US CTAD task force.</w:t>
+      </w:r>
+      <w:r>
+        <w:t xml:space="preserve"> </w:t>
+      </w:r>
+      <w:r>
+        <w:rPr>
+          <w:i/>
+          <w:iCs/>
+        </w:rPr>
+        <w:t xml:space="preserve">The Journal of Prevention of Alzheimer’s Disease</w:t>
+      </w:r>
+      <w:r>
+        <w:t xml:space="preserve">,</w:t>
+      </w:r>
+      <w:r>
+        <w:t xml:space="preserve"> </w:t>
+      </w:r>
+      <w:r>
+        <w:rPr>
+          <w:i/>
+          <w:iCs/>
+        </w:rPr>
+        <w:t xml:space="preserve">11</w:t>
+      </w:r>
+      <w:r>
+        <w:t xml:space="preserve">(5), 1219–1227.</w:t>
+      </w:r>
+    </w:p>
+    <w:bookmarkEnd w:id="94"/>
+    <w:bookmarkStart w:id="95" w:name="ref-arel2024"/>
+    <w:p>
+      <w:pPr>
+        <w:pStyle w:val="Bibliography"/>
+      </w:pPr>
+      <w:r>
         <w:t xml:space="preserve">Arel-Bundock, V., Greifer, N., &amp; Heiss, A. (2024). How to interpret statistical models using marginaleffects for r and python.</w:t>
       </w:r>
       <w:r>
@@ -4450,8 +5846,8 @@
         <w:t xml:space="preserve">, 1–32.</w:t>
       </w:r>
     </w:p>
-    <w:bookmarkEnd w:id="94"/>
-    <w:bookmarkStart w:id="95" w:name="ref-bak2016"/>
+    <w:bookmarkEnd w:id="95"/>
+    <w:bookmarkStart w:id="96" w:name="ref-bak2016"/>
     <w:p>
       <w:pPr>
         <w:pStyle w:val="Bibliography"/>
@@ -4486,8 +5882,8 @@
         <w:t xml:space="preserve">(1-2), 205–226.</w:t>
       </w:r>
     </w:p>
-    <w:bookmarkEnd w:id="95"/>
-    <w:bookmarkStart w:id="96" w:name="ref-bennett2006"/>
+    <w:bookmarkEnd w:id="96"/>
+    <w:bookmarkStart w:id="97" w:name="ref-bennett2006"/>
     <w:p>
       <w:pPr>
         <w:pStyle w:val="Bibliography"/>
@@ -4522,8 +5918,8 @@
         <w:t xml:space="preserve">(12), 1837–1844.</w:t>
       </w:r>
     </w:p>
-    <w:bookmarkEnd w:id="96"/>
-    <w:bookmarkStart w:id="97" w:name="ref-berkes2022"/>
+    <w:bookmarkEnd w:id="97"/>
+    <w:bookmarkStart w:id="98" w:name="ref-berkes2022"/>
     <w:p>
       <w:pPr>
         <w:pStyle w:val="Bibliography"/>
@@ -4558,8 +5954,8 @@
         <w:t xml:space="preserve">, 15333175221091417.</w:t>
       </w:r>
     </w:p>
-    <w:bookmarkEnd w:id="97"/>
-    <w:bookmarkStart w:id="98" w:name="ref-berkes2020"/>
+    <w:bookmarkEnd w:id="98"/>
+    <w:bookmarkStart w:id="99" w:name="ref-berkes2020"/>
     <w:p>
       <w:pPr>
         <w:pStyle w:val="Bibliography"/>
@@ -4594,8 +5990,8 @@
         <w:t xml:space="preserve">(3), 225–230.</w:t>
       </w:r>
     </w:p>
-    <w:bookmarkEnd w:id="98"/>
-    <w:bookmarkStart w:id="99" w:name="ref-bialystok2022"/>
+    <w:bookmarkEnd w:id="99"/>
+    <w:bookmarkStart w:id="100" w:name="ref-bialystok2022"/>
     <w:p>
       <w:pPr>
         <w:pStyle w:val="Bibliography"/>
@@ -4630,8 +6026,8 @@
         <w:t xml:space="preserve">(4), 1246–1269.</w:t>
       </w:r>
     </w:p>
-    <w:bookmarkEnd w:id="99"/>
-    <w:bookmarkStart w:id="100" w:name="ref-bialystok2007"/>
+    <w:bookmarkEnd w:id="100"/>
+    <w:bookmarkStart w:id="101" w:name="ref-bialystok2007"/>
     <w:p>
       <w:pPr>
         <w:pStyle w:val="Bibliography"/>
@@ -4666,8 +6062,8 @@
         <w:t xml:space="preserve">(2), 459–464.</w:t>
       </w:r>
     </w:p>
-    <w:bookmarkEnd w:id="100"/>
-    <w:bookmarkStart w:id="101" w:name="ref-bialystok2014"/>
+    <w:bookmarkEnd w:id="101"/>
+    <w:bookmarkStart w:id="102" w:name="ref-bialystok2014"/>
     <w:p>
       <w:pPr>
         <w:pStyle w:val="Bibliography"/>
@@ -4702,8 +6098,8 @@
         <w:t xml:space="preserve">(2), 290.</w:t>
       </w:r>
     </w:p>
-    <w:bookmarkEnd w:id="101"/>
-    <w:bookmarkStart w:id="102" w:name="ref-bialystok2012"/>
+    <w:bookmarkEnd w:id="102"/>
+    <w:bookmarkStart w:id="103" w:name="ref-bialystok2012"/>
     <w:p>
       <w:pPr>
         <w:pStyle w:val="Bibliography"/>
@@ -4738,8 +6134,8 @@
         <w:t xml:space="preserve">(4), 240–250.</w:t>
       </w:r>
     </w:p>
-    <w:bookmarkEnd w:id="102"/>
-    <w:bookmarkStart w:id="103" w:name="ref-blom2014"/>
+    <w:bookmarkEnd w:id="103"/>
+    <w:bookmarkStart w:id="104" w:name="ref-blom2014"/>
     <w:p>
       <w:pPr>
         <w:pStyle w:val="Bibliography"/>
@@ -4774,8 +6170,8 @@
         <w:t xml:space="preserve">, 105–119.</w:t>
       </w:r>
     </w:p>
-    <w:bookmarkEnd w:id="103"/>
-    <w:bookmarkStart w:id="104" w:name="ref-borenstein2021"/>
+    <w:bookmarkEnd w:id="104"/>
+    <w:bookmarkStart w:id="105" w:name="ref-borenstein2021"/>
     <w:p>
       <w:pPr>
         <w:pStyle w:val="Bibliography"/>
@@ -4797,8 +6193,8 @@
         <w:t xml:space="preserve">. John wiley &amp; sons.</w:t>
       </w:r>
     </w:p>
-    <w:bookmarkEnd w:id="104"/>
-    <w:bookmarkStart w:id="105" w:name="ref-brier2012"/>
+    <w:bookmarkEnd w:id="105"/>
+    <w:bookmarkStart w:id="106" w:name="ref-brier2012"/>
     <w:p>
       <w:pPr>
         <w:pStyle w:val="Bibliography"/>
@@ -4833,8 +6229,8 @@
         <w:t xml:space="preserve">(26), 8890–8899.</w:t>
       </w:r>
     </w:p>
-    <w:bookmarkEnd w:id="105"/>
-    <w:bookmarkStart w:id="106" w:name="ref-brini2020"/>
+    <w:bookmarkEnd w:id="106"/>
+    <w:bookmarkStart w:id="107" w:name="ref-brini2020"/>
     <w:p>
       <w:pPr>
         <w:pStyle w:val="Bibliography"/>
@@ -4869,13 +6265,49 @@
         <w:t xml:space="preserve">, 1–24.</w:t>
       </w:r>
     </w:p>
-    <w:bookmarkEnd w:id="106"/>
-    <w:bookmarkStart w:id="107" w:name="ref-burkner2021"/>
+    <w:bookmarkEnd w:id="107"/>
+    <w:bookmarkStart w:id="108" w:name="ref-budd2022"/>
     <w:p>
       <w:pPr>
         <w:pStyle w:val="Bibliography"/>
       </w:pPr>
       <w:r>
+        <w:t xml:space="preserve">Budd Haeberlein, S., Aisen, P., Barkhof, F., Chalkias, S., Chen, T., Cohen, S., Dent, G., Hansson, O., Harrison, K., Von Hehn, C., et al. (2022). Two randomized phase 3 studies of aducanumab in early alzheimer’s disease.</w:t>
+      </w:r>
+      <w:r>
+        <w:t xml:space="preserve"> </w:t>
+      </w:r>
+      <w:r>
+        <w:rPr>
+          <w:i/>
+          <w:iCs/>
+        </w:rPr>
+        <w:t xml:space="preserve">The Journal of Prevention of Alzheimer’s Disease</w:t>
+      </w:r>
+      <w:r>
+        <w:t xml:space="preserve">,</w:t>
+      </w:r>
+      <w:r>
+        <w:t xml:space="preserve"> </w:t>
+      </w:r>
+      <w:r>
+        <w:rPr>
+          <w:i/>
+          <w:iCs/>
+        </w:rPr>
+        <w:t xml:space="preserve">9</w:t>
+      </w:r>
+      <w:r>
+        <w:t xml:space="preserve">(2), 197–210.</w:t>
+      </w:r>
+    </w:p>
+    <w:bookmarkEnd w:id="108"/>
+    <w:bookmarkStart w:id="109" w:name="ref-burkner2021"/>
+    <w:p>
+      <w:pPr>
+        <w:pStyle w:val="Bibliography"/>
+      </w:pPr>
+      <w:r>
         <w:t xml:space="preserve">Bürkner, P.-C. (2021). Bayesian item response modeling in r with brms and stan.</w:t>
       </w:r>
       <w:r>
@@ -4905,8 +6337,8 @@
         <w:t xml:space="preserve">, 1–54.</w:t>
       </w:r>
     </w:p>
-    <w:bookmarkEnd w:id="107"/>
-    <w:bookmarkStart w:id="108" w:name="ref-calabria2020"/>
+    <w:bookmarkEnd w:id="109"/>
+    <w:bookmarkStart w:id="110" w:name="ref-calabria2020"/>
     <w:p>
       <w:pPr>
         <w:pStyle w:val="Bibliography"/>
@@ -4941,8 +6373,8 @@
         <w:t xml:space="preserve">, 107528.</w:t>
       </w:r>
     </w:p>
-    <w:bookmarkEnd w:id="108"/>
-    <w:bookmarkStart w:id="109" w:name="ref-chan2001"/>
+    <w:bookmarkEnd w:id="110"/>
+    <w:bookmarkStart w:id="111" w:name="ref-chan2001"/>
     <w:p>
       <w:pPr>
         <w:pStyle w:val="Bibliography"/>
@@ -4977,8 +6409,8 @@
         <w:t xml:space="preserve">(4), 433–442.</w:t>
       </w:r>
     </w:p>
-    <w:bookmarkEnd w:id="109"/>
-    <w:bookmarkStart w:id="110" w:name="ref-chertkow2010"/>
+    <w:bookmarkEnd w:id="111"/>
+    <w:bookmarkStart w:id="112" w:name="ref-chertkow2010"/>
     <w:p>
       <w:pPr>
         <w:pStyle w:val="Bibliography"/>
@@ -5013,8 +6445,8 @@
         <w:t xml:space="preserve">(2), 118–125.</w:t>
       </w:r>
     </w:p>
-    <w:bookmarkEnd w:id="110"/>
-    <w:bookmarkStart w:id="111" w:name="ref-clare2016"/>
+    <w:bookmarkEnd w:id="112"/>
+    <w:bookmarkStart w:id="113" w:name="ref-clare2016"/>
     <w:p>
       <w:pPr>
         <w:pStyle w:val="Bibliography"/>
@@ -5049,8 +6481,8 @@
         <w:t xml:space="preserve">(2), 163–185.</w:t>
       </w:r>
     </w:p>
-    <w:bookmarkEnd w:id="111"/>
-    <w:bookmarkStart w:id="112" w:name="ref-comishen2021"/>
+    <w:bookmarkEnd w:id="113"/>
+    <w:bookmarkStart w:id="114" w:name="ref-comishen2021"/>
     <w:p>
       <w:pPr>
         <w:pStyle w:val="Bibliography"/>
@@ -5072,8 +6504,8 @@
         <w:t xml:space="preserve">.</w:t>
       </w:r>
     </w:p>
-    <w:bookmarkEnd w:id="112"/>
-    <w:bookmarkStart w:id="113" w:name="ref-craik2010"/>
+    <w:bookmarkEnd w:id="114"/>
+    <w:bookmarkStart w:id="115" w:name="ref-craik2010"/>
     <w:p>
       <w:pPr>
         <w:pStyle w:val="Bibliography"/>
@@ -5108,8 +6540,8 @@
         <w:t xml:space="preserve">(19), 1726–1729.</w:t>
       </w:r>
     </w:p>
-    <w:bookmarkEnd w:id="113"/>
-    <w:bookmarkStart w:id="114" w:name="ref-davis2008"/>
+    <w:bookmarkEnd w:id="115"/>
+    <w:bookmarkStart w:id="116" w:name="ref-davis2008"/>
     <w:p>
       <w:pPr>
         <w:pStyle w:val="Bibliography"/>
@@ -5144,8 +6576,8 @@
         <w:t xml:space="preserve">(5), 1201–1209.</w:t>
       </w:r>
     </w:p>
-    <w:bookmarkEnd w:id="114"/>
-    <w:bookmarkStart w:id="115" w:name="ref-duncan2018"/>
+    <w:bookmarkEnd w:id="116"/>
+    <w:bookmarkStart w:id="117" w:name="ref-duncan2018"/>
     <w:p>
       <w:pPr>
         <w:pStyle w:val="Bibliography"/>
@@ -5180,8 +6612,8 @@
         <w:t xml:space="preserve">, 270–282.</w:t>
       </w:r>
     </w:p>
-    <w:bookmarkEnd w:id="115"/>
-    <w:bookmarkStart w:id="116" w:name="ref-folstein1975"/>
+    <w:bookmarkEnd w:id="117"/>
+    <w:bookmarkStart w:id="118" w:name="ref-folstein1975"/>
     <w:p>
       <w:pPr>
         <w:pStyle w:val="Bibliography"/>
@@ -5225,8 +6657,8 @@
         <w:t xml:space="preserve">(3), 189–198.</w:t>
       </w:r>
     </w:p>
-    <w:bookmarkEnd w:id="116"/>
-    <w:bookmarkStart w:id="117" w:name="ref-frank2008"/>
+    <w:bookmarkEnd w:id="118"/>
+    <w:bookmarkStart w:id="119" w:name="ref-frank2008"/>
     <w:p>
       <w:pPr>
         <w:pStyle w:val="Bibliography"/>
@@ -5251,8 +6683,8 @@
         <w:t xml:space="preserve">(Vol. 89). Elsevier.</w:t>
       </w:r>
     </w:p>
-    <w:bookmarkEnd w:id="117"/>
-    <w:bookmarkStart w:id="118" w:name="ref-frazier2004"/>
+    <w:bookmarkEnd w:id="119"/>
+    <w:bookmarkStart w:id="120" w:name="ref-frazier2004"/>
     <w:p>
       <w:pPr>
         <w:pStyle w:val="Bibliography"/>
@@ -5287,8 +6719,8 @@
         <w:t xml:space="preserve">(3), 543.</w:t>
       </w:r>
     </w:p>
-    <w:bookmarkEnd w:id="118"/>
-    <w:bookmarkStart w:id="119" w:name="ref-fuller2014"/>
+    <w:bookmarkEnd w:id="120"/>
+    <w:bookmarkStart w:id="121" w:name="ref-fuller2014"/>
     <w:p>
       <w:pPr>
         <w:pStyle w:val="Bibliography"/>
@@ -5307,8 +6739,8 @@
         <w:t xml:space="preserve">The healthy migrant effect may confound the link between bilingualism and delayed onset of alzheimer’s disease.</w:t>
       </w:r>
     </w:p>
-    <w:bookmarkEnd w:id="119"/>
-    <w:bookmarkStart w:id="120" w:name="ref-gatz2001"/>
+    <w:bookmarkEnd w:id="121"/>
+    <w:bookmarkStart w:id="122" w:name="ref-gatz2001"/>
     <w:p>
       <w:pPr>
         <w:pStyle w:val="Bibliography"/>
@@ -5343,8 +6775,8 @@
         <w:t xml:space="preserve">(5), P292–P300.</w:t>
       </w:r>
     </w:p>
-    <w:bookmarkEnd w:id="120"/>
-    <w:bookmarkStart w:id="121" w:name="ref-gollan2012"/>
+    <w:bookmarkEnd w:id="122"/>
+    <w:bookmarkStart w:id="123" w:name="ref-gollan2012"/>
     <w:p>
       <w:pPr>
         <w:pStyle w:val="Bibliography"/>
@@ -5379,8 +6811,8 @@
         <w:t xml:space="preserve">(3), 594–615.</w:t>
       </w:r>
     </w:p>
-    <w:bookmarkEnd w:id="121"/>
-    <w:bookmarkStart w:id="122" w:name="ref-grady1994"/>
+    <w:bookmarkEnd w:id="123"/>
+    <w:bookmarkStart w:id="124" w:name="ref-grady1994"/>
     <w:p>
       <w:pPr>
         <w:pStyle w:val="Bibliography"/>
@@ -5415,8 +6847,8 @@
         <w:t xml:space="preserve">(3), 1450–1462.</w:t>
       </w:r>
     </w:p>
-    <w:bookmarkEnd w:id="122"/>
-    <w:bookmarkStart w:id="123" w:name="ref-grundy2017"/>
+    <w:bookmarkEnd w:id="124"/>
+    <w:bookmarkStart w:id="125" w:name="ref-grundy2017"/>
     <w:p>
       <w:pPr>
         <w:pStyle w:val="Bibliography"/>
@@ -5451,8 +6883,8 @@
         <w:t xml:space="preserve">, 344.</w:t>
       </w:r>
     </w:p>
-    <w:bookmarkEnd w:id="123"/>
-    <w:bookmarkStart w:id="124" w:name="ref-hanna2011"/>
+    <w:bookmarkEnd w:id="125"/>
+    <w:bookmarkStart w:id="126" w:name="ref-hanna2011"/>
     <w:p>
       <w:pPr>
         <w:pStyle w:val="Bibliography"/>
@@ -5487,8 +6919,8 @@
         <w:t xml:space="preserve">(3), 378.</w:t>
       </w:r>
     </w:p>
-    <w:bookmarkEnd w:id="124"/>
-    <w:bookmarkStart w:id="125" w:name="ref-hase2018"/>
+    <w:bookmarkEnd w:id="126"/>
+    <w:bookmarkStart w:id="127" w:name="ref-hase2018"/>
     <w:p>
       <w:pPr>
         <w:pStyle w:val="Bibliography"/>
@@ -5523,8 +6955,8 @@
         <w:t xml:space="preserve">(5), 617–633.</w:t>
       </w:r>
     </w:p>
-    <w:bookmarkEnd w:id="125"/>
-    <w:bookmarkStart w:id="126" w:name="ref-homer1994"/>
+    <w:bookmarkEnd w:id="127"/>
+    <w:bookmarkStart w:id="128" w:name="ref-homer1994"/>
     <w:p>
       <w:pPr>
         <w:pStyle w:val="Bibliography"/>
@@ -5559,8 +6991,8 @@
         <w:t xml:space="preserve">(3), 177–189.</w:t>
       </w:r>
     </w:p>
-    <w:bookmarkEnd w:id="126"/>
-    <w:bookmarkStart w:id="127" w:name="ref-jafari2021"/>
+    <w:bookmarkEnd w:id="128"/>
+    <w:bookmarkStart w:id="129" w:name="ref-jafari2021"/>
     <w:p>
       <w:pPr>
         <w:pStyle w:val="Bibliography"/>
@@ -5595,8 +7027,8 @@
         <w:t xml:space="preserve">(1), 8–22.</w:t>
       </w:r>
     </w:p>
-    <w:bookmarkEnd w:id="127"/>
-    <w:bookmarkStart w:id="128" w:name="ref-kay2023"/>
+    <w:bookmarkEnd w:id="129"/>
+    <w:bookmarkStart w:id="130" w:name="ref-kay2023"/>
     <w:p>
       <w:pPr>
         <w:pStyle w:val="Bibliography"/>
@@ -5646,8 +7078,8 @@
         <w:t xml:space="preserve">.</w:t>
       </w:r>
     </w:p>
-    <w:bookmarkEnd w:id="128"/>
-    <w:bookmarkStart w:id="129" w:name="ref-kepp2016"/>
+    <w:bookmarkEnd w:id="130"/>
+    <w:bookmarkStart w:id="131" w:name="ref-kepp2016"/>
     <w:p>
       <w:pPr>
         <w:pStyle w:val="Bibliography"/>
@@ -5682,8 +7114,8 @@
         <w:t xml:space="preserve">(2), 447–457.</w:t>
       </w:r>
     </w:p>
-    <w:bookmarkEnd w:id="129"/>
-    <w:bookmarkStart w:id="131" w:name="ref-kowoll2016"/>
+    <w:bookmarkEnd w:id="131"/>
+    <w:bookmarkStart w:id="133" w:name="ref-kowoll2016"/>
     <w:p>
       <w:pPr>
         <w:pStyle w:val="Bibliography"/>
@@ -5720,7 +7152,7 @@
       <w:r>
         <w:t xml:space="preserve"> </w:t>
       </w:r>
-      <w:hyperlink r:id="rId130">
+      <w:hyperlink r:id="rId132">
         <w:r>
           <w:rPr>
             <w:rStyle w:val="Hyperlink"/>
@@ -5729,8 +7161,8 @@
         </w:r>
       </w:hyperlink>
     </w:p>
-    <w:bookmarkEnd w:id="131"/>
-    <w:bookmarkStart w:id="133" w:name="ref-lawton2015"/>
+    <w:bookmarkEnd w:id="133"/>
+    <w:bookmarkStart w:id="135" w:name="ref-lawton2015"/>
     <w:p>
       <w:pPr>
         <w:pStyle w:val="Bibliography"/>
@@ -5767,7 +7199,7 @@
       <w:r>
         <w:t xml:space="preserve"> </w:t>
       </w:r>
-      <w:hyperlink r:id="rId132">
+      <w:hyperlink r:id="rId134">
         <w:r>
           <w:rPr>
             <w:rStyle w:val="Hyperlink"/>
@@ -5776,8 +7208,8 @@
         </w:r>
       </w:hyperlink>
     </w:p>
-    <w:bookmarkEnd w:id="133"/>
-    <w:bookmarkStart w:id="135" w:name="ref-lee2022"/>
+    <w:bookmarkEnd w:id="135"/>
+    <w:bookmarkStart w:id="137" w:name="ref-lee2022"/>
     <w:p>
       <w:pPr>
         <w:pStyle w:val="Bibliography"/>
@@ -5814,7 +7246,7 @@
       <w:r>
         <w:t xml:space="preserve"> </w:t>
       </w:r>
-      <w:hyperlink r:id="rId134">
+      <w:hyperlink r:id="rId136">
         <w:r>
           <w:rPr>
             <w:rStyle w:val="Hyperlink"/>
@@ -5823,8 +7255,8 @@
         </w:r>
       </w:hyperlink>
     </w:p>
-    <w:bookmarkEnd w:id="135"/>
-    <w:bookmarkStart w:id="136" w:name="ref-de2024"/>
+    <w:bookmarkEnd w:id="137"/>
+    <w:bookmarkStart w:id="138" w:name="ref-de2024"/>
     <w:p>
       <w:pPr>
         <w:pStyle w:val="Bibliography"/>
@@ -5859,8 +7291,8 @@
         <w:t xml:space="preserve">(2), 274–286.</w:t>
       </w:r>
     </w:p>
-    <w:bookmarkEnd w:id="136"/>
-    <w:bookmarkStart w:id="137" w:name="ref-de2020"/>
+    <w:bookmarkEnd w:id="138"/>
+    <w:bookmarkStart w:id="139" w:name="ref-de2020"/>
     <w:p>
       <w:pPr>
         <w:pStyle w:val="Bibliography"/>
@@ -5895,8 +7327,8 @@
         <w:t xml:space="preserve">(12), 1704–1713.</w:t>
       </w:r>
     </w:p>
-    <w:bookmarkEnd w:id="137"/>
-    <w:bookmarkStart w:id="138" w:name="ref-light1984"/>
+    <w:bookmarkEnd w:id="139"/>
+    <w:bookmarkStart w:id="140" w:name="ref-light1984"/>
     <w:p>
       <w:pPr>
         <w:pStyle w:val="Bibliography"/>
@@ -5918,8 +7350,8 @@
         <w:t xml:space="preserve">. Harvard University Press.</w:t>
       </w:r>
     </w:p>
-    <w:bookmarkEnd w:id="138"/>
-    <w:bookmarkStart w:id="139" w:name="ref-ljungberg2016"/>
+    <w:bookmarkEnd w:id="140"/>
+    <w:bookmarkStart w:id="141" w:name="ref-ljungberg2016"/>
     <w:p>
       <w:pPr>
         <w:pStyle w:val="Bibliography"/>
@@ -5954,24 +7386,24 @@
         <w:t xml:space="preserve">(1-2), 190–204.</w:t>
       </w:r>
     </w:p>
-    <w:bookmarkEnd w:id="139"/>
-    <w:bookmarkStart w:id="140" w:name="ref-massoud2010"/>
+    <w:bookmarkEnd w:id="141"/>
+    <w:bookmarkStart w:id="143" w:name="ref-meda2013"/>
     <w:p>
       <w:pPr>
         <w:pStyle w:val="Bibliography"/>
       </w:pPr>
       <w:r>
-        <w:t xml:space="preserve">Massoud, F., &amp; Gauthier, S. (2010). Update on the pharmacological treatment of alzheimer’s disease.</w:t>
-      </w:r>
-      <w:r>
-        <w:t xml:space="preserve"> </w:t>
-      </w:r>
-      <w:r>
-        <w:rPr>
-          <w:i/>
-          <w:iCs/>
-        </w:rPr>
-        <w:t xml:space="preserve">Current Neuropharmacology</w:t>
+        <w:t xml:space="preserve">Meda, S. A., Koran, M. E. I., Pryweller, J. R., Vega, J. N., &amp; Thornton-Wells, T. A. (2013). Genetic interactions associated with 12-month atrophy in hippocampus and entorhinal cortex in alzheimer’s disease.</w:t>
+      </w:r>
+      <w:r>
+        <w:t xml:space="preserve"> </w:t>
+      </w:r>
+      <w:r>
+        <w:rPr>
+          <w:i/>
+          <w:iCs/>
+        </w:rPr>
+        <w:t xml:space="preserve">Neurobiology of Aging</w:t>
       </w:r>
       <w:r>
         <w:t xml:space="preserve">,</w:t>
@@ -5984,42 +7416,6 @@
           <w:i/>
           <w:iCs/>
         </w:rPr>
-        <w:t xml:space="preserve">8</w:t>
-      </w:r>
-      <w:r>
-        <w:t xml:space="preserve">(1), 69–80.</w:t>
-      </w:r>
-    </w:p>
-    <w:bookmarkEnd w:id="140"/>
-    <w:bookmarkStart w:id="142" w:name="ref-meda2013"/>
-    <w:p>
-      <w:pPr>
-        <w:pStyle w:val="Bibliography"/>
-      </w:pPr>
-      <w:r>
-        <w:t xml:space="preserve">Meda, S. A., Koran, M. E. I., Pryweller, J. R., Vega, J. N., &amp; Thornton-Wells, T. A. (2013). Genetic interactions associated with 12-month atrophy in hippocampus and entorhinal cortex in alzheimer’s disease.</w:t>
-      </w:r>
-      <w:r>
-        <w:t xml:space="preserve"> </w:t>
-      </w:r>
-      <w:r>
-        <w:rPr>
-          <w:i/>
-          <w:iCs/>
-        </w:rPr>
-        <w:t xml:space="preserve">Neurobiology of Aging</w:t>
-      </w:r>
-      <w:r>
-        <w:t xml:space="preserve">,</w:t>
-      </w:r>
-      <w:r>
-        <w:t xml:space="preserve"> </w:t>
-      </w:r>
-      <w:r>
-        <w:rPr>
-          <w:i/>
-          <w:iCs/>
-        </w:rPr>
         <w:t xml:space="preserve">34</w:t>
       </w:r>
       <w:r>
@@ -6028,7 +7424,7 @@
       <w:r>
         <w:t xml:space="preserve"> </w:t>
       </w:r>
-      <w:hyperlink r:id="rId141">
+      <w:hyperlink r:id="rId142">
         <w:r>
           <w:rPr>
             <w:rStyle w:val="Hyperlink"/>
@@ -6037,8 +7433,8 @@
         </w:r>
       </w:hyperlink>
     </w:p>
-    <w:bookmarkEnd w:id="142"/>
-    <w:bookmarkStart w:id="143" w:name="ref-mendez2020"/>
+    <w:bookmarkEnd w:id="143"/>
+    <w:bookmarkStart w:id="144" w:name="ref-mendez2020"/>
     <w:p>
       <w:pPr>
         <w:pStyle w:val="Bibliography"/>
@@ -6073,8 +7469,8 @@
         <w:t xml:space="preserve">(5-6), 281–289.</w:t>
       </w:r>
     </w:p>
-    <w:bookmarkEnd w:id="143"/>
-    <w:bookmarkStart w:id="144" w:name="ref-de2018"/>
+    <w:bookmarkEnd w:id="144"/>
+    <w:bookmarkStart w:id="145" w:name="ref-de2018"/>
     <w:p>
       <w:pPr>
         <w:pStyle w:val="Bibliography"/>
@@ -6109,8 +7505,8 @@
         <w:t xml:space="preserve">(25), 5826–5836.</w:t>
       </w:r>
     </w:p>
-    <w:bookmarkEnd w:id="144"/>
-    <w:bookmarkStart w:id="145" w:name="ref-mukadam2017"/>
+    <w:bookmarkEnd w:id="145"/>
+    <w:bookmarkStart w:id="146" w:name="ref-mukadam2017"/>
     <w:p>
       <w:pPr>
         <w:pStyle w:val="Bibliography"/>
@@ -6145,8 +7541,8 @@
         <w:t xml:space="preserve">(1), 45–54.</w:t>
       </w:r>
     </w:p>
-    <w:bookmarkEnd w:id="145"/>
-    <w:bookmarkStart w:id="146" w:name="ref-nicenboim2024"/>
+    <w:bookmarkEnd w:id="146"/>
+    <w:bookmarkStart w:id="147" w:name="ref-nicenboim2024"/>
     <w:p>
       <w:pPr>
         <w:pStyle w:val="Bibliography"/>
@@ -6168,8 +7564,8 @@
         <w:t xml:space="preserve">.</w:t>
       </w:r>
     </w:p>
-    <w:bookmarkEnd w:id="146"/>
-    <w:bookmarkStart w:id="147" w:name="ref-ossher2013"/>
+    <w:bookmarkEnd w:id="147"/>
+    <w:bookmarkStart w:id="148" w:name="ref-ossher2013"/>
     <w:p>
       <w:pPr>
         <w:pStyle w:val="Bibliography"/>
@@ -6204,8 +7600,8 @@
         <w:t xml:space="preserve">(1), 8–12.</w:t>
       </w:r>
     </w:p>
-    <w:bookmarkEnd w:id="147"/>
-    <w:bookmarkStart w:id="148" w:name="ref-paap2019"/>
+    <w:bookmarkEnd w:id="148"/>
+    <w:bookmarkStart w:id="149" w:name="ref-paap2019"/>
     <w:p>
       <w:pPr>
         <w:pStyle w:val="Bibliography"/>
@@ -6230,8 +7626,8 @@
         <w:t xml:space="preserve">(pp. 701–735).</w:t>
       </w:r>
     </w:p>
-    <w:bookmarkEnd w:id="148"/>
-    <w:bookmarkStart w:id="149" w:name="ref-perani2017"/>
+    <w:bookmarkEnd w:id="149"/>
+    <w:bookmarkStart w:id="150" w:name="ref-perani2017"/>
     <w:p>
       <w:pPr>
         <w:pStyle w:val="Bibliography"/>
@@ -6266,8 +7662,8 @@
         <w:t xml:space="preserve">(7), 1690–1695.</w:t>
       </w:r>
     </w:p>
-    <w:bookmarkEnd w:id="149"/>
-    <w:bookmarkStart w:id="150" w:name="ref-ramakrishnan2017"/>
+    <w:bookmarkEnd w:id="150"/>
+    <w:bookmarkStart w:id="151" w:name="ref-ramakrishnan2017"/>
     <w:p>
       <w:pPr>
         <w:pStyle w:val="Bibliography"/>
@@ -6302,8 +7698,8 @@
         <w:t xml:space="preserve">(3-4), 222–231.</w:t>
       </w:r>
     </w:p>
-    <w:bookmarkEnd w:id="150"/>
-    <w:bookmarkStart w:id="151" w:name="ref-scarmeas2003"/>
+    <w:bookmarkEnd w:id="151"/>
+    <w:bookmarkStart w:id="152" w:name="ref-scarmeas2003"/>
     <w:p>
       <w:pPr>
         <w:pStyle w:val="Bibliography"/>
@@ -6338,8 +7734,8 @@
         <w:t xml:space="preserve">(5), 625–633.</w:t>
       </w:r>
     </w:p>
-    <w:bookmarkEnd w:id="151"/>
-    <w:bookmarkStart w:id="152" w:name="ref-schmid2020"/>
+    <w:bookmarkEnd w:id="152"/>
+    <w:bookmarkStart w:id="153" w:name="ref-schmid2020"/>
     <w:p>
       <w:pPr>
         <w:pStyle w:val="Bibliography"/>
@@ -6364,8 +7760,8 @@
         <w:t xml:space="preserve">(pp. 91–128). Chapman; Hall/CRC.</w:t>
       </w:r>
     </w:p>
-    <w:bookmarkEnd w:id="152"/>
-    <w:bookmarkStart w:id="153" w:name="ref-sedgwick2015"/>
+    <w:bookmarkEnd w:id="153"/>
+    <w:bookmarkStart w:id="154" w:name="ref-sedgwick2015"/>
     <w:p>
       <w:pPr>
         <w:pStyle w:val="Bibliography"/>
@@ -6400,8 +7796,8 @@
         <w:t xml:space="preserve">.</w:t>
       </w:r>
     </w:p>
-    <w:bookmarkEnd w:id="153"/>
-    <w:bookmarkStart w:id="154" w:name="ref-sharp2011"/>
+    <w:bookmarkEnd w:id="154"/>
+    <w:bookmarkStart w:id="155" w:name="ref-sharp2011"/>
     <w:p>
       <w:pPr>
         <w:pStyle w:val="Bibliography"/>
@@ -6436,13 +7832,49 @@
         <w:t xml:space="preserve">(4), 289–304.</w:t>
       </w:r>
     </w:p>
-    <w:bookmarkEnd w:id="154"/>
-    <w:bookmarkStart w:id="155" w:name="ref-sofi2011"/>
+    <w:bookmarkEnd w:id="155"/>
+    <w:bookmarkStart w:id="156" w:name="ref-sims2023"/>
     <w:p>
       <w:pPr>
         <w:pStyle w:val="Bibliography"/>
       </w:pPr>
       <w:r>
+        <w:t xml:space="preserve">Sims, J. R., Zimmer, J. A., Evans, C. D., Lu, M., Ardayfio, P., Sparks, J., Wessels, A. M., Shcherbinin, S., Wang, H., Nery, E. S. M., et al. (2023). Donanemab in early symptomatic alzheimer disease: The TRAILBLAZER-ALZ 2 randomized clinical trial.</w:t>
+      </w:r>
+      <w:r>
+        <w:t xml:space="preserve"> </w:t>
+      </w:r>
+      <w:r>
+        <w:rPr>
+          <w:i/>
+          <w:iCs/>
+        </w:rPr>
+        <w:t xml:space="preserve">Jama</w:t>
+      </w:r>
+      <w:r>
+        <w:t xml:space="preserve">,</w:t>
+      </w:r>
+      <w:r>
+        <w:t xml:space="preserve"> </w:t>
+      </w:r>
+      <w:r>
+        <w:rPr>
+          <w:i/>
+          <w:iCs/>
+        </w:rPr>
+        <w:t xml:space="preserve">330</w:t>
+      </w:r>
+      <w:r>
+        <w:t xml:space="preserve">(6), 512–527.</w:t>
+      </w:r>
+    </w:p>
+    <w:bookmarkEnd w:id="156"/>
+    <w:bookmarkStart w:id="157" w:name="ref-sofi2011"/>
+    <w:p>
+      <w:pPr>
+        <w:pStyle w:val="Bibliography"/>
+      </w:pPr>
+      <w:r>
         <w:t xml:space="preserve">Sofi, F., Valecchi, D., Bacci, D., Abbate, R., Gensini, G. F., Casini, A., &amp; Macchi, C. (2011). Physical activity and risk of cognitive decline: A meta‐analysis of prospective studies.</w:t>
       </w:r>
       <w:r>
@@ -6472,8 +7904,8 @@
         <w:t xml:space="preserve">(1), 107–117.</w:t>
       </w:r>
     </w:p>
-    <w:bookmarkEnd w:id="155"/>
-    <w:bookmarkStart w:id="156" w:name="ref-stern2002"/>
+    <w:bookmarkEnd w:id="157"/>
+    <w:bookmarkStart w:id="158" w:name="ref-stern2002"/>
     <w:p>
       <w:pPr>
         <w:pStyle w:val="Bibliography"/>
@@ -6508,8 +7940,8 @@
         <w:t xml:space="preserve">(3), 448–460.</w:t>
       </w:r>
     </w:p>
-    <w:bookmarkEnd w:id="156"/>
-    <w:bookmarkStart w:id="157" w:name="ref-stern2012"/>
+    <w:bookmarkEnd w:id="158"/>
+    <w:bookmarkStart w:id="159" w:name="ref-stern2012"/>
     <w:p>
       <w:pPr>
         <w:pStyle w:val="Bibliography"/>
@@ -6544,8 +7976,8 @@
         <w:t xml:space="preserve">(11), 1006–1012.</w:t>
       </w:r>
     </w:p>
-    <w:bookmarkEnd w:id="157"/>
-    <w:bookmarkStart w:id="158" w:name="ref-stern1999"/>
+    <w:bookmarkEnd w:id="159"/>
+    <w:bookmarkStart w:id="160" w:name="ref-stern1999"/>
     <w:p>
       <w:pPr>
         <w:pStyle w:val="Bibliography"/>
@@ -6580,8 +8012,8 @@
         <w:t xml:space="preserve">, 1942–1947.</w:t>
       </w:r>
     </w:p>
-    <w:bookmarkEnd w:id="158"/>
-    <w:bookmarkStart w:id="159" w:name="ref-stern2020"/>
+    <w:bookmarkEnd w:id="160"/>
+    <w:bookmarkStart w:id="161" w:name="ref-stern2020"/>
     <w:p>
       <w:pPr>
         <w:pStyle w:val="Bibliography"/>
@@ -6616,8 +8048,8 @@
         <w:t xml:space="preserve">(9), 1305–1311.</w:t>
       </w:r>
     </w:p>
-    <w:bookmarkEnd w:id="159"/>
-    <w:bookmarkStart w:id="160" w:name="ref-thierry2007"/>
+    <w:bookmarkEnd w:id="161"/>
+    <w:bookmarkStart w:id="162" w:name="ref-thierry2007"/>
     <w:p>
       <w:pPr>
         <w:pStyle w:val="Bibliography"/>
@@ -6652,8 +8084,8 @@
         <w:t xml:space="preserve">(30), 12530–12535.</w:t>
       </w:r>
     </w:p>
-    <w:bookmarkEnd w:id="160"/>
-    <w:bookmarkStart w:id="161" w:name="ref-turner2009"/>
+    <w:bookmarkEnd w:id="162"/>
+    <w:bookmarkStart w:id="163" w:name="ref-turner2009"/>
     <w:p>
       <w:pPr>
         <w:pStyle w:val="Bibliography"/>
@@ -6688,13 +8120,49 @@
         <w:t xml:space="preserve">(1), 21–47.</w:t>
       </w:r>
     </w:p>
-    <w:bookmarkEnd w:id="161"/>
-    <w:bookmarkStart w:id="162" w:name="ref-venugopal2024"/>
+    <w:bookmarkEnd w:id="163"/>
+    <w:bookmarkStart w:id="164" w:name="ref-van2023"/>
     <w:p>
       <w:pPr>
         <w:pStyle w:val="Bibliography"/>
       </w:pPr>
       <w:r>
+        <w:t xml:space="preserve">Van Dyck, C. H., Swanson, C. J., Aisen, P., Bateman, R. J., Chen, C., Gee, M., Kanekiyo, M., Li, D., Reyderman, L., Cohen, S., et al. (2023). Lecanemab in early alzheimer’s disease.</w:t>
+      </w:r>
+      <w:r>
+        <w:t xml:space="preserve"> </w:t>
+      </w:r>
+      <w:r>
+        <w:rPr>
+          <w:i/>
+          <w:iCs/>
+        </w:rPr>
+        <w:t xml:space="preserve">New England Journal of Medicine</w:t>
+      </w:r>
+      <w:r>
+        <w:t xml:space="preserve">,</w:t>
+      </w:r>
+      <w:r>
+        <w:t xml:space="preserve"> </w:t>
+      </w:r>
+      <w:r>
+        <w:rPr>
+          <w:i/>
+          <w:iCs/>
+        </w:rPr>
+        <w:t xml:space="preserve">388</w:t>
+      </w:r>
+      <w:r>
+        <w:t xml:space="preserve">(1), 9–21.</w:t>
+      </w:r>
+    </w:p>
+    <w:bookmarkEnd w:id="164"/>
+    <w:bookmarkStart w:id="165" w:name="ref-venugopal2024"/>
+    <w:p>
+      <w:pPr>
+        <w:pStyle w:val="Bibliography"/>
+      </w:pPr>
+      <w:r>
         <w:t xml:space="preserve">Venugopal, A., Paplikar, A., Varghese, F. A., Thanissery, N., Ballal, D., Hoskeri, R. M.,..., &amp; Alladi, S. (2024). Protective effect of bilingualism on aging, MCI, and dementia: A community‐based study.</w:t>
       </w:r>
       <w:r>
@@ -6724,8 +8192,8 @@
         <w:t xml:space="preserve">(4), 2620–2631.</w:t>
       </w:r>
     </w:p>
-    <w:bookmarkEnd w:id="162"/>
-    <w:bookmarkStart w:id="163" w:name="ref-waldie2009"/>
+    <w:bookmarkEnd w:id="165"/>
+    <w:bookmarkStart w:id="166" w:name="ref-waldie2009"/>
     <w:p>
       <w:pPr>
         <w:pStyle w:val="Bibliography"/>
@@ -6760,8 +8228,8 @@
         <w:t xml:space="preserve">, 125–136.</w:t>
       </w:r>
     </w:p>
-    <w:bookmarkEnd w:id="163"/>
-    <w:bookmarkStart w:id="165" w:name="ref-who2020"/>
+    <w:bookmarkEnd w:id="166"/>
+    <w:bookmarkStart w:id="168" w:name="ref-who2020"/>
     <w:p>
       <w:pPr>
         <w:pStyle w:val="Bibliography"/>
@@ -6785,7 +8253,7 @@
       <w:r>
         <w:t xml:space="preserve"> </w:t>
       </w:r>
-      <w:hyperlink r:id="rId164">
+      <w:hyperlink r:id="rId167">
         <w:r>
           <w:rPr>
             <w:rStyle w:val="Hyperlink"/>
@@ -6797,8 +8265,8 @@
         <w:t xml:space="preserve">.</w:t>
       </w:r>
     </w:p>
-    <w:bookmarkEnd w:id="165"/>
-    <w:bookmarkStart w:id="166" w:name="ref-woumans2015"/>
+    <w:bookmarkEnd w:id="168"/>
+    <w:bookmarkStart w:id="169" w:name="ref-woumans2015"/>
     <w:p>
       <w:pPr>
         <w:pStyle w:val="Bibliography"/>
@@ -6833,8 +8301,8 @@
         <w:t xml:space="preserve">(3), 568–574.</w:t>
       </w:r>
     </w:p>
-    <w:bookmarkEnd w:id="166"/>
-    <w:bookmarkStart w:id="167" w:name="ref-woumans2017"/>
+    <w:bookmarkEnd w:id="169"/>
+    <w:bookmarkStart w:id="170" w:name="ref-woumans2017"/>
     <w:p>
       <w:pPr>
         <w:pStyle w:val="Bibliography"/>
@@ -6869,8 +8337,8 @@
         <w:t xml:space="preserve">(4), 1237–1239.</w:t>
       </w:r>
     </w:p>
-    <w:bookmarkEnd w:id="167"/>
-    <w:bookmarkStart w:id="168" w:name="ref-zahodne2014"/>
+    <w:bookmarkEnd w:id="170"/>
+    <w:bookmarkStart w:id="171" w:name="ref-zahodne2014"/>
     <w:p>
       <w:pPr>
         <w:pStyle w:val="Bibliography"/>
@@ -6905,8 +8373,8 @@
         <w:t xml:space="preserve">(2), 238.</w:t>
       </w:r>
     </w:p>
-    <w:bookmarkEnd w:id="168"/>
-    <w:bookmarkStart w:id="169" w:name="ref-zheng2018"/>
+    <w:bookmarkEnd w:id="171"/>
+    <w:bookmarkStart w:id="172" w:name="ref-zheng2018"/>
     <w:p>
       <w:pPr>
         <w:pStyle w:val="Bibliography"/>
@@ -6941,14 +8409,10 @@
         <w:t xml:space="preserve">(3-4), 210–219.</w:t>
       </w:r>
     </w:p>
-    <w:bookmarkEnd w:id="169"/>
-    <w:bookmarkEnd w:id="170"/>
-    <w:bookmarkEnd w:id="171"/>
-    <w:sectPr>
-      <w:footnotePr>
-        <w:numRestart w:val="eachSect"/>
-      </w:footnotePr>
-    </w:sectPr>
+    <w:bookmarkEnd w:id="172"/>
+    <w:bookmarkEnd w:id="173"/>
+    <w:bookmarkEnd w:id="174"/>
+    <w:sectPr/>
   </w:body>
 </w:document>
 </file>
@@ -7120,6 +8584,8 @@
     </w:pPr>
     <w:rPr>
       <w:rFonts w:asciiTheme="majorHAnsi" w:cstheme="majorBidi" w:eastAsiaTheme="majorEastAsia" w:hAnsiTheme="majorHAnsi"/>
+      <w:spacing w:val="-10"/>
+      <w:kern w:val="28"/>
       <w:sz w:val="56"/>
       <w:szCs w:val="56"/>
     </w:rPr>
@@ -7132,13 +8598,15 @@
     <w:rsid w:val="00A10FD9"/>
     <w:rPr>
       <w:rFonts w:asciiTheme="majorHAnsi" w:cstheme="majorBidi" w:eastAsiaTheme="majorEastAsia" w:hAnsiTheme="majorHAnsi"/>
+      <w:spacing w:val="-10"/>
+      <w:kern w:val="28"/>
       <w:sz w:val="56"/>
       <w:szCs w:val="56"/>
     </w:rPr>
   </w:style>
   <w:style w:styleId="Subtitle" w:type="paragraph">
     <w:name w:val="Subtitle"/>
-    <w:basedOn w:val="Title"/>
+    <w:basedOn w:val="Normal"/>
     <w:next w:val="BodyText"/>
     <w:link w:val="SubtitleChar"/>
     <w:uiPriority w:val="11"/>
@@ -7151,6 +8619,7 @@
     </w:pPr>
     <w:rPr>
       <w:rFonts w:cstheme="majorBidi" w:eastAsiaTheme="majorEastAsia"/>
+      <w:color w:themeColor="text1" w:themeTint="A6" w:val="595959"/>
       <w:spacing w:val="15"/>
       <w:sz w:val="28"/>
       <w:szCs w:val="28"/>
@@ -7172,31 +8641,23 @@
   </w:style>
   <w:style w:customStyle="1" w:styleId="Author" w:type="paragraph">
     <w:name w:val="Author"/>
-    <w:basedOn w:val="Title"/>
     <w:next w:val="BodyText"/>
     <w:qFormat/>
     <w:pPr>
       <w:keepNext/>
       <w:keepLines/>
+      <w:jc w:val="center"/>
     </w:pPr>
-    <w:rPr>
-      <w:sz w:val="24"/>
-      <w:szCs w:val="24"/>
-    </w:rPr>
   </w:style>
   <w:style w:styleId="Date" w:type="paragraph">
     <w:name w:val="Date"/>
-    <w:basedOn w:val="Title"/>
     <w:next w:val="BodyText"/>
     <w:qFormat/>
     <w:pPr>
       <w:keepNext/>
       <w:keepLines/>
+      <w:jc w:val="center"/>
     </w:pPr>
-    <w:rPr>
-      <w:sz w:val="24"/>
-      <w:szCs w:val="24"/>
-    </w:rPr>
   </w:style>
   <w:style w:customStyle="1" w:styleId="AbstractTitle" w:type="paragraph">
     <w:name w:val="Abstract Title"/>
@@ -7211,6 +8672,7 @@
     </w:pPr>
     <w:rPr>
       <w:b/>
+      <w:color w:val="345A8A"/>
       <w:sz w:val="20"/>
       <w:szCs w:val="20"/>
     </w:rPr>

</xml_diff>

<commit_message>
fixed the datafile of FTD subgroup, error in the name of a study/deleting the blank sapce, reran the FTD model
</commit_message>
<xml_diff>
--- a/code/Bilingualism_and_Dementia_Meta-analysis.docx
+++ b/code/Bilingualism_and_Dementia_Meta-analysis.docx
@@ -1184,7 +1184,7 @@
         <w:rPr>
           <w:color w:val="FF0000"/>
         </w:rPr>
-        <w:t>Moreover, subgroup analysis revealed a consistent pattern of delayed symptom onset among bilinguals, though the estimated delays differed across dementia types. However, due to the limited number of studies available for each dementia subtype, uncertainty remains regarding whether bilingualism induces differential effects across dementia types. This highlights the need for further research specifically targeting non-Alzheimer’s dementias to better clarify these potential differences.</w:t>
+        <w:t>Moreover, subgroup analyses revealed a relatively consistent pattern of delayed symptom onset among bilinguals, though the estimated delays differed across dementia types. However, due to the limited number of studies available for each dementia subtype, uncertainty remains regarding whether bilingualism induces differential effects across dementia types. This highlights the need for further research specifically targeting non-Alzheimer’s dementias to better clarify these potential differences.</w:t>
       </w:r>
     </w:p>
     <w:bookmarkStart w:id="20" w:name="introduction"/>
@@ -2002,7 +2002,7 @@
         <w:pStyle w:val="BodyText"/>
       </w:pPr>
       <w:r>
-        <w:t xml:space="preserve">To address the first research question, a Bayesian linear regression model will be fitted using the data from 18 retrospective studies to investigate the relation between bilingualism and age at dementia onset. The estimated difference in age at dementia onset between bilinguals and monolinguals will be calculated through the avg_comparison() function</w:t>
+        <w:t xml:space="preserve">To address the first research question, a Bayesian linear regression model will be fitted using the data from 18 retrospective studies to investigate the relation between bilingualism and age at dementia onset. The estimated difference in age at dementia onset between bilinguals and monolinguals will be calculated through the avg_comparisons() function</w:t>
       </w:r>
       <w:r>
         <w:t xml:space="preserve"> </w:t>
@@ -2742,7 +2742,7 @@
         <w:rPr>
           <w:color w:val="FF0000"/>
         </w:rPr>
-        <w:t>language group (bilingual vs. Monolingual)</w:t>
+        <w:t>language group (bilingual vs. monolingual)</w:t>
       </w:r>
       <w:r>
         <w:t xml:space="preserve"> </w:t>
@@ -2766,6 +2766,15 @@
       </w:pPr>
       <w:r>
         <w:t xml:space="preserve">The results showed that at the population level, the estimated age at dementia onset for monolinguals was between 65.04 and 71.55 years at 95% Crl (β = 68.39, Est.Error = 1.64). For bilinguals, the estimated age at dementia onset was between 68.82 and 74.61 years at 95% Crl (β = 71.68, Est.Error = 1.49).</w:t>
+      </w:r>
+      <w:r>
+        <w:t xml:space="preserve"> </w:t>
+      </w:r>
+      <w:r>
+        <w:rPr>
+          <w:color w:val="FF0000"/>
+        </w:rPr>
+        <w:t>Comparing the posterior draws directly, the posterior probability that bilinguals had a later dementia onset than monolinguals was 1.</w:t>
       </w:r>
       <w:r>
         <w:t xml:space="preserve"> </w:t>
@@ -2872,7 +2881,7 @@
         <w:rPr>
           <w:color w:val="FF0000"/>
         </w:rPr>
-        <w:t>It is important to note that the credible interval of population-level average estimate (from avg_comparisons()) is narrower than those observed in the study-specific estimates in the forest plot. This is because the population-level estimate benefits from partial pooling across studies, which reduces uncertainty by borrowing strength from the entire dataset.</w:t>
+        <w:t>It is important to note that the credible interval of predicted average estimate (from avg_comparisons()) is narrower than those observed in the study-specific estimates in the forest plot. This is because the predicted estimate benefits from partial pooling across studies, which reduces uncertainty by borrowing strength from the entire dataset.</w:t>
       </w:r>
     </w:p>
     <w:p>
@@ -2893,6 +2902,61 @@
       </w:r>
       <w:r>
         <w:t xml:space="preserve">. The following section explores the heterogeneity across the studies.</w:t>
+      </w:r>
+    </w:p>
+    <w:p>
+      <w:pPr>
+        <w:pStyle w:val="SourceCode"/>
+      </w:pPr>
+      <w:r>
+        <w:rPr>
+          <w:rStyle w:val="VerbatimChar"/>
+        </w:rPr>
+        <w:t xml:space="preserve">Posterior difference (bilingual - monolingual):</w:t>
+      </w:r>
+    </w:p>
+    <w:p>
+      <w:pPr>
+        <w:pStyle w:val="SourceCode"/>
+      </w:pPr>
+      <w:r>
+        <w:rPr>
+          <w:rStyle w:val="VerbatimChar"/>
+        </w:rPr>
+        <w:t xml:space="preserve">Mean difference: 3.29 </w:t>
+      </w:r>
+    </w:p>
+    <w:p>
+      <w:pPr>
+        <w:pStyle w:val="SourceCode"/>
+      </w:pPr>
+      <w:r>
+        <w:rPr>
+          <w:rStyle w:val="VerbatimChar"/>
+        </w:rPr>
+        <w:t xml:space="preserve">95% Credible Interval: 1.82 to 4.85 </w:t>
+      </w:r>
+    </w:p>
+    <w:p>
+      <w:pPr>
+        <w:pStyle w:val="SourceCode"/>
+      </w:pPr>
+      <w:r>
+        <w:rPr>
+          <w:rStyle w:val="VerbatimChar"/>
+        </w:rPr>
+        <w:t xml:space="preserve">P(bilingual &gt; monolingual): 1 </w:t>
+      </w:r>
+    </w:p>
+    <w:p>
+      <w:pPr>
+        <w:pStyle w:val="SourceCode"/>
+      </w:pPr>
+      <w:r>
+        <w:rPr>
+          <w:rStyle w:val="VerbatimChar"/>
+        </w:rPr>
+        <w:t xml:space="preserve">P(monolingual &gt; bilingual): 0 </w:t>
       </w:r>
     </w:p>
     <w:tbl>
@@ -3067,7 +3131,7 @@
               <a:graphicData uri="http://schemas.openxmlformats.org/drawingml/2006/picture">
                 <pic:pic>
                   <pic:nvPicPr>
-                    <pic:cNvPr descr="Bilingualism_and_Dementia_Meta-analysis_files/figure-docx/unnamed-chunk-7-1.png" id="50" name="Picture"/>
+                    <pic:cNvPr descr="Bilingualism_and_Dementia_Meta-analysis_files/figure-docx/unnamed-chunk-8-1.png" id="50" name="Picture"/>
                     <pic:cNvPicPr>
                       <a:picLocks noChangeArrowheads="1" noChangeAspect="1"/>
                     </pic:cNvPicPr>
@@ -3370,7 +3434,7 @@
         <w:pStyle w:val="BodyText"/>
       </w:pPr>
       <w:r>
-        <w:t xml:space="preserve">A careful investigation into the contexts of each study provided some potential evidence for such heterogeneity. One prominent difference between the first and second groups of studies might be the type of dementia. Among the 6 studies in the second group, three of them involved the FTD variant of dementia, one of them involved MCI patients and the other two involved AD patients. In contrast, seven out of eight studies in the first group and all of the four studies in the third group involved AD patients despite one study having MCI patients. Such differences in the distribution of types of dementia among different groups of studies further called for subgroup analysis of different types of dementia and to investigate whether the type of dementia influences the differences in age at onset of dementia in bilinguals and monolinguals (see 4.3.3).</w:t>
+        <w:t xml:space="preserve">A careful investigation into the contexts of each study provided some potential evidence for such heterogeneity. One prominent difference between the first and second groups of studies might be the type of dementia. Among the 6 studies in the second group, three of them involved the FTD variant of dementia, one of them involved MCI patients and the other two involved AD patients. In contrast, seven out of eight studies in the first group and all of the four studies in the third group involved AD patients despite one study having MCI patients. Such differences in the distribution of types of dementia among different groups of studies further called for subgroup analysis of different types of dementia and to investigate whether the type of dementia influences the differences in age at onset of dementia in bilinguals and monolinguals.</w:t>
       </w:r>
     </w:p>
     <w:bookmarkEnd w:id="55"/>
@@ -3447,7 +3511,19 @@
         <w:pStyle w:val="BodyText"/>
       </w:pPr>
       <w:r>
-        <w:t xml:space="preserve">Additionally, the estimated mean age at dementia onsets for monolinguals and bilinguals was 69.62 years with a 95% Crl [63.16, 77.00] and 73.03 years with a 95% Crl [66.05, 80.53] after including years of education into the model. Using avg_comparisons() again, the mean average difference between the age at dementia onset for bilinguals and monolinguals was 3.65 years with a 95% Crl [2.55, 4.91]. The result was close to the previous model, where education was not included (3.45 years with a 95% Crl [2.8, 4.1]). Therefore, the results from Bayesian linear regression indicated that years of education did not have a strong effect on the effect of bilingualism on age at onset of dementia, although the role of education is uncertain.</w:t>
+        <w:t xml:space="preserve">Additionally, the estimated mean age at dementia onsets for monolinguals and bilinguals was 69.62 years with a 95% Crl [63.16, 77.00] and 73.03 years with a 95% Crl [66.05, 80.53] after including years of education into the model.</w:t>
+      </w:r>
+      <w:r>
+        <w:rPr>
+          <w:color w:val="FF0000"/>
+        </w:rPr>
+        <w:t>The results from comparing posterior draws showed that the probability of bilinguals having delayed dementia onset was still 100%.</w:t>
+      </w:r>
+      <w:r>
+        <w:t xml:space="preserve"> </w:t>
+      </w:r>
+      <w:r>
+        <w:t xml:space="preserve">Using avg_comparisons() again, the mean average difference between the age at dementia onset for bilinguals and monolinguals was 3.65 years with a 95% Crl [2.55, 4.91]. The result was close to the previous model, where education was not included (3.45 years with a 95% Crl [2.8, 4.1]). Therefore, the results from Bayesian linear regression indicated that years of education did not have a strong effect on the effect of bilingualism on age at onset of dementia, although the role of education is uncertain.</w:t>
       </w:r>
     </w:p>
     <w:bookmarkEnd w:id="56"/>
@@ -4649,6 +4725,61 @@
       </w:r>
       <w:r>
         <w:t xml:space="preserve">involved more than one type of dementia. For each subgroup, a Bayesian linear regression model which is similar to the main meta-analysis was employed with the same priors that had been set before.</w:t>
+      </w:r>
+    </w:p>
+    <w:p>
+      <w:pPr>
+        <w:pStyle w:val="SourceCode"/>
+      </w:pPr>
+      <w:r>
+        <w:rPr>
+          <w:rStyle w:val="VerbatimChar"/>
+        </w:rPr>
+        <w:t xml:space="preserve">Posterior difference (bilingual - monolingual):</w:t>
+      </w:r>
+    </w:p>
+    <w:p>
+      <w:pPr>
+        <w:pStyle w:val="SourceCode"/>
+      </w:pPr>
+      <w:r>
+        <w:rPr>
+          <w:rStyle w:val="VerbatimChar"/>
+        </w:rPr>
+        <w:t xml:space="preserve">Mean difference: 3.28 </w:t>
+      </w:r>
+    </w:p>
+    <w:p>
+      <w:pPr>
+        <w:pStyle w:val="SourceCode"/>
+      </w:pPr>
+      <w:r>
+        <w:rPr>
+          <w:rStyle w:val="VerbatimChar"/>
+        </w:rPr>
+        <w:t xml:space="preserve">95% Credible Interval: 1.33 to 5.45 </w:t>
+      </w:r>
+    </w:p>
+    <w:p>
+      <w:pPr>
+        <w:pStyle w:val="SourceCode"/>
+      </w:pPr>
+      <w:r>
+        <w:rPr>
+          <w:rStyle w:val="VerbatimChar"/>
+        </w:rPr>
+        <w:t xml:space="preserve">P(bilingual &gt; monolingual): 0.998 </w:t>
+      </w:r>
+    </w:p>
+    <w:p>
+      <w:pPr>
+        <w:pStyle w:val="SourceCode"/>
+      </w:pPr>
+      <w:r>
+        <w:rPr>
+          <w:rStyle w:val="VerbatimChar"/>
+        </w:rPr>
+        <w:t xml:space="preserve">P(monolingual &gt; bilingual): 0.002 </w:t>
       </w:r>
     </w:p>
     <w:tbl>
@@ -4752,7 +4883,7 @@
         <w:t xml:space="preserve"> </w:t>
       </w:r>
       <w:r>
-        <w:t xml:space="preserve">for the forest plot), the results showed that at the population-level, monolinguals had an age at AD onset at 70.39 years with a 95%Crl [66.90, 73.33] while the age at AD onset for bilinguals was 73.68 with a 95%Crl [70.59, 76.69]. The mean average difference between the age at AD onset for bilinguals and monolinguals was 3.36 with a 95%Crl [2.61, 4.15]. Compared with the main meta-analytic results, the estimated age at AD onset was higher for both monolingual and bilingual populations. Yet, the difference between bilinguals’ and monolinguals’ age at onset (3.36-year) was smaller although very close to the main effect (3.45-year). Moreover, the level of heterogeneity decreased moderately compared with the mean meta-analytic results since the group-level estimated effects for</w:t>
+        <w:t xml:space="preserve">for the forest plot), the results showed that at the population-level, monolinguals had an age at AD onset at 70.39 years with a 95%Crl [66.90, 73.33] while the age at AD onset for bilinguals was 73.68 with a 95%Crl [70.59, 76.69].</w:t>
       </w:r>
       <w:r>
         <w:t xml:space="preserve"> </w:t>
@@ -4761,6 +4892,21 @@
         <w:rPr>
           <w:color w:val="FF0000"/>
         </w:rPr>
+        <w:t>Comparing the posterior draws directly, the posterior probability that bilinguals had a later dementia onset than monolinguals was 98.8%.</w:t>
+      </w:r>
+      <w:r>
+        <w:t xml:space="preserve"> </w:t>
+      </w:r>
+      <w:r>
+        <w:t xml:space="preserve">The mean average difference between the age at AD onset for bilinguals and monolinguals was 3.36 with a 95%Crl [2.61, 4.15]. Compared with the main meta-analytic results, the estimated age at AD onset was higher for both monolingual and bilingual populations. Yet, the difference between bilinguals’ and monolinguals’ age at onset (3.36-year) was smaller although very close to the main effect (3.45-year). Moreover, the level of heterogeneity decreased moderately compared with the mean meta-analytic results since the group-level estimated effects for</w:t>
+      </w:r>
+      <w:r>
+        <w:t xml:space="preserve"> </w:t>
+      </w:r>
+      <w:r>
+        <w:rPr>
+          <w:color w:val="FF0000"/>
+        </w:rPr>
         <w:t>monolingual group and bilingual group</w:t>
       </w:r>
       <w:r>
@@ -4768,6 +4914,61 @@
       </w:r>
       <w:r>
         <w:t xml:space="preserve">were 6.09 and 5.57.</w:t>
+      </w:r>
+    </w:p>
+    <w:p>
+      <w:pPr>
+        <w:pStyle w:val="SourceCode"/>
+      </w:pPr>
+      <w:r>
+        <w:rPr>
+          <w:rStyle w:val="VerbatimChar"/>
+        </w:rPr>
+        <w:t xml:space="preserve">Posterior difference in Model 4 (bilingual - monolingual):</w:t>
+      </w:r>
+    </w:p>
+    <w:p>
+      <w:pPr>
+        <w:pStyle w:val="SourceCode"/>
+      </w:pPr>
+      <w:r>
+        <w:rPr>
+          <w:rStyle w:val="VerbatimChar"/>
+        </w:rPr>
+        <w:t xml:space="preserve">Mean difference: 3.56 </w:t>
+      </w:r>
+    </w:p>
+    <w:p>
+      <w:pPr>
+        <w:pStyle w:val="SourceCode"/>
+      </w:pPr>
+      <w:r>
+        <w:rPr>
+          <w:rStyle w:val="VerbatimChar"/>
+        </w:rPr>
+        <w:t xml:space="preserve">95% Credible Interval: -1.22 to 9.1 </w:t>
+      </w:r>
+    </w:p>
+    <w:p>
+      <w:pPr>
+        <w:pStyle w:val="SourceCode"/>
+      </w:pPr>
+      <w:r>
+        <w:rPr>
+          <w:rStyle w:val="VerbatimChar"/>
+        </w:rPr>
+        <w:t xml:space="preserve">P(bilingual &gt; monolingual): 0.945 </w:t>
+      </w:r>
+    </w:p>
+    <w:p>
+      <w:pPr>
+        <w:pStyle w:val="SourceCode"/>
+      </w:pPr>
+      <w:r>
+        <w:rPr>
+          <w:rStyle w:val="VerbatimChar"/>
+        </w:rPr>
+        <w:t xml:space="preserve">P(monolingual &gt; bilingual): 0.056 </w:t>
       </w:r>
     </w:p>
     <w:tbl>
@@ -4851,51 +5052,7 @@
     </w:tbl>
     <w:p>
       <w:pPr>
-        <w:pStyle w:val="SourceCode"/>
-      </w:pPr>
-      <w:r>
-        <w:br/>
-      </w:r>
-      <w:r>
-        <w:rPr>
-          <w:rStyle w:val="VerbatimChar"/>
-        </w:rPr>
-        <w:t xml:space="preserve"> Term                            Contrast Estimate 2.5 % 97.5 %</w:t>
-      </w:r>
-      <w:r>
-        <w:br/>
-      </w:r>
-      <w:r>
-        <w:rPr>
-          <w:rStyle w:val="VerbatimChar"/>
-        </w:rPr>
-        <w:t xml:space="preserve"> mobi mean(bilingual) - mean(monolingual)     3.76  1.46   6.26</w:t>
-      </w:r>
-      <w:r>
-        <w:br/>
-      </w:r>
-      <w:r>
-        <w:br/>
-      </w:r>
-      <w:r>
-        <w:rPr>
-          <w:rStyle w:val="VerbatimChar"/>
-        </w:rPr>
-        <w:t xml:space="preserve">Columns: term, contrast, estimate, conf.low, conf.high, predicted_lo, predicted_hi, predicted, tmp_idx </w:t>
-      </w:r>
-      <w:r>
-        <w:br/>
-      </w:r>
-      <w:r>
-        <w:rPr>
-          <w:rStyle w:val="VerbatimChar"/>
-        </w:rPr>
-        <w:t xml:space="preserve">Type:  response </w:t>
-      </w:r>
-    </w:p>
-    <w:p>
-      <w:pPr>
-        <w:pStyle w:val="FirstParagraph"/>
+        <w:pStyle w:val="BodyText"/>
       </w:pPr>
       <w:r>
         <w:t xml:space="preserve">For FTD dementia subgroup (see</w:t>
@@ -4915,7 +5072,7 @@
         <w:t xml:space="preserve"> </w:t>
       </w:r>
       <w:r>
-        <w:t xml:space="preserve">for the forest plot), the estimated age at FTD onsets for monolinguals and bilinguals were 58.02 with a 95%Crl [52.95, 62.84] and 61.44 with a 95%Crl [57.01, 64.35], which were largely lower than the main meta-analytic effect and AD subgroup’s onset.Using avg_comparisons() again, the average difference in marginal effects for bilinguals and monolinguals was 3.76 with a 95%Crl [1.46, 6.26]. This showed that bilinguals are estimated to be 3.76 years older than monolinguals on average when having the first symptom onset for FTD type of dementia. The heterogeneity level was even lower in this group as since the group-level estimated effects for</w:t>
+        <w:t xml:space="preserve">for the forest plot),</w:t>
       </w:r>
       <w:r>
         <w:t xml:space="preserve"> </w:t>
@@ -4924,13 +5081,80 @@
         <w:rPr>
           <w:color w:val="FF0000"/>
         </w:rPr>
-        <w:t>monolingual group and bilingual group</w:t>
-      </w:r>
-      <w:r>
-        <w:t xml:space="preserve"> </w:t>
-      </w:r>
-      <w:r>
-        <w:t xml:space="preserve">were 2.92 and 1.61. Yet, the relatively low number of studies might have contributed to the low heterogeneity and the wide 95%Crl of the estimated difference between bilinguals and monolinguals at the population level.</w:t>
+        <w:t>the estimated age at FTD onsets for monolinguals and bilinguals were 57.96 with a 95%Crl [53.16, 62.10] and 61.52 with a 95%Crl [59.05, 63.73], which were largely lower than the main meta-analytic effect and AD subgroup’s onset.The comparison of the posterior draws showed that the probability that bilinguals had a later dementia onset than monolinguals was 94.5%. Using avg_comparisons() again, the average difference in marginal effects for bilinguals and monolinguals was 3.63 with a 95%Crl [1.92, 5.26]. This showed that bilinguals are estimated to be 3.63 years older than monolinguals on average when having the first symptom onset for FTD type of dementia.</w:t>
+      </w:r>
+      <w:r>
+        <w:t xml:space="preserve"> </w:t>
+      </w:r>
+      <w:r>
+        <w:t xml:space="preserve">The heterogeneity level was even lower in this group as since the group-level estimated effects for</w:t>
+      </w:r>
+      <w:r>
+        <w:t xml:space="preserve"> </w:t>
+      </w:r>
+      <w:r>
+        <w:rPr>
+          <w:color w:val="FF0000"/>
+        </w:rPr>
+        <w:t>monolingual group and bilingual group were 2.85 and 1.39</w:t>
+      </w:r>
+      <w:r>
+        <w:t xml:space="preserve">. Yet, the relatively low number of studies might have contributed to the low heterogeneity and the wide 95%Crl of the estimated difference between bilinguals and monolinguals at the population level.</w:t>
+      </w:r>
+    </w:p>
+    <w:p>
+      <w:pPr>
+        <w:pStyle w:val="SourceCode"/>
+      </w:pPr>
+      <w:r>
+        <w:rPr>
+          <w:rStyle w:val="VerbatimChar"/>
+        </w:rPr>
+        <w:t xml:space="preserve">Posterior difference (bilingual - monolingual):</w:t>
+      </w:r>
+    </w:p>
+    <w:p>
+      <w:pPr>
+        <w:pStyle w:val="SourceCode"/>
+      </w:pPr>
+      <w:r>
+        <w:rPr>
+          <w:rStyle w:val="VerbatimChar"/>
+        </w:rPr>
+        <w:t xml:space="preserve">Mean difference: 3.54 </w:t>
+      </w:r>
+    </w:p>
+    <w:p>
+      <w:pPr>
+        <w:pStyle w:val="SourceCode"/>
+      </w:pPr>
+      <w:r>
+        <w:rPr>
+          <w:rStyle w:val="VerbatimChar"/>
+        </w:rPr>
+        <w:t xml:space="preserve">95% Credible Interval: -11.02 to 18.59 </w:t>
+      </w:r>
+    </w:p>
+    <w:p>
+      <w:pPr>
+        <w:pStyle w:val="SourceCode"/>
+      </w:pPr>
+      <w:r>
+        <w:rPr>
+          <w:rStyle w:val="VerbatimChar"/>
+        </w:rPr>
+        <w:t xml:space="preserve">P(bilingual &gt; monolingual): 0.73 </w:t>
+      </w:r>
+    </w:p>
+    <w:p>
+      <w:pPr>
+        <w:pStyle w:val="SourceCode"/>
+      </w:pPr>
+      <w:r>
+        <w:rPr>
+          <w:rStyle w:val="VerbatimChar"/>
+        </w:rPr>
+        <w:t xml:space="preserve">P(monolingual &gt; bilingual): 0.27 </w:t>
       </w:r>
     </w:p>
     <w:tbl>
@@ -5043,7 +5267,19 @@
         <w:t xml:space="preserve">(Frank &amp; Petersen, 2008)</w:t>
       </w:r>
       <w:r>
-        <w:t xml:space="preserve">. However, the estimated average difference in marginal effects for bilinguals and monolinguals was 2.88 years with a 95%Crl [0.914, 4.84]. This difference between the age at onset of bilinguals and monolinguals was the smallest in the three subgroups. Additionally, the standard deviation for</w:t>
+        <w:t xml:space="preserve">. However,</w:t>
+      </w:r>
+      <w:r>
+        <w:t xml:space="preserve"> </w:t>
+      </w:r>
+      <w:r>
+        <w:rPr>
+          <w:color w:val="FF0000"/>
+        </w:rPr>
+        <w:t>comparing the posterior draws, 73% of the posterior samples favoured a bilingual delayed onset for MCI. The probability is lower than AD (99.8%) and FTD (94.5%)</w:t>
+      </w:r>
+      <w:r>
+        <w:t xml:space="preserve">. The average difference in marginal effects estimated through avg_comparisons() for bilinguals and monolinguals was 2.88 years with a 95%Crl [0.914, 4.84]. This difference between the age at onset of bilinguals and monolinguals was the smallest in the three subgroups. Additionally, the standard deviation for</w:t>
       </w:r>
       <w:r>
         <w:t xml:space="preserve"> </w:t>
@@ -5375,9 +5611,53 @@
         <w:pStyle w:val="SourceCode"/>
       </w:pPr>
       <w:r>
+        <w:br/>
+      </w:r>
+      <w:r>
         <w:rPr>
           <w:rStyle w:val="VerbatimChar"/>
         </w:rPr>
+        <w:t xml:space="preserve">   Term                            Contrast Estimate 2.5 % 97.5 %</w:t>
+      </w:r>
+      <w:r>
+        <w:br/>
+      </w:r>
+      <w:r>
+        <w:rPr>
+          <w:rStyle w:val="VerbatimChar"/>
+        </w:rPr>
+        <w:t xml:space="preserve"> mobi_2 mean(bilingual) / mean(monolingual)    0.844 0.725  0.984</w:t>
+      </w:r>
+      <w:r>
+        <w:br/>
+      </w:r>
+      <w:r>
+        <w:br/>
+      </w:r>
+      <w:r>
+        <w:rPr>
+          <w:rStyle w:val="VerbatimChar"/>
+        </w:rPr>
+        <w:t xml:space="preserve">Columns: term, contrast, estimate, conf.low, conf.high, predicted_lo, predicted_hi, predicted, tmp_idx </w:t>
+      </w:r>
+      <w:r>
+        <w:br/>
+      </w:r>
+      <w:r>
+        <w:rPr>
+          <w:rStyle w:val="VerbatimChar"/>
+        </w:rPr>
+        <w:t xml:space="preserve">Type:  response </w:t>
+      </w:r>
+    </w:p>
+    <w:p>
+      <w:pPr>
+        <w:pStyle w:val="SourceCode"/>
+      </w:pPr>
+      <w:r>
+        <w:rPr>
+          <w:rStyle w:val="VerbatimChar"/>
+        </w:rPr>
         <w:t xml:space="preserve"># A tibble: 1 × 5</w:t>
       </w:r>
       <w:r>
@@ -5440,7 +5720,22 @@
         <w:t>The results from the comparison of posterior distribution for the log-odds of bilinguals and monolinguals showed that 77% of the posterior samples indicated lower odds of dementia for bilinguals</w:t>
       </w:r>
       <w:r>
-        <w:t xml:space="preserve">. We also used avg_comparison() to show the ratio of the average predicted probability of dementia for bilinguals to the average predicted probability of dementia for monolinguals, which resulted in a 0.845 estimate with a 95%Crl [0.726, 0.984]. This indicated that the average predicted probability of dementia for bilingual individuals was from 72.6% to 98.4% of the average predicted probability of dementia for monolinguals. In other words, the meta-analytic effect was likely to fall between 1.6% and 27.4% lower incidence for bilinguals compared with monolinguals based on the included 6 studies. This is a small to moderate effect for bilingualism (see</w:t>
+        <w:t xml:space="preserve">. We also used avg_comparisons() to show the ratio of the average predicted probability of dementia for bilinguals to the average predicted probability of dementia for monolinguals, which resulted in a 0.844 estimate with a 95%Crl [0.725, 0.984].</w:t>
+      </w:r>
+      <w:r>
+        <w:t xml:space="preserve"> </w:t>
+      </w:r>
+      <w:r>
+        <w:rPr>
+          <w:color w:val="FF0000"/>
+        </w:rPr>
+        <w:t>For the ratio, a result between 0 and 1 indicates lower incidence rates of bilinguals while a result over 1 indicates higher incidence rates of bilinguals.</w:t>
+      </w:r>
+      <w:r>
+        <w:t xml:space="preserve"> </w:t>
+      </w:r>
+      <w:r>
+        <w:t xml:space="preserve">This indicated that the average predicted probability of dementia for bilingual individuals was from 72.6% to 98.4% of the average predicted probability of dementia for monolinguals. In other words, the meta-analytic effect was likely to fall between 1.6% and 27.4% lower incidence for bilinguals compared with monolinguals based on the included 6 studies. This is a small to moderate effect for bilingualism (see</w:t>
       </w:r>
       <w:r>
         <w:t xml:space="preserve"> </w:t>
@@ -5527,6 +5822,18 @@
         <w:t xml:space="preserve">Venugopal et al. (2024)</w:t>
       </w:r>
       <w:r>
+        <w:t xml:space="preserve">.</w:t>
+      </w:r>
+      <w:r>
+        <w:t xml:space="preserve"> </w:t>
+      </w:r>
+      <w:r>
+        <w:rPr>
+          <w:color w:val="FF0000"/>
+        </w:rPr>
+        <w:t>Comparing the posterior distribution of this model, the results showed that the probability that bilinguals had lower incidence rates than monolinguals was only 64%</w:t>
+      </w:r>
+      <w:r>
         <w:t xml:space="preserve">. The results of</w:t>
       </w:r>
       <w:r>
@@ -5536,63 +5843,13 @@
         <w:rPr>
           <w:color w:val="FF0000"/>
         </w:rPr>
-        <w:t>avg_comparison()</w:t>
-      </w:r>
-      <w:r>
-        <w:t xml:space="preserve"> </w:t>
-      </w:r>
-      <w:r>
-        <w:t xml:space="preserve">showed that the average incidence rates for bilinguals is about 86.6% of the incidence rate of monolinguals with a 95% Crl [0.634, 1.5]. This means that we are relatively uncertain about whether bilinguals have a lower incidence rate than monolinguals at the population-level, since the 95% credible interval cross 1.</w:t>
-      </w:r>
-      <w:r>
-        <w:t xml:space="preserve"> </w:t>
-      </w:r>
-      <w:r>
-        <w:rPr>
-          <w:color w:val="FF0000"/>
-        </w:rPr>
-        <w:t>We also compared the posterior distribution of this model. The results showed that the probability that bilinguals had lower incidence rates than monolinguals was only 64%, which also indicates considerable uncertainty</w:t>
-      </w:r>
-      <w:r>
-        <w:t xml:space="preserve">.</w:t>
-      </w:r>
-    </w:p>
-    <w:p>
-      <w:pPr>
-        <w:pStyle w:val="SourceCode"/>
-      </w:pPr>
-      <w:r>
-        <w:rPr>
-          <w:rStyle w:val="VerbatimChar"/>
-        </w:rPr>
-        <w:t xml:space="preserve"># A tibble: 1 × 5</w:t>
-      </w:r>
-      <w:r>
-        <w:br/>
-      </w:r>
-      <w:r>
-        <w:rPr>
-          <w:rStyle w:val="VerbatimChar"/>
-        </w:rPr>
-        <w:t xml:space="preserve">  mean_diff lower_95 upper_95 prob_bilingual_less prob_bilingual_greater</w:t>
-      </w:r>
-      <w:r>
-        <w:br/>
-      </w:r>
-      <w:r>
-        <w:rPr>
-          <w:rStyle w:val="VerbatimChar"/>
-        </w:rPr>
-        <w:t xml:space="preserve">      &lt;dbl&gt;    &lt;dbl&gt;    &lt;dbl&gt;               &lt;dbl&gt;                  &lt;dbl&gt;</w:t>
-      </w:r>
-      <w:r>
-        <w:br/>
-      </w:r>
-      <w:r>
-        <w:rPr>
-          <w:rStyle w:val="VerbatimChar"/>
-        </w:rPr>
-        <w:t xml:space="preserve">1    -0.207    -1.68     1.03               0.643                  0.357</w:t>
+        <w:t>avg_comparisons()</w:t>
+      </w:r>
+      <w:r>
+        <w:t xml:space="preserve"> </w:t>
+      </w:r>
+      <w:r>
+        <w:t xml:space="preserve">showed that the average incidence rates for bilinguals is about 86.6% of the incidence rate of monolinguals with a 95% Crl [0.634, 1.5]. This means that we are relatively uncertain about whether bilinguals have a lower incidence rate than monolinguals at the population-level, since the 95% credible interval spans a wide range of values both below and above 1, which indicates considerable uncertainty.</w:t>
       </w:r>
     </w:p>
     <w:bookmarkEnd w:id="80"/>
@@ -5753,7 +6010,22 @@
         <w:t xml:space="preserve"> </w:t>
       </w:r>
       <w:r>
-        <w:t xml:space="preserve">is a community-based study with 1234 participants from Bengaluru, India. Instead of following the participants for years to collect the incidence rate in a period, they simply counted the number of participants, who developed dementia at the time when the study was conducted. Their results showed that 46 out of 803 bilinguals and 58 out of 431 monolinguals had dementia or MCI. Yet, such results may not be enough to support bilingualism’s effect on preventing the disease. One explanation could be that bilinguals have a delayed onset of dementia, some bilinguals in</w:t>
+        <w:t xml:space="preserve">is a community-based study with 1234 participants from Bengaluru, India. Instead of following the participants for years to collect the incidence rate in a period, they simply counted the number of participants, who developed dementia at the time when the study was conducted. Their results showed that 46 out of 803 bilinguals and 58 out of 431 monolinguals had dementia or MCI. Yet, such results may not be</w:t>
+      </w:r>
+      <w:r>
+        <w:t xml:space="preserve"> </w:t>
+      </w:r>
+      <w:r>
+        <w:rPr>
+          <w:color w:val="FF0000"/>
+        </w:rPr>
+        <w:t>robust</w:t>
+      </w:r>
+      <w:r>
+        <w:t xml:space="preserve"> </w:t>
+      </w:r>
+      <w:r>
+        <w:t xml:space="preserve">to support bilingualism’s effect on preventing the disease. One explanation could be that bilinguals have a delayed onset of dementia, some bilinguals in</w:t>
       </w:r>
       <w:r>
         <w:t xml:space="preserve"> </w:t>
@@ -5783,7 +6055,7 @@
         <w:t xml:space="preserve">Venugopal et al. (2024)</w:t>
       </w:r>
       <w:r>
-        <w:t xml:space="preserve">, which provides no evidence for bilingualism’s preventive effect on dementia. This result (incidence rate: bilinguals/monolinguals 95%Crl [0.634, 1.5]) corresponds to</w:t>
+        <w:t xml:space="preserve">, providing no robust evidence for bilingualism’s preventive effect on dementia. This result (incidence rate: bilinguals/monolinguals 95%Crl [0.634, 1.5]) corresponds to</w:t>
       </w:r>
       <w:r>
         <w:t xml:space="preserve"> </w:t>
@@ -5847,7 +6119,7 @@
         <w:rPr>
           <w:color w:val="FF0000"/>
         </w:rPr>
-        <w:t>Though Uncertainity Remains</w:t>
+        <w:t>though Uncertainity Remains</w:t>
       </w:r>
     </w:p>
     <w:p>
@@ -5864,7 +6136,7 @@
         <w:t xml:space="preserve">(Alladi et al., 2013; Lee, 2022)</w:t>
       </w:r>
       <w:r>
-        <w:t xml:space="preserve">. The results from the subgroup analysis in this meta-analysis provide evidence for such arguments. The difference between bilinguals and monolinguals was the largest on FTD subtype (3.76 years on average) following the AD subtype (3.36 years on average) and MCI (2.88 years on average).</w:t>
+        <w:t xml:space="preserve">. The results from the subgroup analysis in this meta-analysis provide evidence for such arguments. The difference between bilinguals and monolinguals was the largest on FTD subtype (3.63 years on average) following the AD subtype (3.36 years on average) and MCI (2.88 years on average).</w:t>
       </w:r>
       <w:r>
         <w:t xml:space="preserve"> </w:t>
@@ -6013,7 +6285,7 @@
         <w:rPr>
           <w:color w:val="FF0000"/>
         </w:rPr>
-        <w:t>From the neurological mechanism perspective, bilingualism stands out for its ubiquitousness across the lifespan, independent of contextual need or consciousness. It contributes to neuroplastic change in multiple brain regions that are strongly implicated brain aging. The overlap between bilingual language control network and the fronto-parietal network for domain-general control helps bilingual to constantly maintain higher functional and neurostructural integrity during aging</w:t>
+        <w:t>From the neurological mechanism perspective, bilingualism stands out for its ubiquitousness across the lifespan, independent of contextual need or consciousness. It contributes to neuroplastic change in multiple brain regions that are strongly implicated brain aging. The overlap between bilingual language control network and the frontoparietal network for domain-general control helps bilingual to constantly maintain higher functional and neurostructural integrity during aging</w:t>
       </w:r>
       <w:r>
         <w:t xml:space="preserve"> </w:t>

</xml_diff>

<commit_message>
correct statement about avg_comparisons()
</commit_message>
<xml_diff>
--- a/code/Bilingualism_and_Dementia_Meta-analysis.docx
+++ b/code/Bilingualism_and_Dementia_Meta-analysis.docx
@@ -7,55 +7,7 @@
         <w:pStyle w:val="Title"/>
       </w:pPr>
       <w:r>
-        <w:t xml:space="preserve">Bilingualism</w:t>
-      </w:r>
-      <w:r>
-        <w:t xml:space="preserve"> </w:t>
-      </w:r>
-      <w:r>
-        <w:t xml:space="preserve">Effect</w:t>
-      </w:r>
-      <w:r>
-        <w:t xml:space="preserve"> </w:t>
-      </w:r>
-      <w:r>
-        <w:t xml:space="preserve">for</w:t>
-      </w:r>
-      <w:r>
-        <w:t xml:space="preserve"> </w:t>
-      </w:r>
-      <w:r>
-        <w:t xml:space="preserve">Delaying</w:t>
-      </w:r>
-      <w:r>
-        <w:t xml:space="preserve"> </w:t>
-      </w:r>
-      <w:r>
-        <w:t xml:space="preserve">Dementia</w:t>
-      </w:r>
-      <w:r>
-        <w:t xml:space="preserve"> </w:t>
-      </w:r>
-      <w:r>
-        <w:t xml:space="preserve">Onset:</w:t>
-      </w:r>
-      <w:r>
-        <w:t xml:space="preserve"> </w:t>
-      </w:r>
-      <w:r>
-        <w:t xml:space="preserve">A</w:t>
-      </w:r>
-      <w:r>
-        <w:t xml:space="preserve"> </w:t>
-      </w:r>
-      <w:r>
-        <w:t xml:space="preserve">Bayesian</w:t>
-      </w:r>
-      <w:r>
-        <w:t xml:space="preserve"> </w:t>
-      </w:r>
-      <w:r>
-        <w:t xml:space="preserve">Meta-Analysis</w:t>
+        <w:t xml:space="preserve">Bilingualism Effect for Delaying Dementia Onset: A Bayesian Meta-Analysis</w:t>
       </w:r>
     </w:p>
     <w:p>
@@ -63,13 +15,7 @@
         <w:pStyle w:val="Author"/>
       </w:pPr>
       <w:r>
-        <w:t xml:space="preserve">Ziyuan</w:t>
-      </w:r>
-      <w:r>
-        <w:t xml:space="preserve"> </w:t>
-      </w:r>
-      <w:r>
-        <w:t xml:space="preserve">Li</w:t>
+        <w:t xml:space="preserve">Ziyuan Li</w:t>
       </w:r>
     </w:p>
     <w:p>
@@ -77,13 +23,7 @@
         <w:pStyle w:val="Author"/>
       </w:pPr>
       <w:r>
-        <w:t xml:space="preserve">Stefano</w:t>
-      </w:r>
-      <w:r>
-        <w:t xml:space="preserve"> </w:t>
-      </w:r>
-      <w:r>
-        <w:t xml:space="preserve">Coretta</w:t>
+        <w:t xml:space="preserve">Stefano Coretta</w:t>
       </w:r>
     </w:p>
     <w:p>
@@ -107,1075 +47,7 @@
         <w:pStyle w:val="Abstract"/>
       </w:pPr>
       <w:r>
-        <w:t xml:space="preserve">Evidence</w:t>
-      </w:r>
-      <w:r>
-        <w:t xml:space="preserve"> </w:t>
-      </w:r>
-      <w:r>
-        <w:t xml:space="preserve">suggests</w:t>
-      </w:r>
-      <w:r>
-        <w:t xml:space="preserve"> </w:t>
-      </w:r>
-      <w:r>
-        <w:t xml:space="preserve">that</w:t>
-      </w:r>
-      <w:r>
-        <w:t xml:space="preserve"> </w:t>
-      </w:r>
-      <w:r>
-        <w:t xml:space="preserve">lifelong</w:t>
-      </w:r>
-      <w:r>
-        <w:t xml:space="preserve"> </w:t>
-      </w:r>
-      <w:r>
-        <w:t xml:space="preserve">practice</w:t>
-      </w:r>
-      <w:r>
-        <w:t xml:space="preserve"> </w:t>
-      </w:r>
-      <w:r>
-        <w:t xml:space="preserve">of</w:t>
-      </w:r>
-      <w:r>
-        <w:t xml:space="preserve"> </w:t>
-      </w:r>
-      <w:r>
-        <w:t xml:space="preserve">two</w:t>
-      </w:r>
-      <w:r>
-        <w:t xml:space="preserve"> </w:t>
-      </w:r>
-      <w:r>
-        <w:t xml:space="preserve">or</w:t>
-      </w:r>
-      <w:r>
-        <w:t xml:space="preserve"> </w:t>
-      </w:r>
-      <w:r>
-        <w:t xml:space="preserve">more</w:t>
-      </w:r>
-      <w:r>
-        <w:t xml:space="preserve"> </w:t>
-      </w:r>
-      <w:r>
-        <w:t xml:space="preserve">languages</w:t>
-      </w:r>
-      <w:r>
-        <w:t xml:space="preserve"> </w:t>
-      </w:r>
-      <w:r>
-        <w:t xml:space="preserve">may</w:t>
-      </w:r>
-      <w:r>
-        <w:t xml:space="preserve"> </w:t>
-      </w:r>
-      <w:r>
-        <w:t xml:space="preserve">contribute</w:t>
-      </w:r>
-      <w:r>
-        <w:t xml:space="preserve"> </w:t>
-      </w:r>
-      <w:r>
-        <w:t xml:space="preserve">to</w:t>
-      </w:r>
-      <w:r>
-        <w:t xml:space="preserve"> </w:t>
-      </w:r>
-      <w:r>
-        <w:t xml:space="preserve">cognitive</w:t>
-      </w:r>
-      <w:r>
-        <w:t xml:space="preserve"> </w:t>
-      </w:r>
-      <w:r>
-        <w:t xml:space="preserve">reserve</w:t>
-      </w:r>
-      <w:r>
-        <w:t xml:space="preserve"> </w:t>
-      </w:r>
-      <w:r>
-        <w:t xml:space="preserve">and</w:t>
-      </w:r>
-      <w:r>
-        <w:t xml:space="preserve"> </w:t>
-      </w:r>
-      <w:r>
-        <w:t xml:space="preserve">protect</w:t>
-      </w:r>
-      <w:r>
-        <w:t xml:space="preserve"> </w:t>
-      </w:r>
-      <w:r>
-        <w:t xml:space="preserve">against</w:t>
-      </w:r>
-      <w:r>
-        <w:t xml:space="preserve"> </w:t>
-      </w:r>
-      <w:r>
-        <w:t xml:space="preserve">dementia.</w:t>
-      </w:r>
-      <w:r>
-        <w:t xml:space="preserve"> </w:t>
-      </w:r>
-      <w:r>
-        <w:t xml:space="preserve">Most</w:t>
-      </w:r>
-      <w:r>
-        <w:t xml:space="preserve"> </w:t>
-      </w:r>
-      <w:r>
-        <w:t xml:space="preserve">retrospective</w:t>
-      </w:r>
-      <w:r>
-        <w:t xml:space="preserve"> </w:t>
-      </w:r>
-      <w:r>
-        <w:t xml:space="preserve">studies</w:t>
-      </w:r>
-      <w:r>
-        <w:t xml:space="preserve"> </w:t>
-      </w:r>
-      <w:r>
-        <w:t xml:space="preserve">comparing</w:t>
-      </w:r>
-      <w:r>
-        <w:t xml:space="preserve"> </w:t>
-      </w:r>
-      <w:r>
-        <w:t xml:space="preserve">bilinguals’</w:t>
-      </w:r>
-      <w:r>
-        <w:t xml:space="preserve"> </w:t>
-      </w:r>
-      <w:r>
-        <w:t xml:space="preserve">and</w:t>
-      </w:r>
-      <w:r>
-        <w:t xml:space="preserve"> </w:t>
-      </w:r>
-      <w:r>
-        <w:t xml:space="preserve">monolinguals’</w:t>
-      </w:r>
-      <w:r>
-        <w:t xml:space="preserve"> </w:t>
-      </w:r>
-      <w:r>
-        <w:t xml:space="preserve">age</w:t>
-      </w:r>
-      <w:r>
-        <w:t xml:space="preserve"> </w:t>
-      </w:r>
-      <w:r>
-        <w:t xml:space="preserve">at</w:t>
-      </w:r>
-      <w:r>
-        <w:t xml:space="preserve"> </w:t>
-      </w:r>
-      <w:r>
-        <w:t xml:space="preserve">dementia</w:t>
-      </w:r>
-      <w:r>
-        <w:t xml:space="preserve"> </w:t>
-      </w:r>
-      <w:r>
-        <w:t xml:space="preserve">onset</w:t>
-      </w:r>
-      <w:r>
-        <w:t xml:space="preserve"> </w:t>
-      </w:r>
-      <w:r>
-        <w:t xml:space="preserve">report</w:t>
-      </w:r>
-      <w:r>
-        <w:t xml:space="preserve"> </w:t>
-      </w:r>
-      <w:r>
-        <w:t xml:space="preserve">a</w:t>
-      </w:r>
-      <w:r>
-        <w:t xml:space="preserve"> </w:t>
-      </w:r>
-      <w:r>
-        <w:t xml:space="preserve">delay</w:t>
-      </w:r>
-      <w:r>
-        <w:t xml:space="preserve"> </w:t>
-      </w:r>
-      <w:r>
-        <w:t xml:space="preserve">for</w:t>
-      </w:r>
-      <w:r>
-        <w:t xml:space="preserve"> </w:t>
-      </w:r>
-      <w:r>
-        <w:t xml:space="preserve">bilinguals.</w:t>
-      </w:r>
-      <w:r>
-        <w:t xml:space="preserve"> </w:t>
-      </w:r>
-      <w:r>
-        <w:t xml:space="preserve">However,</w:t>
-      </w:r>
-      <w:r>
-        <w:t xml:space="preserve"> </w:t>
-      </w:r>
-      <w:r>
-        <w:t xml:space="preserve">some</w:t>
-      </w:r>
-      <w:r>
-        <w:t xml:space="preserve"> </w:t>
-      </w:r>
-      <w:r>
-        <w:t xml:space="preserve">studies</w:t>
-      </w:r>
-      <w:r>
-        <w:t xml:space="preserve"> </w:t>
-      </w:r>
-      <w:r>
-        <w:t xml:space="preserve">suggest</w:t>
-      </w:r>
-      <w:r>
-        <w:t xml:space="preserve"> </w:t>
-      </w:r>
-      <w:r>
-        <w:t xml:space="preserve">that</w:t>
-      </w:r>
-      <w:r>
-        <w:t xml:space="preserve"> </w:t>
-      </w:r>
-      <w:r>
-        <w:t xml:space="preserve">such</w:t>
-      </w:r>
-      <w:r>
-        <w:t xml:space="preserve"> </w:t>
-      </w:r>
-      <w:r>
-        <w:t xml:space="preserve">protective</w:t>
-      </w:r>
-      <w:r>
-        <w:t xml:space="preserve"> </w:t>
-      </w:r>
-      <w:r>
-        <w:t xml:space="preserve">effects</w:t>
-      </w:r>
-      <w:r>
-        <w:t xml:space="preserve"> </w:t>
-      </w:r>
-      <w:r>
-        <w:t xml:space="preserve">may</w:t>
-      </w:r>
-      <w:r>
-        <w:t xml:space="preserve"> </w:t>
-      </w:r>
-      <w:r>
-        <w:t xml:space="preserve">be</w:t>
-      </w:r>
-      <w:r>
-        <w:t xml:space="preserve"> </w:t>
-      </w:r>
-      <w:r>
-        <w:t xml:space="preserve">specific</w:t>
-      </w:r>
-      <w:r>
-        <w:t xml:space="preserve"> </w:t>
-      </w:r>
-      <w:r>
-        <w:t xml:space="preserve">to</w:t>
-      </w:r>
-      <w:r>
-        <w:t xml:space="preserve"> </w:t>
-      </w:r>
-      <w:r>
-        <w:t xml:space="preserve">certain</w:t>
-      </w:r>
-      <w:r>
-        <w:t xml:space="preserve"> </w:t>
-      </w:r>
-      <w:r>
-        <w:t xml:space="preserve">types</w:t>
-      </w:r>
-      <w:r>
-        <w:t xml:space="preserve"> </w:t>
-      </w:r>
-      <w:r>
-        <w:t xml:space="preserve">of</w:t>
-      </w:r>
-      <w:r>
-        <w:t xml:space="preserve"> </w:t>
-      </w:r>
-      <w:r>
-        <w:t xml:space="preserve">dementia.</w:t>
-      </w:r>
-      <w:r>
-        <w:t xml:space="preserve"> </w:t>
-      </w:r>
-      <w:r>
-        <w:t xml:space="preserve">Meanwhile,</w:t>
-      </w:r>
-      <w:r>
-        <w:t xml:space="preserve"> </w:t>
-      </w:r>
-      <w:r>
-        <w:t xml:space="preserve">several</w:t>
-      </w:r>
-      <w:r>
-        <w:t xml:space="preserve"> </w:t>
-      </w:r>
-      <w:r>
-        <w:t xml:space="preserve">prospective</w:t>
-      </w:r>
-      <w:r>
-        <w:t xml:space="preserve"> </w:t>
-      </w:r>
-      <w:r>
-        <w:t xml:space="preserve">studies</w:t>
-      </w:r>
-      <w:r>
-        <w:t xml:space="preserve"> </w:t>
-      </w:r>
-      <w:r>
-        <w:t xml:space="preserve">which</w:t>
-      </w:r>
-      <w:r>
-        <w:t xml:space="preserve"> </w:t>
-      </w:r>
-      <w:r>
-        <w:t xml:space="preserve">investigated</w:t>
-      </w:r>
-      <w:r>
-        <w:t xml:space="preserve"> </w:t>
-      </w:r>
-      <w:r>
-        <w:t xml:space="preserve">whether</w:t>
-      </w:r>
-      <w:r>
-        <w:t xml:space="preserve"> </w:t>
-      </w:r>
-      <w:r>
-        <w:t xml:space="preserve">bilingualism</w:t>
-      </w:r>
-      <w:r>
-        <w:t xml:space="preserve"> </w:t>
-      </w:r>
-      <w:r>
-        <w:t xml:space="preserve">reduces</w:t>
-      </w:r>
-      <w:r>
-        <w:t xml:space="preserve"> </w:t>
-      </w:r>
-      <w:r>
-        <w:t xml:space="preserve">the</w:t>
-      </w:r>
-      <w:r>
-        <w:t xml:space="preserve"> </w:t>
-      </w:r>
-      <w:r>
-        <w:t xml:space="preserve">incidence</w:t>
-      </w:r>
-      <w:r>
-        <w:t xml:space="preserve"> </w:t>
-      </w:r>
-      <w:r>
-        <w:t xml:space="preserve">rate</w:t>
-      </w:r>
-      <w:r>
-        <w:t xml:space="preserve"> </w:t>
-      </w:r>
-      <w:r>
-        <w:t xml:space="preserve">of</w:t>
-      </w:r>
-      <w:r>
-        <w:t xml:space="preserve"> </w:t>
-      </w:r>
-      <w:r>
-        <w:t xml:space="preserve">dementia</w:t>
-      </w:r>
-      <w:r>
-        <w:t xml:space="preserve"> </w:t>
-      </w:r>
-      <w:r>
-        <w:t xml:space="preserve">produced</w:t>
-      </w:r>
-      <w:r>
-        <w:t xml:space="preserve"> </w:t>
-      </w:r>
-      <w:r>
-        <w:t xml:space="preserve">null</w:t>
-      </w:r>
-      <w:r>
-        <w:t xml:space="preserve"> </w:t>
-      </w:r>
-      <w:r>
-        <w:t xml:space="preserve">results.</w:t>
-      </w:r>
-      <w:r>
-        <w:t xml:space="preserve"> </w:t>
-      </w:r>
-      <w:r>
-        <w:t xml:space="preserve">Therefore,</w:t>
-      </w:r>
-      <w:r>
-        <w:t xml:space="preserve"> </w:t>
-      </w:r>
-      <w:r>
-        <w:t xml:space="preserve">we</w:t>
-      </w:r>
-      <w:r>
-        <w:t xml:space="preserve"> </w:t>
-      </w:r>
-      <w:r>
-        <w:t xml:space="preserve">conducted</w:t>
-      </w:r>
-      <w:r>
-        <w:t xml:space="preserve"> </w:t>
-      </w:r>
-      <w:r>
-        <w:t xml:space="preserve">the</w:t>
-      </w:r>
-      <w:r>
-        <w:t xml:space="preserve"> </w:t>
-      </w:r>
-      <w:r>
-        <w:t xml:space="preserve">first</w:t>
-      </w:r>
-      <w:r>
-        <w:t xml:space="preserve"> </w:t>
-      </w:r>
-      <w:r>
-        <w:t xml:space="preserve">Bayesian</w:t>
-      </w:r>
-      <w:r>
-        <w:t xml:space="preserve"> </w:t>
-      </w:r>
-      <w:r>
-        <w:t xml:space="preserve">meta-analysis</w:t>
-      </w:r>
-      <w:r>
-        <w:t xml:space="preserve"> </w:t>
-      </w:r>
-      <w:r>
-        <w:t xml:space="preserve">to</w:t>
-      </w:r>
-      <w:r>
-        <w:t xml:space="preserve"> </w:t>
-      </w:r>
-      <w:r>
-        <w:t xml:space="preserve">examine</w:t>
-      </w:r>
-      <w:r>
-        <w:t xml:space="preserve"> </w:t>
-      </w:r>
-      <w:r>
-        <w:t xml:space="preserve">the</w:t>
-      </w:r>
-      <w:r>
-        <w:t xml:space="preserve"> </w:t>
-      </w:r>
-      <w:r>
-        <w:t xml:space="preserve">relationship</w:t>
-      </w:r>
-      <w:r>
-        <w:t xml:space="preserve"> </w:t>
-      </w:r>
-      <w:r>
-        <w:t xml:space="preserve">between</w:t>
-      </w:r>
-      <w:r>
-        <w:t xml:space="preserve"> </w:t>
-      </w:r>
-      <w:r>
-        <w:t xml:space="preserve">bilingualism</w:t>
-      </w:r>
-      <w:r>
-        <w:t xml:space="preserve"> </w:t>
-      </w:r>
-      <w:r>
-        <w:t xml:space="preserve">and</w:t>
-      </w:r>
-      <w:r>
-        <w:t xml:space="preserve"> </w:t>
-      </w:r>
-      <w:r>
-        <w:t xml:space="preserve">age</w:t>
-      </w:r>
-      <w:r>
-        <w:t xml:space="preserve"> </w:t>
-      </w:r>
-      <w:r>
-        <w:t xml:space="preserve">at</w:t>
-      </w:r>
-      <w:r>
-        <w:t xml:space="preserve"> </w:t>
-      </w:r>
-      <w:r>
-        <w:t xml:space="preserve">onset</w:t>
-      </w:r>
-      <w:r>
-        <w:t xml:space="preserve"> </w:t>
-      </w:r>
-      <w:r>
-        <w:t xml:space="preserve">of</w:t>
-      </w:r>
-      <w:r>
-        <w:t xml:space="preserve"> </w:t>
-      </w:r>
-      <w:r>
-        <w:t xml:space="preserve">dementia</w:t>
-      </w:r>
-      <w:r>
-        <w:t xml:space="preserve"> </w:t>
-      </w:r>
-      <w:r>
-        <w:t xml:space="preserve">and</w:t>
-      </w:r>
-      <w:r>
-        <w:t xml:space="preserve"> </w:t>
-      </w:r>
-      <w:r>
-        <w:t xml:space="preserve">bilingualism</w:t>
-      </w:r>
-      <w:r>
-        <w:t xml:space="preserve"> </w:t>
-      </w:r>
-      <w:r>
-        <w:t xml:space="preserve">and</w:t>
-      </w:r>
-      <w:r>
-        <w:t xml:space="preserve"> </w:t>
-      </w:r>
-      <w:r>
-        <w:t xml:space="preserve">the</w:t>
-      </w:r>
-      <w:r>
-        <w:t xml:space="preserve"> </w:t>
-      </w:r>
-      <w:r>
-        <w:t xml:space="preserve">incidence</w:t>
-      </w:r>
-      <w:r>
-        <w:t xml:space="preserve"> </w:t>
-      </w:r>
-      <w:r>
-        <w:t xml:space="preserve">rate</w:t>
-      </w:r>
-      <w:r>
-        <w:t xml:space="preserve"> </w:t>
-      </w:r>
-      <w:r>
-        <w:t xml:space="preserve">of</w:t>
-      </w:r>
-      <w:r>
-        <w:t xml:space="preserve"> </w:t>
-      </w:r>
-      <w:r>
-        <w:t xml:space="preserve">dementia</w:t>
-      </w:r>
-      <w:r>
-        <w:t xml:space="preserve"> </w:t>
-      </w:r>
-      <w:r>
-        <w:t xml:space="preserve">respectively.</w:t>
-      </w:r>
-      <w:r>
-        <w:t xml:space="preserve"> </w:t>
-      </w:r>
-      <w:r>
-        <w:t xml:space="preserve">The</w:t>
-      </w:r>
-      <w:r>
-        <w:t xml:space="preserve"> </w:t>
-      </w:r>
-      <w:r>
-        <w:t xml:space="preserve">results</w:t>
-      </w:r>
-      <w:r>
-        <w:t xml:space="preserve"> </w:t>
-      </w:r>
-      <w:r>
-        <w:t xml:space="preserve">from</w:t>
-      </w:r>
-      <w:r>
-        <w:t xml:space="preserve"> </w:t>
-      </w:r>
-      <w:r>
-        <w:t xml:space="preserve">18</w:t>
-      </w:r>
-      <w:r>
-        <w:t xml:space="preserve"> </w:t>
-      </w:r>
-      <w:r>
-        <w:t xml:space="preserve">age</w:t>
-      </w:r>
-      <w:r>
-        <w:t xml:space="preserve"> </w:t>
-      </w:r>
-      <w:r>
-        <w:t xml:space="preserve">at</w:t>
-      </w:r>
-      <w:r>
-        <w:t xml:space="preserve"> </w:t>
-      </w:r>
-      <w:r>
-        <w:t xml:space="preserve">onset</w:t>
-      </w:r>
-      <w:r>
-        <w:t xml:space="preserve"> </w:t>
-      </w:r>
-      <w:r>
-        <w:t xml:space="preserve">studies</w:t>
-      </w:r>
-      <w:r>
-        <w:t xml:space="preserve"> </w:t>
-      </w:r>
-      <w:r>
-        <w:t xml:space="preserve">revealed</w:t>
-      </w:r>
-      <w:r>
-        <w:t xml:space="preserve"> </w:t>
-      </w:r>
-      <w:r>
-        <w:t xml:space="preserve">that</w:t>
-      </w:r>
-      <w:r>
-        <w:t xml:space="preserve"> </w:t>
-      </w:r>
-      <w:r>
-        <w:t xml:space="preserve">bilinguals</w:t>
-      </w:r>
-      <w:r>
-        <w:t xml:space="preserve"> </w:t>
-      </w:r>
-      <w:r>
-        <w:t xml:space="preserve">were,</w:t>
-      </w:r>
-      <w:r>
-        <w:t xml:space="preserve"> </w:t>
-      </w:r>
-      <w:r>
-        <w:t xml:space="preserve">on</w:t>
-      </w:r>
-      <w:r>
-        <w:t xml:space="preserve"> </w:t>
-      </w:r>
-      <w:r>
-        <w:t xml:space="preserve">average,</w:t>
-      </w:r>
-      <w:r>
-        <w:t xml:space="preserve"> </w:t>
-      </w:r>
-      <w:r>
-        <w:t xml:space="preserve">3.45</w:t>
-      </w:r>
-      <w:r>
-        <w:t xml:space="preserve"> </w:t>
-      </w:r>
-      <w:r>
-        <w:t xml:space="preserve">years</w:t>
-      </w:r>
-      <w:r>
-        <w:t xml:space="preserve"> </w:t>
-      </w:r>
-      <w:r>
-        <w:t xml:space="preserve">older</w:t>
-      </w:r>
-      <w:r>
-        <w:t xml:space="preserve"> </w:t>
-      </w:r>
-      <w:r>
-        <w:t xml:space="preserve">than</w:t>
-      </w:r>
-      <w:r>
-        <w:t xml:space="preserve"> </w:t>
-      </w:r>
-      <w:r>
-        <w:t xml:space="preserve">monolinguals</w:t>
-      </w:r>
-      <w:r>
-        <w:t xml:space="preserve"> </w:t>
-      </w:r>
-      <w:r>
-        <w:t xml:space="preserve">at</w:t>
-      </w:r>
-      <w:r>
-        <w:t xml:space="preserve"> </w:t>
-      </w:r>
-      <w:r>
-        <w:t xml:space="preserve">symptom</w:t>
-      </w:r>
-      <w:r>
-        <w:t xml:space="preserve"> </w:t>
-      </w:r>
-      <w:r>
-        <w:t xml:space="preserve">onset</w:t>
-      </w:r>
-      <w:r>
-        <w:t xml:space="preserve"> </w:t>
-      </w:r>
-      <w:r>
-        <w:t xml:space="preserve">(95%</w:t>
-      </w:r>
-      <w:r>
-        <w:t xml:space="preserve"> </w:t>
-      </w:r>
-      <w:r>
-        <w:t xml:space="preserve">credible</w:t>
-      </w:r>
-      <w:r>
-        <w:t xml:space="preserve"> </w:t>
-      </w:r>
-      <w:r>
-        <w:t xml:space="preserve">interval</w:t>
-      </w:r>
-      <w:r>
-        <w:t xml:space="preserve"> </w:t>
-      </w:r>
-      <w:r>
-        <w:t xml:space="preserve">[CrI]:</w:t>
-      </w:r>
-      <w:r>
-        <w:t xml:space="preserve"> </w:t>
-      </w:r>
-      <w:r>
-        <w:t xml:space="preserve">[2.8,</w:t>
-      </w:r>
-      <w:r>
-        <w:t xml:space="preserve"> </w:t>
-      </w:r>
-      <w:r>
-        <w:t xml:space="preserve">4.1]).</w:t>
-      </w:r>
-      <w:r>
-        <w:t xml:space="preserve"> </w:t>
-      </w:r>
-      <w:r>
-        <w:t xml:space="preserve">Moreover,</w:t>
-      </w:r>
-      <w:r>
-        <w:t xml:space="preserve"> </w:t>
-      </w:r>
-      <w:r>
-        <w:t xml:space="preserve">the</w:t>
-      </w:r>
-      <w:r>
-        <w:t xml:space="preserve"> </w:t>
-      </w:r>
-      <w:r>
-        <w:t xml:space="preserve">result</w:t>
-      </w:r>
-      <w:r>
-        <w:t xml:space="preserve"> </w:t>
-      </w:r>
-      <w:r>
-        <w:t xml:space="preserve">was</w:t>
-      </w:r>
-      <w:r>
-        <w:t xml:space="preserve"> </w:t>
-      </w:r>
-      <w:r>
-        <w:t xml:space="preserve">only</w:t>
-      </w:r>
-      <w:r>
-        <w:t xml:space="preserve"> </w:t>
-      </w:r>
-      <w:r>
-        <w:t xml:space="preserve">slightly</w:t>
-      </w:r>
-      <w:r>
-        <w:t xml:space="preserve"> </w:t>
-      </w:r>
-      <w:r>
-        <w:t xml:space="preserve">influenced</w:t>
-      </w:r>
-      <w:r>
-        <w:t xml:space="preserve"> </w:t>
-      </w:r>
-      <w:r>
-        <w:t xml:space="preserve">by</w:t>
-      </w:r>
-      <w:r>
-        <w:t xml:space="preserve"> </w:t>
-      </w:r>
-      <w:r>
-        <w:t xml:space="preserve">years</w:t>
-      </w:r>
-      <w:r>
-        <w:t xml:space="preserve"> </w:t>
-      </w:r>
-      <w:r>
-        <w:t xml:space="preserve">of</w:t>
-      </w:r>
-      <w:r>
-        <w:t xml:space="preserve"> </w:t>
-      </w:r>
-      <w:r>
-        <w:t xml:space="preserve">education,</w:t>
-      </w:r>
-      <w:r>
-        <w:t xml:space="preserve"> </w:t>
-      </w:r>
-      <w:r>
-        <w:t xml:space="preserve">although</w:t>
-      </w:r>
-      <w:r>
-        <w:t xml:space="preserve"> </w:t>
-      </w:r>
-      <w:r>
-        <w:t xml:space="preserve">the</w:t>
-      </w:r>
-      <w:r>
-        <w:t xml:space="preserve"> </w:t>
-      </w:r>
-      <w:r>
-        <w:t xml:space="preserve">effect</w:t>
-      </w:r>
-      <w:r>
-        <w:t xml:space="preserve"> </w:t>
-      </w:r>
-      <w:r>
-        <w:t xml:space="preserve">of</w:t>
-      </w:r>
-      <w:r>
-        <w:t xml:space="preserve"> </w:t>
-      </w:r>
-      <w:r>
-        <w:t xml:space="preserve">education</w:t>
-      </w:r>
-      <w:r>
-        <w:t xml:space="preserve"> </w:t>
-      </w:r>
-      <w:r>
-        <w:t xml:space="preserve">on</w:t>
-      </w:r>
-      <w:r>
-        <w:t xml:space="preserve"> </w:t>
-      </w:r>
-      <w:r>
-        <w:t xml:space="preserve">dementia</w:t>
-      </w:r>
-      <w:r>
-        <w:t xml:space="preserve"> </w:t>
-      </w:r>
-      <w:r>
-        <w:t xml:space="preserve">remains</w:t>
-      </w:r>
-      <w:r>
-        <w:t xml:space="preserve"> </w:t>
-      </w:r>
-      <w:r>
-        <w:t xml:space="preserve">uncertain.</w:t>
-      </w:r>
-      <w:r>
-        <w:t xml:space="preserve"> </w:t>
-      </w:r>
-      <w:r>
-        <w:t xml:space="preserve">The</w:t>
-      </w:r>
-      <w:r>
-        <w:t xml:space="preserve"> </w:t>
-      </w:r>
-      <w:r>
-        <w:t xml:space="preserve">results</w:t>
-      </w:r>
-      <w:r>
-        <w:t xml:space="preserve"> </w:t>
-      </w:r>
-      <w:r>
-        <w:t xml:space="preserve">from</w:t>
-      </w:r>
-      <w:r>
-        <w:t xml:space="preserve"> </w:t>
-      </w:r>
-      <w:r>
-        <w:t xml:space="preserve">6</w:t>
-      </w:r>
-      <w:r>
-        <w:t xml:space="preserve"> </w:t>
-      </w:r>
-      <w:r>
-        <w:t xml:space="preserve">incidence</w:t>
-      </w:r>
-      <w:r>
-        <w:t xml:space="preserve"> </w:t>
-      </w:r>
-      <w:r>
-        <w:t xml:space="preserve">rate</w:t>
-      </w:r>
-      <w:r>
-        <w:t xml:space="preserve"> </w:t>
-      </w:r>
-      <w:r>
-        <w:t xml:space="preserve">studies</w:t>
-      </w:r>
-      <w:r>
-        <w:t xml:space="preserve"> </w:t>
-      </w:r>
-      <w:r>
-        <w:t xml:space="preserve">did</w:t>
-      </w:r>
-      <w:r>
-        <w:t xml:space="preserve"> </w:t>
-      </w:r>
-      <w:r>
-        <w:t xml:space="preserve">not</w:t>
-      </w:r>
-      <w:r>
-        <w:t xml:space="preserve"> </w:t>
-      </w:r>
-      <w:r>
-        <w:t xml:space="preserve">provide</w:t>
-      </w:r>
-      <w:r>
-        <w:t xml:space="preserve"> </w:t>
-      </w:r>
-      <w:r>
-        <w:t xml:space="preserve">robust</w:t>
-      </w:r>
-      <w:r>
-        <w:t xml:space="preserve"> </w:t>
-      </w:r>
-      <w:r>
-        <w:t xml:space="preserve">evidence</w:t>
-      </w:r>
-      <w:r>
-        <w:t xml:space="preserve"> </w:t>
-      </w:r>
-      <w:r>
-        <w:t xml:space="preserve">for</w:t>
-      </w:r>
-      <w:r>
-        <w:t xml:space="preserve"> </w:t>
-      </w:r>
-      <w:r>
-        <w:t xml:space="preserve">bilingualism’s</w:t>
-      </w:r>
-      <w:r>
-        <w:t xml:space="preserve"> </w:t>
-      </w:r>
-      <w:r>
-        <w:t xml:space="preserve">preventive</w:t>
-      </w:r>
-      <w:r>
-        <w:t xml:space="preserve"> </w:t>
-      </w:r>
-      <w:r>
-        <w:t xml:space="preserve">effect.</w:t>
-      </w:r>
-      <w:r>
-        <w:t xml:space="preserve"> </w:t>
-      </w:r>
-      <w:r>
-        <w:t xml:space="preserve">Therefore,</w:t>
-      </w:r>
-      <w:r>
-        <w:t xml:space="preserve"> </w:t>
-      </w:r>
-      <w:r>
-        <w:t xml:space="preserve">this</w:t>
-      </w:r>
-      <w:r>
-        <w:t xml:space="preserve"> </w:t>
-      </w:r>
-      <w:r>
-        <w:t xml:space="preserve">meta-analysis</w:t>
-      </w:r>
-      <w:r>
-        <w:t xml:space="preserve"> </w:t>
-      </w:r>
-      <w:r>
-        <w:t xml:space="preserve">demonstrated</w:t>
-      </w:r>
-      <w:r>
-        <w:t xml:space="preserve"> </w:t>
-      </w:r>
-      <w:r>
-        <w:t xml:space="preserve">that</w:t>
-      </w:r>
-      <w:r>
-        <w:t xml:space="preserve"> </w:t>
-      </w:r>
-      <w:r>
-        <w:t xml:space="preserve">bilingualism</w:t>
-      </w:r>
-      <w:r>
-        <w:t xml:space="preserve"> </w:t>
-      </w:r>
-      <w:r>
-        <w:t xml:space="preserve">has</w:t>
-      </w:r>
-      <w:r>
-        <w:t xml:space="preserve"> </w:t>
-      </w:r>
-      <w:r>
-        <w:t xml:space="preserve">potential</w:t>
-      </w:r>
-      <w:r>
-        <w:t xml:space="preserve"> </w:t>
-      </w:r>
-      <w:r>
-        <w:t xml:space="preserve">effects</w:t>
-      </w:r>
-      <w:r>
-        <w:t xml:space="preserve"> </w:t>
-      </w:r>
-      <w:r>
-        <w:t xml:space="preserve">in</w:t>
-      </w:r>
-      <w:r>
-        <w:t xml:space="preserve"> </w:t>
-      </w:r>
-      <w:r>
-        <w:t xml:space="preserve">delaying</w:t>
-      </w:r>
-      <w:r>
-        <w:t xml:space="preserve"> </w:t>
-      </w:r>
-      <w:r>
-        <w:t xml:space="preserve">the</w:t>
-      </w:r>
-      <w:r>
-        <w:t xml:space="preserve"> </w:t>
-      </w:r>
-      <w:r>
-        <w:t xml:space="preserve">onset</w:t>
-      </w:r>
-      <w:r>
-        <w:t xml:space="preserve"> </w:t>
-      </w:r>
-      <w:r>
-        <w:t xml:space="preserve">of</w:t>
-      </w:r>
-      <w:r>
-        <w:t xml:space="preserve"> </w:t>
-      </w:r>
-      <w:r>
-        <w:t xml:space="preserve">dementia</w:t>
-      </w:r>
-      <w:r>
-        <w:t xml:space="preserve"> </w:t>
-      </w:r>
-      <w:r>
-        <w:t xml:space="preserve">but</w:t>
-      </w:r>
-      <w:r>
-        <w:t xml:space="preserve"> </w:t>
-      </w:r>
-      <w:r>
-        <w:t xml:space="preserve">not</w:t>
-      </w:r>
-      <w:r>
-        <w:t xml:space="preserve"> </w:t>
-      </w:r>
-      <w:r>
-        <w:t xml:space="preserve">preventing</w:t>
-      </w:r>
-      <w:r>
-        <w:t xml:space="preserve"> </w:t>
-      </w:r>
-      <w:r>
-        <w:t xml:space="preserve">it.</w:t>
+        <w:t xml:space="preserve">Evidence suggests that lifelong practice of two or more languages may contribute to cognitive reserve and protect against dementia. Most retrospective studies comparing bilinguals’ and monolinguals’ age at dementia onset report a delay for bilinguals. However, some studies suggest that such protective effects may be specific to certain types of dementia. Meanwhile, several prospective studies which investigated whether bilingualism reduces the incidence rate of dementia produced null results. Therefore, we conducted the first Bayesian meta-analysis to examine the relationship between bilingualism and age at onset of dementia and bilingualism and the incidence rate of dementia respectively. The results from 18 age at onset studies revealed that bilinguals were, on average, 3.45 years older than monolinguals at symptom onset (95% credible interval [CrI]: [2.8, 4.1]). Moreover, the result was only slightly influenced by years of education, although the effect of education on dementia remains uncertain. The results from 6 incidence rate studies did not provide robust evidence for bilingualism’s preventive effect. Therefore, this meta-analysis demonstrated that bilingualism has potential effects in delaying the onset of dementia but not preventing it.</w:t>
       </w:r>
       <w:r>
         <w:t xml:space="preserve"> </w:t>
@@ -1625,13 +497,7 @@
         <w:t xml:space="preserve"> </w:t>
       </w:r>
       <w:r>
-        <w:t xml:space="preserve">“</w:t>
-      </w:r>
-      <w:r>
-        <w:t xml:space="preserve">advantage</w:t>
-      </w:r>
-      <w:r>
-        <w:t xml:space="preserve">”</w:t>
+        <w:t xml:space="preserve">“advantage”</w:t>
       </w:r>
       <w:r>
         <w:t xml:space="preserve"> </w:t>
@@ -1948,13 +814,7 @@
         <w:t xml:space="preserve"> </w:t>
       </w:r>
       <w:r>
-        <w:t xml:space="preserve">“</w:t>
-      </w:r>
-      <w:r>
-        <w:t xml:space="preserve">a strategy to delay dementia</w:t>
-      </w:r>
-      <w:r>
-        <w:t xml:space="preserve">”</w:t>
+        <w:t xml:space="preserve">“a strategy to delay dementia”</w:t>
       </w:r>
       <w:r>
         <w:t xml:space="preserve"> </w:t>
@@ -2141,13 +1001,7 @@
         <w:t xml:space="preserve">The datasets used in the present meta-analysis were PsycInfo, PubMed, and Google Scholar. A search of these databases and data extraction were conducted by Z.L. with the following keywords: (</w:t>
       </w:r>
       <w:r>
-        <w:t xml:space="preserve">“</w:t>
-      </w:r>
-      <w:r>
-        <w:t xml:space="preserve">bilingualism</w:t>
-      </w:r>
-      <w:r>
-        <w:t xml:space="preserve">”</w:t>
+        <w:t xml:space="preserve">“bilingualism”</w:t>
       </w:r>
       <w:r>
         <w:t xml:space="preserve"> </w:t>
@@ -2159,25 +1013,13 @@
         <w:t xml:space="preserve"> </w:t>
       </w:r>
       <w:r>
-        <w:t xml:space="preserve">“</w:t>
-      </w:r>
-      <w:r>
-        <w:t xml:space="preserve">multilingualism</w:t>
-      </w:r>
-      <w:r>
-        <w:t xml:space="preserve">”</w:t>
+        <w:t xml:space="preserve">“multilingualism”</w:t>
       </w:r>
       <w:r>
         <w:t xml:space="preserve">) AND (</w:t>
       </w:r>
       <w:r>
-        <w:t xml:space="preserve">“</w:t>
-      </w:r>
-      <w:r>
-        <w:t xml:space="preserve">Alzheimer’s disease</w:t>
-      </w:r>
-      <w:r>
-        <w:t xml:space="preserve">”</w:t>
+        <w:t xml:space="preserve">“Alzheimer’s disease”</w:t>
       </w:r>
       <w:r>
         <w:t xml:space="preserve"> </w:t>
@@ -2189,13 +1031,7 @@
         <w:t xml:space="preserve"> </w:t>
       </w:r>
       <w:r>
-        <w:t xml:space="preserve">“</w:t>
-      </w:r>
-      <w:r>
-        <w:t xml:space="preserve">dementia</w:t>
-      </w:r>
-      <w:r>
-        <w:t xml:space="preserve">”</w:t>
+        <w:t xml:space="preserve">“dementia”</w:t>
       </w:r>
       <w:r>
         <w:t xml:space="preserve"> </w:t>
@@ -2207,13 +1043,7 @@
         <w:t xml:space="preserve"> </w:t>
       </w:r>
       <w:r>
-        <w:t xml:space="preserve">“</w:t>
-      </w:r>
-      <w:r>
-        <w:t xml:space="preserve">MCI</w:t>
-      </w:r>
-      <w:r>
-        <w:t xml:space="preserve">”</w:t>
+        <w:t xml:space="preserve">“MCI”</w:t>
       </w:r>
       <w:r>
         <w:t xml:space="preserve">).</w:t>
@@ -2904,7 +1734,7 @@
         <w:rPr>
           <w:color w:val="FF0000"/>
         </w:rPr>
-        <w:t>All models converged with acceptable R-hat and acceptable sample size values. The FTD subgroup model and MCI subgroup model finished with 40 and 16 divergent transitions respectively, which we did not deem problematic given the R-hat and effective sample size values.</w:t>
+        <w:t>All models converged with acceptable R-hat and acceptable sample size values. The FTD subgroup model and MCI subgroup model finished with 36 and 16 divergent transitions respectively, which we did not deem problematic given the R-hat and effective sample size values.</w:t>
       </w:r>
     </w:p>
     <w:p>
@@ -3050,7 +1880,7 @@
         <w:rPr>
           <w:color w:val="FF0000"/>
         </w:rPr>
-        <w:t>It is important to note that the credible interval of the predicted average estimate (from avg\_comparisons()) is narrower than those observed in the study-specific estimates in the forest plot. This is because the predicted estimate benefits from partial pooling across studies, which reduces uncertainty by borrowing strength from the entire dataset.</w:t>
+        <w:t>It is important to note that the credible interval of the predicted average estimate (from avg\_comparisons()) is narrower than those observed in the study-specific estimates in the forest plot. This is because the calculated interval is based on the mean predicted effect of each observation in the dataset, for each MCMC draw.</w:t>
       </w:r>
     </w:p>
     <w:p>
@@ -3510,13 +2340,7 @@
         <w:t xml:space="preserve"> </w:t>
       </w:r>
       <w:r>
-        <w:t xml:space="preserve">“</w:t>
-      </w:r>
-      <w:r>
-        <w:t xml:space="preserve">years of education</w:t>
-      </w:r>
-      <w:r>
-        <w:t xml:space="preserve">”</w:t>
+        <w:t xml:space="preserve">“years of education”</w:t>
       </w:r>
       <w:r>
         <w:t xml:space="preserve"> </w:t>
@@ -3539,13 +2363,7 @@
         <w:t xml:space="preserve"> </w:t>
       </w:r>
       <w:r>
-        <w:t xml:space="preserve">“</w:t>
-      </w:r>
-      <w:r>
-        <w:t xml:space="preserve">years of education</w:t>
-      </w:r>
-      <w:r>
-        <w:t xml:space="preserve">”</w:t>
+        <w:t xml:space="preserve">“years of education”</w:t>
       </w:r>
       <w:r>
         <w:t xml:space="preserve"> </w:t>
@@ -3633,7 +2451,6 @@
           <w:p>
             <w:pPr>
               <w:pStyle w:val="Compact"/>
-              <w:jc w:val="left"/>
             </w:pPr>
             <w:r>
               <w:t xml:space="preserve">Study</w:t>
@@ -3645,7 +2462,6 @@
           <w:p>
             <w:pPr>
               <w:pStyle w:val="Compact"/>
-              <w:jc w:val="left"/>
             </w:pPr>
             <w:r>
               <w:t xml:space="preserve">Dementia Diagnosis</w:t>
@@ -3657,7 +2473,6 @@
           <w:p>
             <w:pPr>
               <w:pStyle w:val="Compact"/>
-              <w:jc w:val="left"/>
             </w:pPr>
             <w:r>
               <w:t xml:space="preserve">Type of Dementia or MCI</w:t>
@@ -3669,7 +2484,6 @@
           <w:p>
             <w:pPr>
               <w:pStyle w:val="Compact"/>
-              <w:jc w:val="left"/>
             </w:pPr>
             <w:r>
               <w:t xml:space="preserve">Mean Age of Diagnosis &amp; Symptom Onset (SD)</w:t>
@@ -3683,7 +2497,6 @@
           <w:p>
             <w:pPr>
               <w:pStyle w:val="Compact"/>
-              <w:jc w:val="left"/>
             </w:pPr>
             <w:r>
               <w:t xml:space="preserve">Alladi et al. (2013)</w:t>
@@ -3695,7 +2508,6 @@
           <w:p>
             <w:pPr>
               <w:pStyle w:val="Compact"/>
-              <w:jc w:val="left"/>
             </w:pPr>
             <w:r>
               <w:t xml:space="preserve">Cambridge Memory Clinic model</w:t>
@@ -3707,7 +2519,6 @@
           <w:p>
             <w:pPr>
               <w:pStyle w:val="Compact"/>
-              <w:jc w:val="left"/>
             </w:pPr>
             <w:r>
               <w:t xml:space="preserve">AD</w:t>
@@ -3719,7 +2530,6 @@
           <w:p>
             <w:pPr>
               <w:pStyle w:val="Compact"/>
-              <w:jc w:val="left"/>
             </w:pPr>
             <w:r>
               <w:t xml:space="preserve">ML: 65.4 (10.0); BL: 68.6 (9.6)</w:t>
@@ -3733,7 +2543,6 @@
           <w:p>
             <w:pPr>
               <w:pStyle w:val="Compact"/>
-              <w:jc w:val="left"/>
             </w:pPr>
             <w:r>
               <w:t xml:space="preserve">Bialystok et al. (2007)</w:t>
@@ -3745,7 +2554,6 @@
           <w:p>
             <w:pPr>
               <w:pStyle w:val="Compact"/>
-              <w:jc w:val="left"/>
             </w:pPr>
             <w:r>
               <w:t xml:space="preserve">NINCDS-ADRDA</w:t>
@@ -3757,7 +2565,6 @@
           <w:p>
             <w:pPr>
               <w:pStyle w:val="Compact"/>
-              <w:jc w:val="left"/>
             </w:pPr>
             <w:r>
               <w:t xml:space="preserve">AD</w:t>
@@ -3769,7 +2576,6 @@
           <w:p>
             <w:pPr>
               <w:pStyle w:val="Compact"/>
-              <w:jc w:val="left"/>
             </w:pPr>
             <w:r>
               <w:t xml:space="preserve">ML: 71.4 (9.6); BL: 75.5 (8.5)</w:t>
@@ -3783,7 +2589,6 @@
           <w:p>
             <w:pPr>
               <w:pStyle w:val="Compact"/>
-              <w:jc w:val="left"/>
             </w:pPr>
             <w:r>
               <w:t xml:space="preserve">Bialystok et al. (2014)</w:t>
@@ -3795,7 +2600,6 @@
           <w:p>
             <w:pPr>
               <w:pStyle w:val="Compact"/>
-              <w:jc w:val="left"/>
             </w:pPr>
             <w:r>
               <w:t xml:space="preserve">NA</w:t>
@@ -3807,7 +2611,6 @@
           <w:p>
             <w:pPr>
               <w:pStyle w:val="Compact"/>
-              <w:jc w:val="left"/>
             </w:pPr>
             <w:r>
               <w:t xml:space="preserve">AD</w:t>
@@ -3819,7 +2622,6 @@
           <w:p>
             <w:pPr>
               <w:pStyle w:val="Compact"/>
-              <w:jc w:val="left"/>
             </w:pPr>
             <w:r>
               <w:t xml:space="preserve">ML: 70.9 (11.0); BL: 78.2 (8.9)</w:t>
@@ -3833,7 +2635,6 @@
           <w:p>
             <w:pPr>
               <w:pStyle w:val="Compact"/>
-              <w:jc w:val="left"/>
             </w:pPr>
             <w:r>
               <w:t xml:space="preserve">Berkes et al. (2020)</w:t>
@@ -3845,7 +2646,6 @@
           <w:p>
             <w:pPr>
               <w:pStyle w:val="Compact"/>
-              <w:jc w:val="left"/>
             </w:pPr>
             <w:r>
               <w:t xml:space="preserve">MMSE, MoCA</w:t>
@@ -3857,7 +2657,6 @@
           <w:p>
             <w:pPr>
               <w:pStyle w:val="Compact"/>
-              <w:jc w:val="left"/>
             </w:pPr>
             <w:r>
               <w:t xml:space="preserve">AD</w:t>
@@ -3869,7 +2668,6 @@
           <w:p>
             <w:pPr>
               <w:pStyle w:val="Compact"/>
-              <w:jc w:val="left"/>
             </w:pPr>
             <w:r>
               <w:t xml:space="preserve">ML: 78.2 (7.7); BL: 79.8 (8.4)</w:t>
@@ -3883,7 +2681,6 @@
           <w:p>
             <w:pPr>
               <w:pStyle w:val="Compact"/>
-              <w:jc w:val="left"/>
             </w:pPr>
             <w:r>
               <w:t xml:space="preserve">Chertkow et al. (2010)</w:t>
@@ -3895,7 +2692,6 @@
           <w:p>
             <w:pPr>
               <w:pStyle w:val="Compact"/>
-              <w:jc w:val="left"/>
             </w:pPr>
             <w:r>
               <w:t xml:space="preserve">Patient &amp; caregiver interviews</w:t>
@@ -3907,7 +2703,6 @@
           <w:p>
             <w:pPr>
               <w:pStyle w:val="Compact"/>
-              <w:jc w:val="left"/>
             </w:pPr>
             <w:r>
               <w:t xml:space="preserve">AD</w:t>
@@ -3919,7 +2714,6 @@
           <w:p>
             <w:pPr>
               <w:pStyle w:val="Compact"/>
-              <w:jc w:val="left"/>
             </w:pPr>
             <w:r>
               <w:t xml:space="preserve">ML: 76.7 (7.8); BL: 77.6 (7.2)</w:t>
@@ -3933,7 +2727,6 @@
           <w:p>
             <w:pPr>
               <w:pStyle w:val="Compact"/>
-              <w:jc w:val="left"/>
             </w:pPr>
             <w:r>
               <w:t xml:space="preserve">Clare et al. (2016)</w:t>
@@ -3945,7 +2738,6 @@
           <w:p>
             <w:pPr>
               <w:pStyle w:val="Compact"/>
-              <w:jc w:val="left"/>
             </w:pPr>
             <w:r>
               <w:t xml:space="preserve">LQ-SV</w:t>
@@ -3957,7 +2749,6 @@
           <w:p>
             <w:pPr>
               <w:pStyle w:val="Compact"/>
-              <w:jc w:val="left"/>
             </w:pPr>
             <w:r>
               <w:t xml:space="preserve">AD</w:t>
@@ -3969,7 +2760,6 @@
           <w:p>
             <w:pPr>
               <w:pStyle w:val="Compact"/>
-              <w:jc w:val="left"/>
             </w:pPr>
             <w:r>
               <w:t xml:space="preserve">ML: 76.2 (8.75); BL: 79.3 (6.78)</w:t>
@@ -3983,7 +2773,6 @@
           <w:p>
             <w:pPr>
               <w:pStyle w:val="Compact"/>
-              <w:jc w:val="left"/>
             </w:pPr>
             <w:r>
               <w:t xml:space="preserve">Craik et al. (2010)</w:t>
@@ -3995,7 +2784,6 @@
           <w:p>
             <w:pPr>
               <w:pStyle w:val="Compact"/>
-              <w:jc w:val="left"/>
             </w:pPr>
             <w:r>
               <w:t xml:space="preserve">NA</w:t>
@@ -4007,7 +2795,6 @@
           <w:p>
             <w:pPr>
               <w:pStyle w:val="Compact"/>
-              <w:jc w:val="left"/>
             </w:pPr>
             <w:r>
               <w:t xml:space="preserve">AD</w:t>
@@ -4019,7 +2806,6 @@
           <w:p>
             <w:pPr>
               <w:pStyle w:val="Compact"/>
-              <w:jc w:val="left"/>
             </w:pPr>
             <w:r>
               <w:t xml:space="preserve">ML: 72.6 (10); BL: 77.7 (7.9)</w:t>
@@ -4033,7 +2819,6 @@
           <w:p>
             <w:pPr>
               <w:pStyle w:val="Compact"/>
-              <w:jc w:val="left"/>
             </w:pPr>
             <w:r>
               <w:t xml:space="preserve">Leon et al. (2020)</w:t>
@@ -4045,7 +2830,6 @@
           <w:p>
             <w:pPr>
               <w:pStyle w:val="Compact"/>
-              <w:jc w:val="left"/>
             </w:pPr>
             <w:r>
               <w:t xml:space="preserve">NA</w:t>
@@ -4057,7 +2841,6 @@
           <w:p>
             <w:pPr>
               <w:pStyle w:val="Compact"/>
-              <w:jc w:val="left"/>
             </w:pPr>
             <w:r>
               <w:t xml:space="preserve">AD</w:t>
@@ -4069,7 +2852,6 @@
           <w:p>
             <w:pPr>
               <w:pStyle w:val="Compact"/>
-              <w:jc w:val="left"/>
             </w:pPr>
             <w:r>
               <w:t xml:space="preserve">ML: 60.3 (9.8); BL: 61.9 (9.8)</w:t>
@@ -4083,7 +2865,6 @@
           <w:p>
             <w:pPr>
               <w:pStyle w:val="Compact"/>
-              <w:jc w:val="left"/>
             </w:pPr>
             <w:r>
               <w:t xml:space="preserve">Duncan et al. (2018)</w:t>
@@ -4095,7 +2876,6 @@
           <w:p>
             <w:pPr>
               <w:pStyle w:val="Compact"/>
-              <w:jc w:val="left"/>
             </w:pPr>
             <w:r>
               <w:t xml:space="preserve">NINCDS-ADRDA</w:t>
@@ -4107,7 +2887,6 @@
           <w:p>
             <w:pPr>
               <w:pStyle w:val="Compact"/>
-              <w:jc w:val="left"/>
             </w:pPr>
             <w:r>
               <w:t xml:space="preserve">AD</w:t>
@@ -4119,7 +2898,6 @@
           <w:p>
             <w:pPr>
               <w:pStyle w:val="Compact"/>
-              <w:jc w:val="left"/>
             </w:pPr>
             <w:r>
               <w:t xml:space="preserve">ML: 74.3 (1.5); BL: 72.6 (1.6)</w:t>
@@ -4133,7 +2911,6 @@
           <w:p>
             <w:pPr>
               <w:pStyle w:val="Compact"/>
-              <w:jc w:val="left"/>
             </w:pPr>
             <w:r>
               <w:t xml:space="preserve">Kowoll et al. (2016)</w:t>
@@ -4145,7 +2922,6 @@
           <w:p>
             <w:pPr>
               <w:pStyle w:val="Compact"/>
-              <w:jc w:val="left"/>
             </w:pPr>
             <w:r>
               <w:t xml:space="preserve">NINCDS-ADRDA</w:t>
@@ -4157,7 +2933,6 @@
           <w:p>
             <w:pPr>
               <w:pStyle w:val="Compact"/>
-              <w:jc w:val="left"/>
             </w:pPr>
             <w:r>
               <w:t xml:space="preserve">AD</w:t>
@@ -4169,7 +2944,6 @@
           <w:p>
             <w:pPr>
               <w:pStyle w:val="Compact"/>
-              <w:jc w:val="left"/>
             </w:pPr>
             <w:r>
               <w:t xml:space="preserve">ML: 71.6 (7.9); BL: 74.6 (6.8)</w:t>
@@ -4183,7 +2957,6 @@
           <w:p>
             <w:pPr>
               <w:pStyle w:val="Compact"/>
-              <w:jc w:val="left"/>
             </w:pPr>
             <w:r>
               <w:t xml:space="preserve">Perani et al. (2017)</w:t>
@@ -4195,7 +2968,6 @@
           <w:p>
             <w:pPr>
               <w:pStyle w:val="Compact"/>
-              <w:jc w:val="left"/>
             </w:pPr>
             <w:r>
               <w:t xml:space="preserve">NIA-AA</w:t>
@@ -4207,7 +2979,6 @@
           <w:p>
             <w:pPr>
               <w:pStyle w:val="Compact"/>
-              <w:jc w:val="left"/>
             </w:pPr>
             <w:r>
               <w:t xml:space="preserve">AD</w:t>
@@ -4219,7 +2990,6 @@
           <w:p>
             <w:pPr>
               <w:pStyle w:val="Compact"/>
-              <w:jc w:val="left"/>
             </w:pPr>
             <w:r>
               <w:t xml:space="preserve">ML: 71.4 (4.88); BL: 77.1 (4.52)</w:t>
@@ -4233,7 +3003,6 @@
           <w:p>
             <w:pPr>
               <w:pStyle w:val="Compact"/>
-              <w:jc w:val="left"/>
             </w:pPr>
             <w:r>
               <w:t xml:space="preserve">Mendez et al. (2020)</w:t>
@@ -4245,7 +3014,6 @@
           <w:p>
             <w:pPr>
               <w:pStyle w:val="Compact"/>
-              <w:jc w:val="left"/>
             </w:pPr>
             <w:r>
               <w:t xml:space="preserve">NIA-AA</w:t>
@@ -4257,7 +3025,6 @@
           <w:p>
             <w:pPr>
               <w:pStyle w:val="Compact"/>
-              <w:jc w:val="left"/>
             </w:pPr>
             <w:r>
               <w:t xml:space="preserve">AD</w:t>
@@ -4269,7 +3036,6 @@
           <w:p>
             <w:pPr>
               <w:pStyle w:val="Compact"/>
-              <w:jc w:val="left"/>
             </w:pPr>
             <w:r>
               <w:t xml:space="preserve">ML: 58 (10.7); BL: 62.4 (10.5)</w:t>
@@ -4283,7 +3049,6 @@
           <w:p>
             <w:pPr>
               <w:pStyle w:val="Compact"/>
-              <w:jc w:val="left"/>
             </w:pPr>
             <w:r>
               <w:t xml:space="preserve">E. V. Y. Woumans et al. (2015)</w:t>
@@ -4295,7 +3060,6 @@
           <w:p>
             <w:pPr>
               <w:pStyle w:val="Compact"/>
-              <w:jc w:val="left"/>
             </w:pPr>
             <w:r>
               <w:t xml:space="preserve">Neurologist + Neuropsychologist</w:t>
@@ -4307,7 +3071,6 @@
           <w:p>
             <w:pPr>
               <w:pStyle w:val="Compact"/>
-              <w:jc w:val="left"/>
             </w:pPr>
             <w:r>
               <w:t xml:space="preserve">AD</w:t>
@@ -4319,7 +3082,6 @@
           <w:p>
             <w:pPr>
               <w:pStyle w:val="Compact"/>
-              <w:jc w:val="left"/>
             </w:pPr>
             <w:r>
               <w:t xml:space="preserve">ML: 73.8 (8.8); BL: 75.5 (8.2)</w:t>
@@ -4333,7 +3095,6 @@
           <w:p>
             <w:pPr>
               <w:pStyle w:val="Compact"/>
-              <w:jc w:val="left"/>
             </w:pPr>
             <w:r>
               <w:t xml:space="preserve">Zheng et al. (2018)</w:t>
@@ -4345,7 +3106,6 @@
           <w:p>
             <w:pPr>
               <w:pStyle w:val="Compact"/>
-              <w:jc w:val="left"/>
             </w:pPr>
             <w:r>
               <w:t xml:space="preserve">NINCDS-ADRDA</w:t>
@@ -4357,7 +3117,6 @@
           <w:p>
             <w:pPr>
               <w:pStyle w:val="Compact"/>
-              <w:jc w:val="left"/>
             </w:pPr>
             <w:r>
               <w:t xml:space="preserve">AD</w:t>
@@ -4369,7 +3128,6 @@
           <w:p>
             <w:pPr>
               <w:pStyle w:val="Compact"/>
-              <w:jc w:val="left"/>
             </w:pPr>
             <w:r>
               <w:t xml:space="preserve">ML: 63.9 (96.5), 63.4 (8.94); BL: 70.9 (9.37)</w:t>
@@ -4383,7 +3141,6 @@
           <w:p>
             <w:pPr>
               <w:pStyle w:val="Compact"/>
-              <w:jc w:val="left"/>
             </w:pPr>
             <w:r>
               <w:t xml:space="preserve">Alladi et al. (2013)</w:t>
@@ -4395,7 +3152,6 @@
           <w:p>
             <w:pPr>
               <w:pStyle w:val="Compact"/>
-              <w:jc w:val="left"/>
             </w:pPr>
             <w:r>
               <w:t xml:space="preserve">Cambridge Memory Clinic model</w:t>
@@ -4407,7 +3163,6 @@
           <w:p>
             <w:pPr>
               <w:pStyle w:val="Compact"/>
-              <w:jc w:val="left"/>
             </w:pPr>
             <w:r>
               <w:t xml:space="preserve">FTD</w:t>
@@ -4419,7 +3174,6 @@
           <w:p>
             <w:pPr>
               <w:pStyle w:val="Compact"/>
-              <w:jc w:val="left"/>
             </w:pPr>
             <w:r>
               <w:t xml:space="preserve">ML: 55.6 (10.5); BL: 61.6 (9)</w:t>
@@ -4433,7 +3187,6 @@
           <w:p>
             <w:pPr>
               <w:pStyle w:val="Compact"/>
-              <w:jc w:val="left"/>
             </w:pPr>
             <w:r>
               <w:t xml:space="preserve">Alladi et al. (2017)</w:t>
@@ -4445,7 +3198,6 @@
           <w:p>
             <w:pPr>
               <w:pStyle w:val="Compact"/>
-              <w:jc w:val="left"/>
             </w:pPr>
             <w:r>
               <w:t xml:space="preserve">MMSE, ACE-R, CDR, FrSBe</w:t>
@@ -4457,7 +3209,6 @@
           <w:p>
             <w:pPr>
               <w:pStyle w:val="Compact"/>
-              <w:jc w:val="left"/>
             </w:pPr>
             <w:r>
               <w:t xml:space="preserve">FTD</w:t>
@@ -4469,7 +3220,6 @@
           <w:p>
             <w:pPr>
               <w:pStyle w:val="Compact"/>
-              <w:jc w:val="left"/>
             </w:pPr>
             <w:r>
               <w:t xml:space="preserve">ML: 58.4 (9.3); BL: 61.7 (9.1)</w:t>
@@ -4483,7 +3233,6 @@
           <w:p>
             <w:pPr>
               <w:pStyle w:val="Compact"/>
-              <w:jc w:val="left"/>
             </w:pPr>
             <w:r>
               <w:t xml:space="preserve">Leon et al. (2024)</w:t>
@@ -4495,7 +3244,6 @@
           <w:p>
             <w:pPr>
               <w:pStyle w:val="Compact"/>
-              <w:jc w:val="left"/>
             </w:pPr>
             <w:r>
               <w:t xml:space="preserve">NA</w:t>
@@ -4507,7 +3255,6 @@
           <w:p>
             <w:pPr>
               <w:pStyle w:val="Compact"/>
-              <w:jc w:val="left"/>
             </w:pPr>
             <w:r>
               <w:t xml:space="preserve">FTD</w:t>
@@ -4519,7 +3266,6 @@
           <w:p>
             <w:pPr>
               <w:pStyle w:val="Compact"/>
-              <w:jc w:val="left"/>
             </w:pPr>
             <w:r>
               <w:t xml:space="preserve">ML: 59 (9.2); BL: 61.4 (7.9)</w:t>
@@ -4533,7 +3279,6 @@
           <w:p>
             <w:pPr>
               <w:pStyle w:val="Compact"/>
-              <w:jc w:val="left"/>
             </w:pPr>
             <w:r>
               <w:t xml:space="preserve">Berkes et al. (2020)</w:t>
@@ -4545,7 +3290,6 @@
           <w:p>
             <w:pPr>
               <w:pStyle w:val="Compact"/>
-              <w:jc w:val="left"/>
             </w:pPr>
             <w:r>
               <w:t xml:space="preserve">MMSE, MoCA</w:t>
@@ -4557,7 +3301,6 @@
           <w:p>
             <w:pPr>
               <w:pStyle w:val="Compact"/>
-              <w:jc w:val="left"/>
             </w:pPr>
             <w:r>
               <w:t xml:space="preserve">MCI</w:t>
@@ -4569,7 +3312,6 @@
           <w:p>
             <w:pPr>
               <w:pStyle w:val="Compact"/>
-              <w:jc w:val="left"/>
             </w:pPr>
             <w:r>
               <w:t xml:space="preserve">ML: 75.5 (7.6); BL: 77.8 (8.2)</w:t>
@@ -4583,7 +3325,6 @@
           <w:p>
             <w:pPr>
               <w:pStyle w:val="Compact"/>
-              <w:jc w:val="left"/>
             </w:pPr>
             <w:r>
               <w:t xml:space="preserve">Ossher et al. (2013)</w:t>
@@ -4595,7 +3336,6 @@
           <w:p>
             <w:pPr>
               <w:pStyle w:val="Compact"/>
-              <w:jc w:val="left"/>
             </w:pPr>
             <w:r>
               <w:t xml:space="preserve">Neuropsychological interview</w:t>
@@ -4607,7 +3347,6 @@
           <w:p>
             <w:pPr>
               <w:pStyle w:val="Compact"/>
-              <w:jc w:val="left"/>
             </w:pPr>
             <w:r>
               <w:t xml:space="preserve">Single Domain aMCI</w:t>
@@ -4619,7 +3358,6 @@
           <w:p>
             <w:pPr>
               <w:pStyle w:val="Compact"/>
-              <w:jc w:val="left"/>
             </w:pPr>
             <w:r>
               <w:t xml:space="preserve">ML: 74.9 (49); BL: 79.4 (6.3)</w:t>
@@ -4633,7 +3371,6 @@
           <w:p>
             <w:pPr>
               <w:pStyle w:val="Compact"/>
-              <w:jc w:val="left"/>
             </w:pPr>
             <w:r>
               <w:t xml:space="preserve">Ossher et al. (2013)</w:t>
@@ -4645,7 +3382,6 @@
           <w:p>
             <w:pPr>
               <w:pStyle w:val="Compact"/>
-              <w:jc w:val="left"/>
             </w:pPr>
             <w:r>
               <w:t xml:space="preserve">Neuropsychological interview</w:t>
@@ -4657,7 +3393,6 @@
           <w:p>
             <w:pPr>
               <w:pStyle w:val="Compact"/>
-              <w:jc w:val="left"/>
             </w:pPr>
             <w:r>
               <w:t xml:space="preserve">Multiple Domain aMCI</w:t>
@@ -4669,7 +3404,6 @@
           <w:p>
             <w:pPr>
               <w:pStyle w:val="Compact"/>
-              <w:jc w:val="left"/>
             </w:pPr>
             <w:r>
               <w:t xml:space="preserve">ML: 75.2 (8.5); BL: 72.6 (7.2)</w:t>
@@ -4683,7 +3417,6 @@
           <w:p>
             <w:pPr>
               <w:pStyle w:val="Compact"/>
-              <w:jc w:val="left"/>
             </w:pPr>
             <w:r>
               <w:t xml:space="preserve">Ramakrishnan et al. (2017)</w:t>
@@ -4695,7 +3428,6 @@
           <w:p>
             <w:pPr>
               <w:pStyle w:val="Compact"/>
-              <w:jc w:val="left"/>
             </w:pPr>
             <w:r>
               <w:t xml:space="preserve">Petersen’s criteria</w:t>
@@ -4707,7 +3439,6 @@
           <w:p>
             <w:pPr>
               <w:pStyle w:val="Compact"/>
-              <w:jc w:val="left"/>
             </w:pPr>
             <w:r>
               <w:t xml:space="preserve">MCI</w:t>
@@ -4719,7 +3450,6 @@
           <w:p>
             <w:pPr>
               <w:pStyle w:val="Compact"/>
-              <w:jc w:val="left"/>
             </w:pPr>
             <w:r>
               <w:t xml:space="preserve">ML: 55.8 (12.2); BL: 63.2 (10.1)</w:t>
@@ -4992,7 +3722,7 @@
         <w:rPr>
           <w:rStyle w:val="VerbatimChar"/>
         </w:rPr>
-        <w:t xml:space="preserve">Group-Level Effects: </w:t>
+        <w:t xml:space="preserve">Multilevel Hyperparameters:</w:t>
       </w:r>
       <w:r>
         <w:br/>
@@ -5085,7 +3815,7 @@
         <w:rPr>
           <w:rStyle w:val="VerbatimChar"/>
         </w:rPr>
-        <w:t xml:space="preserve">Population-Level Effects: </w:t>
+        <w:t xml:space="preserve">Regression Coefficients:</w:t>
       </w:r>
       <w:r>
         <w:br/>
@@ -5124,7 +3854,7 @@
         <w:rPr>
           <w:rStyle w:val="VerbatimChar"/>
         </w:rPr>
-        <w:t xml:space="preserve">Family Specific Parameters: </w:t>
+        <w:t xml:space="preserve">Further Distributional Parameters:</w:t>
       </w:r>
       <w:r>
         <w:br/>
@@ -6319,13 +5049,7 @@
         <w:t xml:space="preserve"> </w:t>
       </w:r>
       <w:r>
-        <w:t xml:space="preserve">“</w:t>
-      </w:r>
-      <w:r>
-        <w:t xml:space="preserve">advantages</w:t>
-      </w:r>
-      <w:r>
-        <w:t xml:space="preserve">”</w:t>
+        <w:t xml:space="preserve">“advantages”</w:t>
       </w:r>
       <w:r>
         <w:t xml:space="preserve"> </w:t>
@@ -9538,7 +8262,11 @@
     <w:bookmarkEnd w:id="176"/>
     <w:bookmarkEnd w:id="177"/>
     <w:bookmarkEnd w:id="178"/>
-    <w:sectPr/>
+    <w:sectPr>
+      <w:footnotePr>
+        <w:numRestart w:val="eachSect"/>
+      </w:footnotePr>
+    </w:sectPr>
   </w:body>
 </w:document>
 </file>
@@ -9710,8 +8438,6 @@
     </w:pPr>
     <w:rPr>
       <w:rFonts w:asciiTheme="majorHAnsi" w:cstheme="majorBidi" w:eastAsiaTheme="majorEastAsia" w:hAnsiTheme="majorHAnsi"/>
-      <w:spacing w:val="-10"/>
-      <w:kern w:val="28"/>
       <w:sz w:val="56"/>
       <w:szCs w:val="56"/>
     </w:rPr>
@@ -9724,15 +8450,13 @@
     <w:rsid w:val="00A10FD9"/>
     <w:rPr>
       <w:rFonts w:asciiTheme="majorHAnsi" w:cstheme="majorBidi" w:eastAsiaTheme="majorEastAsia" w:hAnsiTheme="majorHAnsi"/>
-      <w:spacing w:val="-10"/>
-      <w:kern w:val="28"/>
       <w:sz w:val="56"/>
       <w:szCs w:val="56"/>
     </w:rPr>
   </w:style>
   <w:style w:styleId="Subtitle" w:type="paragraph">
     <w:name w:val="Subtitle"/>
-    <w:basedOn w:val="Normal"/>
+    <w:basedOn w:val="Title"/>
     <w:next w:val="BodyText"/>
     <w:link w:val="SubtitleChar"/>
     <w:uiPriority w:val="11"/>
@@ -9745,7 +8469,6 @@
     </w:pPr>
     <w:rPr>
       <w:rFonts w:cstheme="majorBidi" w:eastAsiaTheme="majorEastAsia"/>
-      <w:color w:themeColor="text1" w:themeTint="A6" w:val="595959"/>
       <w:spacing w:val="15"/>
       <w:sz w:val="28"/>
       <w:szCs w:val="28"/>
@@ -9767,23 +8490,31 @@
   </w:style>
   <w:style w:customStyle="1" w:styleId="Author" w:type="paragraph">
     <w:name w:val="Author"/>
+    <w:basedOn w:val="Title"/>
     <w:next w:val="BodyText"/>
     <w:qFormat/>
     <w:pPr>
       <w:keepNext/>
       <w:keepLines/>
-      <w:jc w:val="center"/>
     </w:pPr>
+    <w:rPr>
+      <w:sz w:val="24"/>
+      <w:szCs w:val="24"/>
+    </w:rPr>
   </w:style>
   <w:style w:styleId="Date" w:type="paragraph">
     <w:name w:val="Date"/>
+    <w:basedOn w:val="Title"/>
     <w:next w:val="BodyText"/>
     <w:qFormat/>
     <w:pPr>
       <w:keepNext/>
       <w:keepLines/>
-      <w:jc w:val="center"/>
     </w:pPr>
+    <w:rPr>
+      <w:sz w:val="24"/>
+      <w:szCs w:val="24"/>
+    </w:rPr>
   </w:style>
   <w:style w:customStyle="1" w:styleId="AbstractTitle" w:type="paragraph">
     <w:name w:val="Abstract Title"/>
@@ -9798,7 +8529,6 @@
     </w:pPr>
     <w:rPr>
       <w:b/>
-      <w:color w:val="345A8A"/>
       <w:sz w:val="20"/>
       <w:szCs w:val="20"/>
     </w:rPr>

</xml_diff>

<commit_message>
corrected phrasing of 95% confidence
</commit_message>
<xml_diff>
--- a/code/Bilingualism_and_Dementia_Meta-analysis.docx
+++ b/code/Bilingualism_and_Dementia_Meta-analysis.docx
@@ -1742,7 +1742,7 @@
         <w:pStyle w:val="BodyText"/>
       </w:pPr>
       <w:r>
-        <w:t xml:space="preserve">The results showed that at the population level, the estimated age at dementia onset for monolinguals was between 65.04 and 71.55 years at 95% CrI (</w:t>
+        <w:t xml:space="preserve">The results showed that at the population level, the estimated age at dementia onset for monolinguals was between 65.04 and 71.55 years at 95% confidence (</w:t>
       </w:r>
       <m:oMath>
         <m:r>
@@ -1753,7 +1753,7 @@
         <w:t xml:space="preserve"> </w:t>
       </w:r>
       <w:r>
-        <w:t xml:space="preserve">= 68.39, Est.Error = 1.64). For bilinguals, the estimated age at dementia onset was between 68.82 and 74.61 years at 95% CrI (</w:t>
+        <w:t xml:space="preserve">= 68.39, Est.Error = 1.64). For bilinguals, the estimated age at dementia onset was between 68.82 and 74.61 years at 95% confidence (</w:t>
       </w:r>
       <m:oMath>
         <m:r>
@@ -1815,7 +1815,7 @@
         <w:t xml:space="preserve">(Arel-Bundock et al., 2024)</w:t>
       </w:r>
       <w:r>
-        <w:t xml:space="preserve">, which showed that the average marginal effect between the age at dementia onset for bilinguals and monolinguals was between 2.8 and 4.1 years at 95% CrI with an estimate of 3.45 years. This suggests that the bilingual population tends to have a later dementia symptom onset of around 3.45 years than monolinguals. A similar</w:t>
+        <w:t xml:space="preserve">, which showed that the average marginal effect between the age at dementia onset for bilinguals and monolinguals was between 2.8 and 4.1 years at 95% confidence with an estimate of 3.45 years. This suggests that the bilingual population tends to have a later dementia symptom onset of around 3.45 years than monolinguals. A similar</w:t>
       </w:r>
       <w:r>
         <w:t xml:space="preserve"> </w:t>
@@ -2346,7 +2346,7 @@
         <w:t xml:space="preserve"> </w:t>
       </w:r>
       <w:r>
-        <w:t xml:space="preserve">on the age at onset of dementia was between -0.63 and 0.36 at 95% CrI (</w:t>
+        <w:t xml:space="preserve">on the age at onset of dementia was between -0.63 and 0.36 at 95% confidence (</w:t>
       </w:r>
       <m:oMath>
         <m:r>

</xml_diff>